<commit_message>
added some visial changes, scan progress bar, voter vote cast popup, also added functionality where official code is compared and found to be existing
</commit_message>
<xml_diff>
--- a/Report/Report_Draft-1.docx
+++ b/Report/Report_Draft-1.docx
@@ -46,80 +46,31 @@
           <w:sz w:val="20"/>
           <w:szCs w:val="20"/>
         </w:rPr>
-        <w:t>Alexander</w:t>
+        <w:t>Alexander J. Gordon</w:t>
       </w:r>
       <w:r>
         <w:rPr>
           <w:sz w:val="20"/>
           <w:szCs w:val="20"/>
         </w:rPr>
-        <w:t xml:space="preserve"> </w:t>
+        <w:br/>
+        <w:t>ID: 2502331</w:t>
       </w:r>
       <w:r>
         <w:rPr>
           <w:sz w:val="20"/>
           <w:szCs w:val="20"/>
         </w:rPr>
-        <w:t>J</w:t>
+        <w:br/>
+        <w:t>AC40001 Honours Project</w:t>
       </w:r>
       <w:r>
         <w:rPr>
           <w:sz w:val="20"/>
           <w:szCs w:val="20"/>
         </w:rPr>
-        <w:t xml:space="preserve">. </w:t>
-      </w:r>
-      <w:r>
-        <w:rPr>
-          <w:sz w:val="20"/>
-          <w:szCs w:val="20"/>
-        </w:rPr>
-        <w:t>Gordon</w:t>
-      </w:r>
-      <w:r>
-        <w:rPr>
-          <w:sz w:val="20"/>
-          <w:szCs w:val="20"/>
-        </w:rPr>
         <w:br/>
-        <w:t xml:space="preserve">ID: </w:t>
-      </w:r>
-      <w:r>
-        <w:rPr>
-          <w:sz w:val="20"/>
-          <w:szCs w:val="20"/>
-        </w:rPr>
-        <w:t>2502331</w:t>
-      </w:r>
-      <w:r>
-        <w:rPr>
-          <w:sz w:val="20"/>
-          <w:szCs w:val="20"/>
-        </w:rPr>
-        <w:br/>
-        <w:t>AC40001 Honours Project</w:t>
-      </w:r>
-      <w:r>
-        <w:rPr>
-          <w:sz w:val="20"/>
-          <w:szCs w:val="20"/>
-        </w:rPr>
-        <w:br/>
-        <w:t>BSc (Hons) Computing</w:t>
-      </w:r>
-      <w:r>
-        <w:rPr>
-          <w:sz w:val="20"/>
-          <w:szCs w:val="20"/>
-        </w:rPr>
-        <w:t xml:space="preserve"> Science</w:t>
-      </w:r>
-      <w:r>
-        <w:rPr>
-          <w:sz w:val="20"/>
-          <w:szCs w:val="20"/>
-        </w:rPr>
-        <w:t xml:space="preserve"> </w:t>
+        <w:t xml:space="preserve">BSc (Hons) Computing Science </w:t>
       </w:r>
       <w:r>
         <w:rPr>
@@ -134,14 +85,7 @@
           <w:sz w:val="20"/>
           <w:szCs w:val="20"/>
         </w:rPr>
-        <w:t>University of Dundee, 202</w:t>
-      </w:r>
-      <w:r>
-        <w:rPr>
-          <w:sz w:val="20"/>
-          <w:szCs w:val="20"/>
-        </w:rPr>
-        <w:t>6</w:t>
+        <w:t>University of Dundee, 2026</w:t>
       </w:r>
       <w:r>
         <w:rPr>
@@ -237,7 +181,6 @@
           <w:szCs w:val="44"/>
         </w:rPr>
       </w:pPr>
-      <w:proofErr w:type="gramStart"/>
       <w:r>
         <w:rPr>
           <w:rFonts w:ascii="Calibri" w:hAnsi="Calibri" w:cs="Calibri"/>
@@ -245,55 +188,45 @@
           <w:sz w:val="44"/>
           <w:szCs w:val="44"/>
         </w:rPr>
-        <w:t>So</w:t>
-      </w:r>
-      <w:proofErr w:type="gramEnd"/>
-      <w:r>
+        <w:t>So say ‘the researcher did this’</w:t>
+      </w:r>
+    </w:p>
+    <w:p>
+      <w:pPr>
+        <w:jc w:val="center"/>
         <w:rPr>
           <w:rFonts w:ascii="Calibri" w:hAnsi="Calibri" w:cs="Calibri"/>
           <w:color w:val="EE0000"/>
           <w:sz w:val="44"/>
           <w:szCs w:val="44"/>
         </w:rPr>
-        <w:t xml:space="preserve"> say ‘the researcher did this’</w:t>
-      </w:r>
-    </w:p>
-    <w:p>
-      <w:pPr>
-        <w:jc w:val="center"/>
+      </w:pPr>
+    </w:p>
+    <w:p>
+      <w:pPr>
+        <w:rPr>
+          <w:rFonts w:ascii="Calibri" w:hAnsi="Calibri" w:cs="Calibri"/>
+        </w:rPr>
+      </w:pPr>
+      <w:r>
+        <w:rPr>
+          <w:rFonts w:ascii="Calibri" w:hAnsi="Calibri" w:cs="Calibri"/>
+        </w:rPr>
+        <w:t xml:space="preserve">Introduction </w:t>
+      </w:r>
+    </w:p>
+    <w:p>
+      <w:pPr>
         <w:rPr>
           <w:rFonts w:ascii="Calibri" w:hAnsi="Calibri" w:cs="Calibri"/>
           <w:color w:val="EE0000"/>
-          <w:sz w:val="44"/>
-          <w:szCs w:val="44"/>
-        </w:rPr>
-      </w:pPr>
-    </w:p>
-    <w:p>
-      <w:pPr>
-        <w:rPr>
-          <w:rFonts w:ascii="Calibri" w:hAnsi="Calibri" w:cs="Calibri"/>
-        </w:rPr>
-      </w:pPr>
-      <w:r>
-        <w:rPr>
-          <w:rFonts w:ascii="Calibri" w:hAnsi="Calibri" w:cs="Calibri"/>
-        </w:rPr>
-        <w:t xml:space="preserve">Introduction </w:t>
-      </w:r>
-    </w:p>
-    <w:p>
-      <w:pPr>
+        </w:rPr>
+      </w:pPr>
+      <w:r>
         <w:rPr>
           <w:rFonts w:ascii="Calibri" w:hAnsi="Calibri" w:cs="Calibri"/>
           <w:color w:val="EE0000"/>
         </w:rPr>
-      </w:pPr>
-      <w:r>
-        <w:rPr>
-          <w:rFonts w:ascii="Calibri" w:hAnsi="Calibri" w:cs="Calibri"/>
-          <w:color w:val="EE0000"/>
-        </w:rPr>
         <w:t xml:space="preserve">LEAVE TILL LAST APARENTLY. </w:t>
       </w:r>
     </w:p>
@@ -301,13 +234,6 @@
       <w:pPr>
         <w:rPr>
           <w:rFonts w:ascii="Calibri" w:hAnsi="Calibri" w:cs="Calibri"/>
-        </w:rPr>
-      </w:pPr>
-    </w:p>
-    <w:p>
-      <w:pPr>
-        <w:rPr>
-          <w:rFonts w:ascii="Calibri" w:hAnsi="Calibri" w:cs="Calibri"/>
           <w:color w:val="000000" w:themeColor="text1"/>
         </w:rPr>
       </w:pPr>
@@ -331,8 +257,1002 @@
           <w:rFonts w:ascii="Calibri" w:hAnsi="Calibri" w:cs="Calibri"/>
           <w:color w:val="000000" w:themeColor="text1"/>
         </w:rPr>
-        <w:t xml:space="preserve">2.1 Existing Systems </w:t>
-      </w:r>
+        <w:t xml:space="preserve">2.1 current system </w:t>
+      </w:r>
+    </w:p>
+    <w:p>
+      <w:pPr>
+        <w:rPr>
+          <w:rFonts w:ascii="Calibri" w:hAnsi="Calibri" w:cs="Calibri"/>
+          <w:color w:val="000000" w:themeColor="text1"/>
+        </w:rPr>
+      </w:pPr>
+      <w:r>
+        <w:rPr>
+          <w:rFonts w:ascii="Calibri" w:hAnsi="Calibri" w:cs="Calibri"/>
+          <w:color w:val="000000" w:themeColor="text1"/>
+        </w:rPr>
+        <w:t>A UK General Election is the process by which the public elects the 650 Members of Parliament</w:t>
+      </w:r>
+      <w:r>
+        <w:rPr>
+          <w:rFonts w:ascii="Calibri" w:hAnsi="Calibri" w:cs="Calibri"/>
+          <w:color w:val="000000" w:themeColor="text1"/>
+        </w:rPr>
+        <w:t xml:space="preserve"> [9]</w:t>
+      </w:r>
+      <w:r>
+        <w:rPr>
+          <w:rFonts w:ascii="Calibri" w:hAnsi="Calibri" w:cs="Calibri"/>
+          <w:color w:val="000000" w:themeColor="text1"/>
+        </w:rPr>
+        <w:t>. Elections are typically held every five years</w:t>
+      </w:r>
+      <w:r>
+        <w:rPr>
+          <w:rFonts w:ascii="Calibri" w:hAnsi="Calibri" w:cs="Calibri"/>
+          <w:color w:val="000000" w:themeColor="text1"/>
+        </w:rPr>
+        <w:t xml:space="preserve"> [9]</w:t>
+      </w:r>
+      <w:r>
+        <w:rPr>
+          <w:rFonts w:ascii="Calibri" w:hAnsi="Calibri" w:cs="Calibri"/>
+          <w:color w:val="000000" w:themeColor="text1"/>
+        </w:rPr>
+        <w:t>. Before anyone can vote, they must be registered on the electoral roll, be aged 18 or over on polling day, and be a British, Irish, or qualifying Commonwealth citizen</w:t>
+      </w:r>
+      <w:r>
+        <w:rPr>
+          <w:rFonts w:ascii="Calibri" w:hAnsi="Calibri" w:cs="Calibri"/>
+          <w:color w:val="000000" w:themeColor="text1"/>
+        </w:rPr>
+        <w:t xml:space="preserve"> [9]</w:t>
+      </w:r>
+      <w:r>
+        <w:rPr>
+          <w:rFonts w:ascii="Calibri" w:hAnsi="Calibri" w:cs="Calibri"/>
+          <w:color w:val="000000" w:themeColor="text1"/>
+        </w:rPr>
+        <w:t>. Since 2023, voters are also required to bring accepted photographic identification to their polling station</w:t>
+      </w:r>
+      <w:r>
+        <w:rPr>
+          <w:rFonts w:ascii="Calibri" w:hAnsi="Calibri" w:cs="Calibri"/>
+          <w:color w:val="000000" w:themeColor="text1"/>
+        </w:rPr>
+        <w:t xml:space="preserve"> [9]</w:t>
+      </w:r>
+      <w:r>
+        <w:rPr>
+          <w:rFonts w:ascii="Calibri" w:hAnsi="Calibri" w:cs="Calibri"/>
+          <w:color w:val="000000" w:themeColor="text1"/>
+        </w:rPr>
+        <w:t>.</w:t>
+      </w:r>
+    </w:p>
+    <w:p>
+      <w:pPr>
+        <w:rPr>
+          <w:rFonts w:ascii="Calibri" w:hAnsi="Calibri" w:cs="Calibri"/>
+          <w:color w:val="000000" w:themeColor="text1"/>
+        </w:rPr>
+      </w:pPr>
+      <w:r>
+        <w:rPr>
+          <w:rFonts w:ascii="Calibri" w:hAnsi="Calibri" w:cs="Calibri"/>
+          <w:color w:val="000000" w:themeColor="text1"/>
+        </w:rPr>
+        <w:t>The UK is divided into 650 constituencies, each representing a geographic area</w:t>
+      </w:r>
+      <w:r>
+        <w:rPr>
+          <w:rFonts w:ascii="Calibri" w:hAnsi="Calibri" w:cs="Calibri"/>
+          <w:color w:val="000000" w:themeColor="text1"/>
+        </w:rPr>
+        <w:t xml:space="preserve"> [9]</w:t>
+      </w:r>
+      <w:r>
+        <w:rPr>
+          <w:rFonts w:ascii="Calibri" w:hAnsi="Calibri" w:cs="Calibri"/>
+          <w:color w:val="000000" w:themeColor="text1"/>
+        </w:rPr>
+        <w:t>. Every constituency elects one MP</w:t>
+      </w:r>
+      <w:r>
+        <w:rPr>
+          <w:rFonts w:ascii="Calibri" w:hAnsi="Calibri" w:cs="Calibri"/>
+          <w:color w:val="000000" w:themeColor="text1"/>
+        </w:rPr>
+        <w:t xml:space="preserve"> [9]</w:t>
+      </w:r>
+      <w:r>
+        <w:rPr>
+          <w:rFonts w:ascii="Calibri" w:hAnsi="Calibri" w:cs="Calibri"/>
+          <w:color w:val="000000" w:themeColor="text1"/>
+        </w:rPr>
+        <w:t xml:space="preserve">. Voters do not vote directly for a Prime Minister or a </w:t>
+      </w:r>
+      <w:proofErr w:type="gramStart"/>
+      <w:r>
+        <w:rPr>
+          <w:rFonts w:ascii="Calibri" w:hAnsi="Calibri" w:cs="Calibri"/>
+          <w:color w:val="000000" w:themeColor="text1"/>
+        </w:rPr>
+        <w:t>party</w:t>
+      </w:r>
+      <w:r>
+        <w:rPr>
+          <w:rFonts w:ascii="Calibri" w:hAnsi="Calibri" w:cs="Calibri"/>
+          <w:color w:val="000000" w:themeColor="text1"/>
+        </w:rPr>
+        <w:t>,</w:t>
+      </w:r>
+      <w:proofErr w:type="gramEnd"/>
+      <w:r>
+        <w:rPr>
+          <w:rFonts w:ascii="Calibri" w:hAnsi="Calibri" w:cs="Calibri"/>
+          <w:color w:val="000000" w:themeColor="text1"/>
+        </w:rPr>
+        <w:t xml:space="preserve"> they vote for a single candidate in their local constituency</w:t>
+      </w:r>
+      <w:r>
+        <w:rPr>
+          <w:rFonts w:ascii="Calibri" w:hAnsi="Calibri" w:cs="Calibri"/>
+          <w:color w:val="000000" w:themeColor="text1"/>
+        </w:rPr>
+        <w:t xml:space="preserve"> [9]</w:t>
+      </w:r>
+      <w:r>
+        <w:rPr>
+          <w:rFonts w:ascii="Calibri" w:hAnsi="Calibri" w:cs="Calibri"/>
+          <w:color w:val="000000" w:themeColor="text1"/>
+        </w:rPr>
+        <w:t>. The candidate who receives the most votes wins the seat</w:t>
+      </w:r>
+      <w:r>
+        <w:rPr>
+          <w:rFonts w:ascii="Calibri" w:hAnsi="Calibri" w:cs="Calibri"/>
+          <w:color w:val="000000" w:themeColor="text1"/>
+        </w:rPr>
+        <w:t xml:space="preserve"> [9]</w:t>
+      </w:r>
+      <w:r>
+        <w:rPr>
+          <w:rFonts w:ascii="Calibri" w:hAnsi="Calibri" w:cs="Calibri"/>
+          <w:color w:val="000000" w:themeColor="text1"/>
+        </w:rPr>
+        <w:t>. This is known as the First Past the Post (FPTP) system</w:t>
+      </w:r>
+      <w:r>
+        <w:rPr>
+          <w:rFonts w:ascii="Calibri" w:hAnsi="Calibri" w:cs="Calibri"/>
+          <w:color w:val="000000" w:themeColor="text1"/>
+        </w:rPr>
+        <w:t xml:space="preserve"> [9]</w:t>
+      </w:r>
+      <w:r>
+        <w:rPr>
+          <w:rFonts w:ascii="Calibri" w:hAnsi="Calibri" w:cs="Calibri"/>
+          <w:color w:val="000000" w:themeColor="text1"/>
+        </w:rPr>
+        <w:t>. The party winning the most seats across all 650 constituencies forms the government, with its leader becoming Prime Minister</w:t>
+      </w:r>
+      <w:r>
+        <w:rPr>
+          <w:rFonts w:ascii="Calibri" w:hAnsi="Calibri" w:cs="Calibri"/>
+          <w:color w:val="000000" w:themeColor="text1"/>
+        </w:rPr>
+        <w:t xml:space="preserve"> [9]</w:t>
+      </w:r>
+      <w:r>
+        <w:rPr>
+          <w:rFonts w:ascii="Calibri" w:hAnsi="Calibri" w:cs="Calibri"/>
+          <w:color w:val="000000" w:themeColor="text1"/>
+        </w:rPr>
+        <w:t>.</w:t>
+      </w:r>
+    </w:p>
+    <w:p>
+      <w:pPr>
+        <w:rPr>
+          <w:rFonts w:ascii="Calibri" w:hAnsi="Calibri" w:cs="Calibri"/>
+          <w:color w:val="000000" w:themeColor="text1"/>
+        </w:rPr>
+      </w:pPr>
+      <w:r>
+        <w:rPr>
+          <w:rFonts w:ascii="Calibri" w:hAnsi="Calibri" w:cs="Calibri"/>
+          <w:color w:val="000000" w:themeColor="text1"/>
+        </w:rPr>
+        <w:t xml:space="preserve">For most </w:t>
+      </w:r>
+      <w:r>
+        <w:rPr>
+          <w:rFonts w:ascii="Calibri" w:hAnsi="Calibri" w:cs="Calibri"/>
+          <w:color w:val="000000" w:themeColor="text1"/>
+        </w:rPr>
+        <w:t>people</w:t>
+      </w:r>
+      <w:r>
+        <w:rPr>
+          <w:rFonts w:ascii="Calibri" w:hAnsi="Calibri" w:cs="Calibri"/>
+          <w:color w:val="000000" w:themeColor="text1"/>
+        </w:rPr>
+        <w:t>, casting a ballot means visiting their designated polling station on election day, which runs from 7am to 10pm</w:t>
+      </w:r>
+      <w:r>
+        <w:rPr>
+          <w:rFonts w:ascii="Calibri" w:hAnsi="Calibri" w:cs="Calibri"/>
+          <w:color w:val="000000" w:themeColor="text1"/>
+        </w:rPr>
+        <w:t xml:space="preserve"> [9]</w:t>
+      </w:r>
+      <w:r>
+        <w:rPr>
+          <w:rFonts w:ascii="Calibri" w:hAnsi="Calibri" w:cs="Calibri"/>
+          <w:color w:val="000000" w:themeColor="text1"/>
+        </w:rPr>
+        <w:t>. Upon arrival, voters present their photo ID, give their name and address to staff, and are handed a ballot paper</w:t>
+      </w:r>
+      <w:r>
+        <w:rPr>
+          <w:rFonts w:ascii="Calibri" w:hAnsi="Calibri" w:cs="Calibri"/>
+          <w:color w:val="000000" w:themeColor="text1"/>
+        </w:rPr>
+        <w:t xml:space="preserve"> [9]</w:t>
+      </w:r>
+      <w:r>
+        <w:rPr>
+          <w:rFonts w:ascii="Calibri" w:hAnsi="Calibri" w:cs="Calibri"/>
+          <w:color w:val="000000" w:themeColor="text1"/>
+        </w:rPr>
+        <w:t>. The voter then enters a private booth, marks a single X next to their chosen candidate, and places the completed ballot in a sealed box</w:t>
+      </w:r>
+      <w:r>
+        <w:rPr>
+          <w:rFonts w:ascii="Calibri" w:hAnsi="Calibri" w:cs="Calibri"/>
+          <w:color w:val="000000" w:themeColor="text1"/>
+        </w:rPr>
+        <w:t xml:space="preserve"> [9]</w:t>
+      </w:r>
+      <w:r>
+        <w:rPr>
+          <w:rFonts w:ascii="Calibri" w:hAnsi="Calibri" w:cs="Calibri"/>
+          <w:color w:val="000000" w:themeColor="text1"/>
+        </w:rPr>
+        <w:t xml:space="preserve">. The </w:t>
+      </w:r>
+      <w:r>
+        <w:rPr>
+          <w:rFonts w:ascii="Calibri" w:hAnsi="Calibri" w:cs="Calibri"/>
+          <w:color w:val="000000" w:themeColor="text1"/>
+        </w:rPr>
+        <w:t xml:space="preserve">entire </w:t>
+      </w:r>
+      <w:r>
+        <w:rPr>
+          <w:rFonts w:ascii="Calibri" w:hAnsi="Calibri" w:cs="Calibri"/>
+          <w:color w:val="000000" w:themeColor="text1"/>
+        </w:rPr>
+        <w:t>process is supervised, ensuring the secrecy of each vote</w:t>
+      </w:r>
+      <w:r>
+        <w:rPr>
+          <w:rFonts w:ascii="Calibri" w:hAnsi="Calibri" w:cs="Calibri"/>
+          <w:color w:val="000000" w:themeColor="text1"/>
+        </w:rPr>
+        <w:t xml:space="preserve"> [9]</w:t>
+      </w:r>
+      <w:r>
+        <w:rPr>
+          <w:rFonts w:ascii="Calibri" w:hAnsi="Calibri" w:cs="Calibri"/>
+          <w:color w:val="000000" w:themeColor="text1"/>
+        </w:rPr>
+        <w:t>.</w:t>
+      </w:r>
+    </w:p>
+    <w:p>
+      <w:pPr>
+        <w:rPr>
+          <w:rFonts w:ascii="Calibri" w:hAnsi="Calibri" w:cs="Calibri"/>
+          <w:color w:val="000000" w:themeColor="text1"/>
+        </w:rPr>
+      </w:pPr>
+      <w:r>
+        <w:rPr>
+          <w:rFonts w:ascii="Calibri" w:hAnsi="Calibri" w:cs="Calibri"/>
+          <w:color w:val="000000" w:themeColor="text1"/>
+        </w:rPr>
+        <w:t>Voters unable to attend a polling station can apply for a postal vote, available to anyone on request</w:t>
+      </w:r>
+      <w:r>
+        <w:rPr>
+          <w:rFonts w:ascii="Calibri" w:hAnsi="Calibri" w:cs="Calibri"/>
+          <w:color w:val="000000" w:themeColor="text1"/>
+        </w:rPr>
+        <w:t xml:space="preserve"> [9]</w:t>
+      </w:r>
+      <w:r>
+        <w:rPr>
+          <w:rFonts w:ascii="Calibri" w:hAnsi="Calibri" w:cs="Calibri"/>
+          <w:color w:val="000000" w:themeColor="text1"/>
+        </w:rPr>
+        <w:t>. A ballot paper is sent to the voter's registered address, marked, and returned by post or hand before polls close</w:t>
+      </w:r>
+      <w:r>
+        <w:rPr>
+          <w:rFonts w:ascii="Calibri" w:hAnsi="Calibri" w:cs="Calibri"/>
+          <w:color w:val="000000" w:themeColor="text1"/>
+        </w:rPr>
+        <w:t xml:space="preserve"> [9]</w:t>
+      </w:r>
+      <w:r>
+        <w:rPr>
+          <w:rFonts w:ascii="Calibri" w:hAnsi="Calibri" w:cs="Calibri"/>
+          <w:color w:val="000000" w:themeColor="text1"/>
+        </w:rPr>
+        <w:t xml:space="preserve">. </w:t>
+      </w:r>
+    </w:p>
+    <w:p>
+      <w:pPr>
+        <w:rPr>
+          <w:rFonts w:ascii="Calibri" w:hAnsi="Calibri" w:cs="Calibri"/>
+          <w:color w:val="000000" w:themeColor="text1"/>
+        </w:rPr>
+      </w:pPr>
+      <w:r>
+        <w:rPr>
+          <w:rFonts w:ascii="Calibri" w:hAnsi="Calibri" w:cs="Calibri"/>
+          <w:color w:val="000000" w:themeColor="text1"/>
+        </w:rPr>
+        <w:t>Once polls close, ballot boxes are transported to a central counting venue. Results are announced constituency by constituency, with the national picture typically becoming clear in the early hours of the following morning.</w:t>
+      </w:r>
+    </w:p>
+    <w:p>
+      <w:pPr>
+        <w:rPr>
+          <w:rFonts w:ascii="Calibri" w:hAnsi="Calibri" w:cs="Calibri"/>
+          <w:color w:val="000000" w:themeColor="text1"/>
+        </w:rPr>
+      </w:pPr>
+    </w:p>
+    <w:p>
+      <w:pPr>
+        <w:rPr>
+          <w:rFonts w:ascii="Calibri" w:hAnsi="Calibri" w:cs="Calibri"/>
+          <w:color w:val="000000" w:themeColor="text1"/>
+        </w:rPr>
+      </w:pPr>
+      <w:r>
+        <w:rPr>
+          <w:rFonts w:ascii="Calibri" w:hAnsi="Calibri" w:cs="Calibri"/>
+          <w:color w:val="000000" w:themeColor="text1"/>
+        </w:rPr>
+        <w:t>2.</w:t>
+      </w:r>
+      <w:r>
+        <w:rPr>
+          <w:rFonts w:ascii="Calibri" w:hAnsi="Calibri" w:cs="Calibri"/>
+          <w:color w:val="000000" w:themeColor="text1"/>
+        </w:rPr>
+        <w:t>2</w:t>
+      </w:r>
+      <w:r>
+        <w:rPr>
+          <w:rFonts w:ascii="Calibri" w:hAnsi="Calibri" w:cs="Calibri"/>
+          <w:color w:val="000000" w:themeColor="text1"/>
+        </w:rPr>
+        <w:t xml:space="preserve"> </w:t>
+      </w:r>
+      <w:r>
+        <w:rPr>
+          <w:rFonts w:ascii="Calibri" w:hAnsi="Calibri" w:cs="Calibri"/>
+          <w:color w:val="000000" w:themeColor="text1"/>
+        </w:rPr>
+        <w:t xml:space="preserve">Limitations </w:t>
+      </w:r>
+    </w:p>
+    <w:p>
+      <w:pPr>
+        <w:rPr>
+          <w:rFonts w:ascii="Calibri" w:hAnsi="Calibri" w:cs="Calibri"/>
+        </w:rPr>
+      </w:pPr>
+      <w:r>
+        <w:rPr>
+          <w:rFonts w:ascii="Calibri" w:hAnsi="Calibri" w:cs="Calibri"/>
+          <w:color w:val="000000" w:themeColor="text1"/>
+        </w:rPr>
+        <w:t>The first thing researched before development was, how necessary is an electronic voting system in Britian? This question</w:t>
+      </w:r>
+      <w:r>
+        <w:rPr>
+          <w:rFonts w:ascii="Calibri" w:hAnsi="Calibri" w:cs="Calibri"/>
+          <w:color w:val="000000" w:themeColor="text1"/>
+        </w:rPr>
+        <w:t xml:space="preserve"> produced </w:t>
+      </w:r>
+      <w:r>
+        <w:rPr>
+          <w:rFonts w:ascii="Calibri" w:hAnsi="Calibri" w:cs="Calibri"/>
+          <w:color w:val="000000" w:themeColor="text1"/>
+        </w:rPr>
+        <w:t>issues with the electoral system in Britain today</w:t>
+      </w:r>
+      <w:r>
+        <w:rPr>
+          <w:rFonts w:ascii="Calibri" w:hAnsi="Calibri" w:cs="Calibri"/>
+          <w:color w:val="000000" w:themeColor="text1"/>
+        </w:rPr>
+        <w:t>.</w:t>
+      </w:r>
+      <w:r>
+        <w:rPr>
+          <w:rFonts w:ascii="Calibri" w:hAnsi="Calibri" w:cs="Calibri"/>
+          <w:color w:val="000000" w:themeColor="text1"/>
+        </w:rPr>
+        <w:t xml:space="preserve"> The</w:t>
+      </w:r>
+      <w:r>
+        <w:rPr>
+          <w:rFonts w:ascii="Calibri" w:hAnsi="Calibri" w:cs="Calibri"/>
+          <w:color w:val="000000" w:themeColor="text1"/>
+        </w:rPr>
+        <w:t xml:space="preserve"> </w:t>
+      </w:r>
+      <w:r>
+        <w:rPr>
+          <w:rFonts w:ascii="Calibri" w:hAnsi="Calibri" w:cs="Calibri"/>
+        </w:rPr>
+        <w:t>Researcher found</w:t>
+      </w:r>
+      <w:r>
+        <w:rPr>
+          <w:rFonts w:ascii="Calibri" w:hAnsi="Calibri" w:cs="Calibri"/>
+        </w:rPr>
+        <w:t xml:space="preserve"> three key issues within the UK electoral system, including voter impersonation, ballot tampering, and slow vote counting [15] [</w:t>
+      </w:r>
+      <w:r>
+        <w:rPr>
+          <w:rFonts w:ascii="Calibri" w:hAnsi="Calibri" w:cs="Calibri"/>
+        </w:rPr>
+        <w:t>6</w:t>
+      </w:r>
+      <w:r>
+        <w:rPr>
+          <w:rFonts w:ascii="Calibri" w:hAnsi="Calibri" w:cs="Calibri"/>
+        </w:rPr>
+        <w:t>]. The UK continues to rely heavily on paper ballots and manual counting, a voting system that has changed very little since 1888 (Electoral Commission, 2025; Open Rights Group, 2025) [</w:t>
+      </w:r>
+      <w:r>
+        <w:rPr>
+          <w:rFonts w:ascii="Calibri" w:hAnsi="Calibri" w:cs="Calibri"/>
+        </w:rPr>
+        <w:t>7</w:t>
+      </w:r>
+      <w:r>
+        <w:rPr>
+          <w:rFonts w:ascii="Calibri" w:hAnsi="Calibri" w:cs="Calibri"/>
+        </w:rPr>
+        <w:t>]. While confirmed cases of postal vote impersonation are reported to be very low, with under 1000 being convicted between 2008 to 2013, the current system makes impersonation difficult to detect or prove [</w:t>
+      </w:r>
+      <w:r>
+        <w:rPr>
+          <w:rFonts w:ascii="Calibri" w:hAnsi="Calibri" w:cs="Calibri"/>
+        </w:rPr>
+        <w:t>6</w:t>
+      </w:r>
+      <w:r>
+        <w:rPr>
+          <w:rFonts w:ascii="Calibri" w:hAnsi="Calibri" w:cs="Calibri"/>
+        </w:rPr>
+        <w:t xml:space="preserve">]. </w:t>
+      </w:r>
+      <w:r>
+        <w:rPr>
+          <w:rFonts w:ascii="Calibri" w:hAnsi="Calibri" w:cs="Calibri"/>
+        </w:rPr>
+        <w:t>This is due to voters typically being identified only by name, address and signature [</w:t>
+      </w:r>
+      <w:r>
+        <w:rPr>
+          <w:rFonts w:ascii="Calibri" w:hAnsi="Calibri" w:cs="Calibri"/>
+        </w:rPr>
+        <w:t>6</w:t>
+      </w:r>
+      <w:r>
+        <w:rPr>
+          <w:rFonts w:ascii="Calibri" w:hAnsi="Calibri" w:cs="Calibri"/>
+        </w:rPr>
+        <w:t xml:space="preserve">]. </w:t>
+      </w:r>
+      <w:r>
+        <w:rPr>
+          <w:rFonts w:ascii="Calibri" w:hAnsi="Calibri" w:cs="Calibri"/>
+        </w:rPr>
+        <w:t xml:space="preserve"> </w:t>
+      </w:r>
+      <w:r>
+        <w:rPr>
+          <w:rFonts w:ascii="Calibri" w:hAnsi="Calibri" w:cs="Calibri"/>
+        </w:rPr>
+        <w:t>An additional concern with postal voting relates to language barriers, whereby voters who require assistance may depend on third parties for interpretation, thereby increasing the risk of undue influence or misrepresentation in the casting of the ballot</w:t>
+      </w:r>
+      <w:r>
+        <w:rPr>
+          <w:rFonts w:ascii="Calibri" w:hAnsi="Calibri" w:cs="Calibri"/>
+        </w:rPr>
+        <w:t xml:space="preserve"> [6].</w:t>
+      </w:r>
+      <w:r>
+        <w:rPr>
+          <w:rFonts w:ascii="Calibri" w:hAnsi="Calibri" w:cs="Calibri"/>
+        </w:rPr>
+        <w:t xml:space="preserve"> </w:t>
+      </w:r>
+      <w:proofErr w:type="gramStart"/>
+      <w:r>
+        <w:rPr>
+          <w:rFonts w:ascii="Calibri" w:hAnsi="Calibri" w:cs="Calibri"/>
+        </w:rPr>
+        <w:t>Furthermore</w:t>
+      </w:r>
+      <w:proofErr w:type="gramEnd"/>
+      <w:r>
+        <w:rPr>
+          <w:rFonts w:ascii="Calibri" w:hAnsi="Calibri" w:cs="Calibri"/>
+        </w:rPr>
+        <w:t xml:space="preserve"> family pressure can heavily influence a </w:t>
+      </w:r>
+      <w:proofErr w:type="gramStart"/>
+      <w:r>
+        <w:rPr>
+          <w:rFonts w:ascii="Calibri" w:hAnsi="Calibri" w:cs="Calibri"/>
+        </w:rPr>
+        <w:t>voters</w:t>
+      </w:r>
+      <w:proofErr w:type="gramEnd"/>
+      <w:r>
+        <w:rPr>
+          <w:rFonts w:ascii="Calibri" w:hAnsi="Calibri" w:cs="Calibri"/>
+        </w:rPr>
+        <w:t xml:space="preserve"> choice when </w:t>
+      </w:r>
+      <w:proofErr w:type="gramStart"/>
+      <w:r>
+        <w:rPr>
+          <w:rFonts w:ascii="Calibri" w:hAnsi="Calibri" w:cs="Calibri"/>
+        </w:rPr>
+        <w:t>a the</w:t>
+      </w:r>
+      <w:proofErr w:type="gramEnd"/>
+      <w:r>
+        <w:rPr>
+          <w:rFonts w:ascii="Calibri" w:hAnsi="Calibri" w:cs="Calibri"/>
+        </w:rPr>
+        <w:t xml:space="preserve"> family are able to see who the voter for as they cast their vote for [6]. All these factors mentioned regarding the postal vote make it impossible not to see an issue with its security and authenticity. </w:t>
+      </w:r>
+    </w:p>
+    <w:p>
+      <w:pPr>
+        <w:rPr>
+          <w:rFonts w:ascii="Calibri" w:hAnsi="Calibri" w:cs="Calibri"/>
+        </w:rPr>
+      </w:pPr>
+      <w:r>
+        <w:rPr>
+          <w:rFonts w:ascii="Calibri" w:hAnsi="Calibri" w:cs="Calibri"/>
+        </w:rPr>
+        <w:t>Ballot tampering is also a concern due to the physical handling of paper ballots, particularly during transportation and counting [</w:t>
+      </w:r>
+      <w:r>
+        <w:rPr>
+          <w:rFonts w:ascii="Calibri" w:hAnsi="Calibri" w:cs="Calibri"/>
+        </w:rPr>
+        <w:t>6</w:t>
+      </w:r>
+      <w:r>
+        <w:rPr>
+          <w:rFonts w:ascii="Calibri" w:hAnsi="Calibri" w:cs="Calibri"/>
+        </w:rPr>
+        <w:t>]. Although safeguards exist, reliance on human handling introduces the possibility of error or misconduct [</w:t>
+      </w:r>
+      <w:r>
+        <w:rPr>
+          <w:rFonts w:ascii="Calibri" w:hAnsi="Calibri" w:cs="Calibri"/>
+        </w:rPr>
+        <w:t>6]</w:t>
+      </w:r>
+      <w:r>
+        <w:rPr>
+          <w:rFonts w:ascii="Calibri" w:hAnsi="Calibri" w:cs="Calibri"/>
+        </w:rPr>
+        <w:t xml:space="preserve"> Additionally, manual counting of millions of ballots is time consuming, with recounts in close elections further delaying results, increasing costs and creating uncertainty that can lead to challenges to electoral integrity [</w:t>
+      </w:r>
+      <w:r>
+        <w:rPr>
+          <w:rFonts w:ascii="Calibri" w:hAnsi="Calibri" w:cs="Calibri"/>
+        </w:rPr>
+        <w:t>8</w:t>
+      </w:r>
+      <w:r>
+        <w:rPr>
+          <w:rFonts w:ascii="Calibri" w:hAnsi="Calibri" w:cs="Calibri"/>
+        </w:rPr>
+        <w:t>].</w:t>
+      </w:r>
+    </w:p>
+    <w:p>
+      <w:pPr>
+        <w:pStyle w:val="NormalWeb"/>
+        <w:spacing w:after="0" w:afterAutospacing="0"/>
+        <w:rPr>
+          <w:rFonts w:ascii="Calibri" w:hAnsi="Calibri" w:cs="Calibri"/>
+          <w:sz w:val="22"/>
+          <w:szCs w:val="22"/>
+        </w:rPr>
+      </w:pPr>
+      <w:r>
+        <w:rPr>
+          <w:rFonts w:ascii="Calibri" w:hAnsi="Calibri" w:cs="Calibri"/>
+          <w:sz w:val="22"/>
+          <w:szCs w:val="22"/>
+        </w:rPr>
+        <w:t xml:space="preserve">Public trust is essential to the effective functioning of government. Unexpected delays or perceived weaknesses in election security can reduce confidence in outcomes, even when no wrongdoing has occurred. In a modern country such as the UK, a voting system that appears slow or outdated risks increasing public suspicion and disengagement. </w:t>
+      </w:r>
+    </w:p>
+    <w:p>
+      <w:pPr>
+        <w:rPr>
+          <w:rFonts w:ascii="Calibri" w:hAnsi="Calibri" w:cs="Calibri"/>
+          <w:color w:val="000000" w:themeColor="text1"/>
+        </w:rPr>
+      </w:pPr>
+    </w:p>
+    <w:p>
+      <w:pPr>
+        <w:tabs>
+          <w:tab w:val="left" w:pos="2292"/>
+        </w:tabs>
+        <w:rPr>
+          <w:rFonts w:ascii="Calibri" w:hAnsi="Calibri" w:cs="Calibri"/>
+          <w:color w:val="000000" w:themeColor="text1"/>
+        </w:rPr>
+      </w:pPr>
+      <w:r>
+        <w:rPr>
+          <w:rFonts w:ascii="Calibri" w:hAnsi="Calibri" w:cs="Calibri"/>
+          <w:color w:val="000000" w:themeColor="text1"/>
+        </w:rPr>
+        <w:t>2.3 existing systems</w:t>
+      </w:r>
+      <w:r>
+        <w:rPr>
+          <w:rFonts w:ascii="Calibri" w:hAnsi="Calibri" w:cs="Calibri"/>
+          <w:color w:val="000000" w:themeColor="text1"/>
+        </w:rPr>
+        <w:tab/>
+      </w:r>
+    </w:p>
+    <w:p>
+      <w:pPr>
+        <w:tabs>
+          <w:tab w:val="left" w:pos="2292"/>
+        </w:tabs>
+        <w:rPr>
+          <w:rFonts w:ascii="Calibri" w:hAnsi="Calibri" w:cs="Calibri"/>
+          <w:color w:val="000000" w:themeColor="text1"/>
+        </w:rPr>
+      </w:pPr>
+      <w:r>
+        <w:rPr>
+          <w:rFonts w:ascii="Calibri" w:hAnsi="Calibri" w:cs="Calibri"/>
+          <w:color w:val="000000" w:themeColor="text1"/>
+        </w:rPr>
+        <w:t>After finding the limitations of the British voting system the researcher looked</w:t>
+      </w:r>
+      <w:r>
+        <w:rPr>
+          <w:rFonts w:ascii="Calibri" w:hAnsi="Calibri" w:cs="Calibri"/>
+          <w:color w:val="000000" w:themeColor="text1"/>
+        </w:rPr>
+        <w:t xml:space="preserve"> into Biometric E-</w:t>
+      </w:r>
+      <w:r>
+        <w:rPr>
+          <w:rFonts w:ascii="Calibri" w:hAnsi="Calibri" w:cs="Calibri"/>
+          <w:color w:val="000000" w:themeColor="text1"/>
+        </w:rPr>
+        <w:t>Voting systems</w:t>
+      </w:r>
+      <w:r>
+        <w:rPr>
+          <w:rFonts w:ascii="Calibri" w:hAnsi="Calibri" w:cs="Calibri"/>
+          <w:color w:val="000000" w:themeColor="text1"/>
+        </w:rPr>
+        <w:t xml:space="preserve"> that governments around the world have created and implemented. The two biometric systems the researcher found to be the most relevant were the Biometric E-Voting system implemented in Brazil and in </w:t>
+      </w:r>
+      <w:r>
+        <w:rPr>
+          <w:rFonts w:ascii="Calibri" w:hAnsi="Calibri" w:cs="Calibri"/>
+          <w:color w:val="000000" w:themeColor="text1"/>
+        </w:rPr>
+        <w:t>India [</w:t>
+      </w:r>
+      <w:r>
+        <w:rPr>
+          <w:rFonts w:ascii="Calibri" w:hAnsi="Calibri" w:cs="Calibri"/>
+          <w:color w:val="000000" w:themeColor="text1"/>
+        </w:rPr>
+        <w:t>1][3]</w:t>
+      </w:r>
+      <w:r>
+        <w:rPr>
+          <w:rFonts w:ascii="Calibri" w:hAnsi="Calibri" w:cs="Calibri"/>
+          <w:color w:val="000000" w:themeColor="text1"/>
+        </w:rPr>
+        <w:t>.</w:t>
+      </w:r>
+      <w:r>
+        <w:rPr>
+          <w:rFonts w:ascii="Calibri" w:hAnsi="Calibri" w:cs="Calibri"/>
+          <w:color w:val="000000" w:themeColor="text1"/>
+        </w:rPr>
+        <w:br/>
+        <w:t xml:space="preserve">Firstly the researchers explored the Indian Biometric E-Voting system, or the lack there of [3]. India currently </w:t>
+      </w:r>
+      <w:r>
+        <w:rPr>
+          <w:rFonts w:ascii="Calibri" w:hAnsi="Calibri" w:cs="Calibri"/>
+          <w:color w:val="000000" w:themeColor="text1"/>
+        </w:rPr>
+        <w:t>uses</w:t>
+      </w:r>
+      <w:r>
+        <w:rPr>
+          <w:rFonts w:ascii="Calibri" w:hAnsi="Calibri" w:cs="Calibri"/>
+          <w:color w:val="000000" w:themeColor="text1"/>
+        </w:rPr>
+        <w:t xml:space="preserve"> </w:t>
+      </w:r>
+      <w:r>
+        <w:rPr>
+          <w:rFonts w:ascii="Calibri" w:hAnsi="Calibri" w:cs="Calibri"/>
+          <w:color w:val="000000" w:themeColor="text1"/>
+        </w:rPr>
+        <w:t>an</w:t>
+      </w:r>
+      <w:r>
+        <w:rPr>
+          <w:rFonts w:ascii="Calibri" w:hAnsi="Calibri" w:cs="Calibri"/>
+          <w:color w:val="000000" w:themeColor="text1"/>
+        </w:rPr>
+        <w:t xml:space="preserve"> </w:t>
+      </w:r>
+      <w:proofErr w:type="gramStart"/>
+      <w:r>
+        <w:rPr>
+          <w:rFonts w:ascii="Calibri" w:hAnsi="Calibri" w:cs="Calibri"/>
+          <w:color w:val="000000" w:themeColor="text1"/>
+        </w:rPr>
+        <w:t>Electronic</w:t>
+      </w:r>
+      <w:proofErr w:type="gramEnd"/>
+      <w:r>
+        <w:rPr>
+          <w:rFonts w:ascii="Calibri" w:hAnsi="Calibri" w:cs="Calibri"/>
+          <w:color w:val="000000" w:themeColor="text1"/>
+        </w:rPr>
+        <w:t xml:space="preserve"> voting system without biometric authentication,</w:t>
+      </w:r>
+      <w:r>
+        <w:rPr>
+          <w:rFonts w:ascii="Calibri" w:hAnsi="Calibri" w:cs="Calibri"/>
+          <w:color w:val="000000" w:themeColor="text1"/>
+        </w:rPr>
+        <w:t xml:space="preserve"> not using there Aadhaar system alongside the electronic voting [3]. The reason for not using Aadhaar is due to its centralised database, this connects a vote to a person, removing the anonymity from the electoral process [3]. </w:t>
+      </w:r>
+      <w:r>
+        <w:rPr>
+          <w:rFonts w:ascii="Calibri" w:hAnsi="Calibri" w:cs="Calibri"/>
+          <w:color w:val="000000" w:themeColor="text1"/>
+        </w:rPr>
+        <w:t xml:space="preserve">Another weakness of Aadhaar’s centralised database is that linkage attacks can be used against it [3]. </w:t>
+      </w:r>
+      <w:r>
+        <w:rPr>
+          <w:rFonts w:ascii="Calibri" w:hAnsi="Calibri" w:cs="Calibri"/>
+          <w:color w:val="000000" w:themeColor="text1"/>
+        </w:rPr>
+        <w:t>A linkage attack occurs when an attacker combines information from multiple data sources to re-identify individuals within anonymised datasets, thereby revealing information that was intended to remain anonymous</w:t>
+      </w:r>
+      <w:r>
+        <w:rPr>
+          <w:rFonts w:ascii="Calibri" w:hAnsi="Calibri" w:cs="Calibri"/>
+          <w:color w:val="000000" w:themeColor="text1"/>
+        </w:rPr>
+        <w:t xml:space="preserve"> [3]</w:t>
+      </w:r>
+      <w:r>
+        <w:rPr>
+          <w:rFonts w:ascii="Calibri" w:hAnsi="Calibri" w:cs="Calibri"/>
+          <w:color w:val="000000" w:themeColor="text1"/>
+        </w:rPr>
+        <w:t>.</w:t>
+      </w:r>
+      <w:r>
+        <w:rPr>
+          <w:rFonts w:ascii="Calibri" w:hAnsi="Calibri" w:cs="Calibri"/>
+          <w:color w:val="000000" w:themeColor="text1"/>
+        </w:rPr>
+        <w:t xml:space="preserve"> </w:t>
+      </w:r>
+      <w:r>
+        <w:rPr>
+          <w:rFonts w:ascii="Calibri" w:hAnsi="Calibri" w:cs="Calibri"/>
+          <w:color w:val="000000" w:themeColor="text1"/>
+        </w:rPr>
+        <w:t xml:space="preserve">The Indian government deemed the Aadhaar to risky to implement fully into their voting system due to </w:t>
+      </w:r>
+      <w:r>
+        <w:rPr>
+          <w:rFonts w:ascii="Calibri" w:hAnsi="Calibri" w:cs="Calibri"/>
+          <w:color w:val="000000" w:themeColor="text1"/>
+        </w:rPr>
+        <w:t>constitutional privacy protections and concerns that biometric linkage could undermine the anonymity of the secret ballot</w:t>
+      </w:r>
+      <w:r>
+        <w:rPr>
+          <w:rFonts w:ascii="Calibri" w:hAnsi="Calibri" w:cs="Calibri"/>
+          <w:color w:val="000000" w:themeColor="text1"/>
+        </w:rPr>
+        <w:t xml:space="preserve"> [3]</w:t>
+      </w:r>
+      <w:r>
+        <w:rPr>
+          <w:rFonts w:ascii="Calibri" w:hAnsi="Calibri" w:cs="Calibri"/>
+          <w:color w:val="000000" w:themeColor="text1"/>
+        </w:rPr>
+        <w:t>.</w:t>
+      </w:r>
+      <w:r>
+        <w:rPr>
+          <w:rFonts w:ascii="Calibri" w:hAnsi="Calibri" w:cs="Calibri"/>
+          <w:color w:val="000000" w:themeColor="text1"/>
+        </w:rPr>
+        <w:t xml:space="preserve"> Not only did the government reject Aadhaar’s use in voting, </w:t>
+      </w:r>
+      <w:proofErr w:type="gramStart"/>
+      <w:r>
+        <w:rPr>
+          <w:rFonts w:ascii="Calibri" w:hAnsi="Calibri" w:cs="Calibri"/>
+          <w:color w:val="000000" w:themeColor="text1"/>
+        </w:rPr>
+        <w:t>they</w:t>
+      </w:r>
+      <w:proofErr w:type="gramEnd"/>
+      <w:r>
+        <w:rPr>
+          <w:rFonts w:ascii="Calibri" w:hAnsi="Calibri" w:cs="Calibri"/>
+          <w:color w:val="000000" w:themeColor="text1"/>
+        </w:rPr>
+        <w:t xml:space="preserve"> also limited the scope of its use elsewhere [3]. </w:t>
+      </w:r>
+    </w:p>
+    <w:p>
+      <w:pPr>
+        <w:tabs>
+          <w:tab w:val="left" w:pos="2292"/>
+        </w:tabs>
+        <w:rPr>
+          <w:rFonts w:ascii="Calibri" w:hAnsi="Calibri" w:cs="Calibri"/>
+          <w:color w:val="000000" w:themeColor="text1"/>
+        </w:rPr>
+      </w:pPr>
+      <w:r>
+        <w:rPr>
+          <w:rFonts w:ascii="Calibri" w:hAnsi="Calibri" w:cs="Calibri"/>
+          <w:color w:val="000000" w:themeColor="text1"/>
+        </w:rPr>
+        <w:t xml:space="preserve">Moving onto Brazil’s Electronic voting system </w:t>
+      </w:r>
+    </w:p>
+    <w:p>
+      <w:pPr>
+        <w:tabs>
+          <w:tab w:val="left" w:pos="2292"/>
+        </w:tabs>
+        <w:rPr>
+          <w:rFonts w:ascii="Calibri" w:hAnsi="Calibri" w:cs="Calibri"/>
+          <w:color w:val="000000" w:themeColor="text1"/>
+        </w:rPr>
+      </w:pPr>
+    </w:p>
+    <w:p>
+      <w:pPr>
+        <w:rPr>
+          <w:rFonts w:ascii="Calibri" w:hAnsi="Calibri" w:cs="Calibri"/>
+          <w:color w:val="000000" w:themeColor="text1"/>
+        </w:rPr>
+      </w:pPr>
+      <w:r>
+        <w:rPr>
+          <w:rFonts w:ascii="Calibri" w:hAnsi="Calibri" w:cs="Calibri"/>
+          <w:color w:val="000000" w:themeColor="text1"/>
+        </w:rPr>
+        <w:t xml:space="preserve">2.4 biometric chosen </w:t>
+      </w:r>
+    </w:p>
+    <w:p>
+      <w:pPr>
+        <w:rPr>
+          <w:rFonts w:ascii="Calibri" w:hAnsi="Calibri" w:cs="Calibri"/>
+          <w:color w:val="000000" w:themeColor="text1"/>
+        </w:rPr>
+      </w:pPr>
+      <w:r>
+        <w:rPr>
+          <w:rFonts w:ascii="Calibri" w:hAnsi="Calibri" w:cs="Calibri"/>
+          <w:color w:val="000000" w:themeColor="text1"/>
+        </w:rPr>
+        <w:t>2.5 how it works -&gt; fingerprint scanning</w:t>
+      </w:r>
+    </w:p>
+    <w:p>
+      <w:pPr>
+        <w:rPr>
+          <w:rFonts w:ascii="Calibri" w:hAnsi="Calibri" w:cs="Calibri"/>
+          <w:color w:val="000000" w:themeColor="text1"/>
+        </w:rPr>
+      </w:pPr>
+      <w:r>
+        <w:rPr>
+          <w:rFonts w:ascii="Calibri" w:hAnsi="Calibri" w:cs="Calibri"/>
+          <w:color w:val="000000" w:themeColor="text1"/>
+        </w:rPr>
+        <w:t>2.6 security</w:t>
+      </w:r>
+    </w:p>
+    <w:p>
+      <w:pPr>
+        <w:rPr>
+          <w:rFonts w:ascii="Calibri" w:hAnsi="Calibri" w:cs="Calibri"/>
+          <w:color w:val="000000" w:themeColor="text1"/>
+        </w:rPr>
+      </w:pPr>
+      <w:r>
+        <w:rPr>
+          <w:rFonts w:ascii="Calibri" w:hAnsi="Calibri" w:cs="Calibri"/>
+          <w:color w:val="000000" w:themeColor="text1"/>
+        </w:rPr>
+        <w:t xml:space="preserve">2.7 tech stack </w:t>
+      </w:r>
+    </w:p>
+    <w:p>
+      <w:pPr>
+        <w:rPr>
+          <w:rFonts w:ascii="Calibri" w:hAnsi="Calibri" w:cs="Calibri"/>
+          <w:color w:val="000000" w:themeColor="text1"/>
+        </w:rPr>
+      </w:pPr>
+    </w:p>
+    <w:p>
+      <w:pPr>
+        <w:rPr>
+          <w:rFonts w:ascii="Calibri" w:hAnsi="Calibri" w:cs="Calibri"/>
+          <w:color w:val="000000" w:themeColor="text1"/>
+        </w:rPr>
+      </w:pPr>
+    </w:p>
+    <w:p>
+      <w:pPr>
+        <w:rPr>
+          <w:rFonts w:ascii="Calibri" w:hAnsi="Calibri" w:cs="Calibri"/>
+          <w:color w:val="000000" w:themeColor="text1"/>
+        </w:rPr>
+      </w:pPr>
     </w:p>
     <w:p>
       <w:pPr>
@@ -956,6 +1876,7 @@
   <w:style w:type="character" w:default="1" w:styleId="DefaultParagraphFont">
     <w:name w:val="Default Paragraph Font"/>
     <w:uiPriority w:val="1"/>
+    <w:semiHidden/>
     <w:unhideWhenUsed/>
   </w:style>
   <w:style w:type="table" w:default="1" w:styleId="TableNormal">
@@ -1267,6 +2188,24 @@
       <w:smallCaps/>
       <w:color w:val="0F4761" w:themeColor="accent1" w:themeShade="BF"/>
       <w:spacing w:val="5"/>
+    </w:rPr>
+  </w:style>
+  <w:style w:type="paragraph" w:styleId="NormalWeb">
+    <w:name w:val="Normal (Web)"/>
+    <w:basedOn w:val="Normal"/>
+    <w:uiPriority w:val="99"/>
+    <w:unhideWhenUsed/>
+    <w:rsid w:val="004A3647"/>
+    <w:pPr>
+      <w:spacing w:before="100" w:beforeAutospacing="1" w:after="100" w:afterAutospacing="1" w:line="240" w:lineRule="auto"/>
+    </w:pPr>
+    <w:rPr>
+      <w:rFonts w:ascii="Times New Roman" w:eastAsia="Times New Roman" w:hAnsi="Times New Roman" w:cs="Times New Roman"/>
+      <w:kern w:val="0"/>
+      <w:sz w:val="24"/>
+      <w:szCs w:val="24"/>
+      <w:lang w:eastAsia="en-GB"/>
+      <w14:ligatures w14:val="none"/>
     </w:rPr>
   </w:style>
 </w:styles>

</xml_diff>

<commit_message>
adding more to report
</commit_message>
<xml_diff>
--- a/Report/Report_Draft-1.docx
+++ b/Report/Report_Draft-1.docx
@@ -184,7 +184,6 @@
           <w:szCs w:val="44"/>
         </w:rPr>
       </w:pPr>
-      <w:proofErr w:type="gramStart"/>
       <w:r>
         <w:rPr>
           <w:rFonts w:ascii="Calibri" w:hAnsi="Calibri" w:cs="Calibri"/>
@@ -192,17 +191,7 @@
           <w:sz w:val="44"/>
           <w:szCs w:val="44"/>
         </w:rPr>
-        <w:t>So</w:t>
-      </w:r>
-      <w:proofErr w:type="gramEnd"/>
-      <w:r>
-        <w:rPr>
-          <w:rFonts w:ascii="Calibri" w:hAnsi="Calibri" w:cs="Calibri"/>
-          <w:color w:val="EE0000"/>
-          <w:sz w:val="44"/>
-          <w:szCs w:val="44"/>
-        </w:rPr>
-        <w:t xml:space="preserve"> say ‘the researcher did this’</w:t>
+        <w:t>So say ‘the researcher did this’</w:t>
       </w:r>
     </w:p>
     <w:p>
@@ -1144,7 +1133,37 @@
           <w:rFonts w:ascii="Calibri" w:hAnsi="Calibri" w:cs="Calibri"/>
           <w:color w:val="000000" w:themeColor="text1"/>
         </w:rPr>
-        <w:t>India currently uses an electronic voting system without biometric authentication, choosing not to integrate the Aadhaar system alongside it [3]. Aadhaar is India’s national biometric identification programme, which holds fingerprint, iris, and facial data for over one billion citizens linked to a unique 12-digit identification number. However, the Aadhaar system was excluded from consideration due to its reliance on a centralised database, which creates the potential to link an individual voter to their ballot, thereby compromising the anonymity of the electoral process [3]. A further vulnerability of this centralised architecture is its susceptibility to linkage attacks, in which information from multiple datasets can be combined to re</w:t>
+        <w:t xml:space="preserve">India currently uses an electronic voting system without biometric authentication, choosing not to integrate the Aadhaar system alongside it [3]. Aadhaar is India’s national biometric identification programme, which holds fingerprint, iris, and facial data for over one billion citizens linked to a unique </w:t>
+      </w:r>
+      <w:proofErr w:type="gramStart"/>
+      <w:r>
+        <w:rPr>
+          <w:rFonts w:ascii="Calibri" w:hAnsi="Calibri" w:cs="Calibri"/>
+          <w:color w:val="000000" w:themeColor="text1"/>
+        </w:rPr>
+        <w:t>12</w:t>
+      </w:r>
+      <w:r>
+        <w:rPr>
+          <w:rFonts w:ascii="Calibri" w:hAnsi="Calibri" w:cs="Calibri"/>
+          <w:color w:val="000000" w:themeColor="text1"/>
+        </w:rPr>
+        <w:t xml:space="preserve"> </w:t>
+      </w:r>
+      <w:r>
+        <w:rPr>
+          <w:rFonts w:ascii="Calibri" w:hAnsi="Calibri" w:cs="Calibri"/>
+          <w:color w:val="000000" w:themeColor="text1"/>
+        </w:rPr>
+        <w:t>digit</w:t>
+      </w:r>
+      <w:proofErr w:type="gramEnd"/>
+      <w:r>
+        <w:rPr>
+          <w:rFonts w:ascii="Calibri" w:hAnsi="Calibri" w:cs="Calibri"/>
+          <w:color w:val="000000" w:themeColor="text1"/>
+        </w:rPr>
+        <w:t xml:space="preserve"> identification number. However, the Aadhaar system was excluded from consideration due to its reliance on a centralised database, which creates the potential to link an individual voter to their ballot, thereby compromising the anonymity of the electoral process [3]. A further vulnerability of this centralised architecture is its susceptibility to linkage attacks, in which information from multiple datasets can be combined to re</w:t>
       </w:r>
       <w:r>
         <w:rPr>
@@ -1419,7 +1438,19 @@
         <w:rPr>
           <w:rFonts w:ascii="Calibri" w:hAnsi="Calibri" w:cs="Calibri"/>
         </w:rPr>
-        <w:t>The key metric used to evaluate matching software performance is the FAR, which refers to the likelihood that the system incorrectly matches a captured template to a stored template belonging to a different individual. A high FAR indicates an unreliable system unsuitable for security-critical applications</w:t>
+        <w:t>The key metric used to evaluate matching software performance is the FAR, which refers to the likelihood that the system incorrectly matches a captured template to a stored template belonging to a different individual. A high FAR indicates an unreliable system unsuitable for security</w:t>
+      </w:r>
+      <w:r>
+        <w:rPr>
+          <w:rFonts w:ascii="Calibri" w:hAnsi="Calibri" w:cs="Calibri"/>
+        </w:rPr>
+        <w:t xml:space="preserve"> </w:t>
+      </w:r>
+      <w:r>
+        <w:rPr>
+          <w:rFonts w:ascii="Calibri" w:hAnsi="Calibri" w:cs="Calibri"/>
+        </w:rPr>
+        <w:t>critical applications</w:t>
       </w:r>
       <w:r>
         <w:rPr>
@@ -1840,7 +1871,33 @@
         <w:rPr>
           <w:rFonts w:ascii="Calibri" w:hAnsi="Calibri" w:cs="Calibri"/>
         </w:rPr>
-        <w:t xml:space="preserve">Brazil's large-scale deployment of fingerprint biometrics within the </w:t>
+        <w:t xml:space="preserve">Brazil's </w:t>
+      </w:r>
+      <w:proofErr w:type="gramStart"/>
+      <w:r>
+        <w:rPr>
+          <w:rFonts w:ascii="Calibri" w:hAnsi="Calibri" w:cs="Calibri"/>
+        </w:rPr>
+        <w:t>large</w:t>
+      </w:r>
+      <w:r>
+        <w:rPr>
+          <w:rFonts w:ascii="Calibri" w:hAnsi="Calibri" w:cs="Calibri"/>
+        </w:rPr>
+        <w:t xml:space="preserve"> </w:t>
+      </w:r>
+      <w:r>
+        <w:rPr>
+          <w:rFonts w:ascii="Calibri" w:hAnsi="Calibri" w:cs="Calibri"/>
+        </w:rPr>
+        <w:t>scale</w:t>
+      </w:r>
+      <w:proofErr w:type="gramEnd"/>
+      <w:r>
+        <w:rPr>
+          <w:rFonts w:ascii="Calibri" w:hAnsi="Calibri" w:cs="Calibri"/>
+        </w:rPr>
+        <w:t xml:space="preserve"> deployment of fingerprint biometrics within the </w:t>
       </w:r>
       <w:r>
         <w:rPr>
@@ -2418,21 +2475,12 @@
         </w:rPr>
         <w:t xml:space="preserve">forgeable identification like a signature. Votes must be recorded digitally, removing the risks associated with paper ballot handling and manual counting. The system must also ensure that no vote can ever be linked back to the individual who cast it, preserving the </w:t>
       </w:r>
-      <w:proofErr w:type="gramStart"/>
-      <w:r>
-        <w:rPr>
-          <w:rFonts w:ascii="Calibri" w:hAnsi="Calibri" w:cs="Calibri"/>
-          <w:color w:val="000000" w:themeColor="text1"/>
-        </w:rPr>
-        <w:t>voters</w:t>
-      </w:r>
-      <w:proofErr w:type="gramEnd"/>
-      <w:r>
-        <w:rPr>
-          <w:rFonts w:ascii="Calibri" w:hAnsi="Calibri" w:cs="Calibri"/>
-          <w:color w:val="000000" w:themeColor="text1"/>
-        </w:rPr>
-        <w:t xml:space="preserve"> anonymity in according to the UK’s voting system.</w:t>
+      <w:r>
+        <w:rPr>
+          <w:rFonts w:ascii="Calibri" w:hAnsi="Calibri" w:cs="Calibri"/>
+          <w:color w:val="000000" w:themeColor="text1"/>
+        </w:rPr>
+        <w:t>voters anonymity in according to the UK’s voting system.</w:t>
       </w:r>
       <w:r>
         <w:rPr>
@@ -2447,23 +2495,7 @@
           <w:color w:val="000000" w:themeColor="text1"/>
         </w:rPr>
         <w:br/>
-        <w:t xml:space="preserve">To achieve the creation of this system, three main components must be built and linked. An Official App that serves as a cernterpoint for a polling station, allowing staff to manage voting devices, registering voters and view information relevant to an </w:t>
-      </w:r>
-      <w:proofErr w:type="gramStart"/>
-      <w:r>
-        <w:rPr>
-          <w:rFonts w:ascii="Calibri" w:hAnsi="Calibri" w:cs="Calibri"/>
-          <w:color w:val="000000" w:themeColor="text1"/>
-        </w:rPr>
-        <w:t>Officials permissions</w:t>
-      </w:r>
-      <w:proofErr w:type="gramEnd"/>
-      <w:r>
-        <w:rPr>
-          <w:rFonts w:ascii="Calibri" w:hAnsi="Calibri" w:cs="Calibri"/>
-          <w:color w:val="000000" w:themeColor="text1"/>
-        </w:rPr>
-        <w:t xml:space="preserve">. A Voting App that is required to guide voters through the authentication and voting process at the polling terminal. A server that handles all encrypted communications between the Apps, manipulates data in a predefined manner, processes fingerprint templates to verify voters and officials and store votes anonymously. </w:t>
+        <w:t xml:space="preserve">To achieve the creation of this system, three main components must be built and linked. An Official App that serves as a cernterpoint for a polling station, allowing staff to manage voting devices, registering voters and view information relevant to an Officials permissions. A Voting App that is required to guide voters through the authentication and voting process at the polling terminal. A server that handles all encrypted communications between the Apps, manipulates data in a predefined manner, processes fingerprint templates to verify voters and officials and store votes anonymously. </w:t>
       </w:r>
     </w:p>
     <w:p>
@@ -2547,46 +2579,14 @@
           <w:rFonts w:ascii="Calibri" w:hAnsi="Calibri" w:cs="Calibri"/>
           <w:color w:val="000000" w:themeColor="text1"/>
         </w:rPr>
-        <w:t xml:space="preserve">As the project was an individual effort certain practices such as the retrospective and story point sizing were not able to be completed. </w:t>
-      </w:r>
-      <w:proofErr w:type="gramStart"/>
-      <w:r>
-        <w:rPr>
-          <w:rFonts w:ascii="Calibri" w:hAnsi="Calibri" w:cs="Calibri"/>
-          <w:color w:val="000000" w:themeColor="text1"/>
-        </w:rPr>
-        <w:t>Alternatively</w:t>
-      </w:r>
-      <w:proofErr w:type="gramEnd"/>
-      <w:r>
-        <w:rPr>
-          <w:rFonts w:ascii="Calibri" w:hAnsi="Calibri" w:cs="Calibri"/>
-          <w:color w:val="000000" w:themeColor="text1"/>
-        </w:rPr>
-        <w:t xml:space="preserve"> the functional and non-functional requirements were used to produce a set of user stories that acted as the development backlog.</w:t>
-      </w:r>
-      <w:r>
-        <w:rPr>
-          <w:rFonts w:ascii="Calibri" w:hAnsi="Calibri" w:cs="Calibri"/>
-          <w:color w:val="000000" w:themeColor="text1"/>
-        </w:rPr>
-        <w:t xml:space="preserve"> The requirements were prioritised used the MoSCoW method, making a clear minimum viable product early in the development phase and ensuring core features </w:t>
-      </w:r>
-      <w:proofErr w:type="gramStart"/>
-      <w:r>
-        <w:rPr>
-          <w:rFonts w:ascii="Calibri" w:hAnsi="Calibri" w:cs="Calibri"/>
-          <w:color w:val="000000" w:themeColor="text1"/>
-        </w:rPr>
-        <w:t>were</w:t>
-      </w:r>
-      <w:proofErr w:type="gramEnd"/>
-      <w:r>
-        <w:rPr>
-          <w:rFonts w:ascii="Calibri" w:hAnsi="Calibri" w:cs="Calibri"/>
-          <w:color w:val="000000" w:themeColor="text1"/>
-        </w:rPr>
-        <w:t xml:space="preserve"> deliverable before additional functionality was considered. The full list can be in the </w:t>
+        <w:t>As the project was an individual effort certain practices such as the retrospective and story point sizing were not able to be completed. Alternatively the functional and non-functional requirements were used to produce a set of user stories that acted as the development backlog.</w:t>
+      </w:r>
+      <w:r>
+        <w:rPr>
+          <w:rFonts w:ascii="Calibri" w:hAnsi="Calibri" w:cs="Calibri"/>
+          <w:color w:val="000000" w:themeColor="text1"/>
+        </w:rPr>
+        <w:t xml:space="preserve"> The requirements were prioritised used the MoSCoW method, making a clear minimum viable product early in the development phase and ensuring core features were deliverable before additional functionality was considered. The full list can be in the </w:t>
       </w:r>
       <w:r>
         <w:rPr>
@@ -3327,13 +3327,29 @@
         </w:rPr>
         <w:t xml:space="preserve">The implementation phase began in </w:t>
       </w:r>
-      <w:r>
-        <w:rPr>
-          <w:rFonts w:ascii="Calibri" w:hAnsi="Calibri" w:cs="Calibri"/>
-          <w:color w:val="000000" w:themeColor="text1"/>
-        </w:rPr>
-        <w:t>mid-February</w:t>
-      </w:r>
+      <w:proofErr w:type="spellStart"/>
+      <w:r>
+        <w:rPr>
+          <w:rFonts w:ascii="Calibri" w:hAnsi="Calibri" w:cs="Calibri"/>
+          <w:color w:val="000000" w:themeColor="text1"/>
+        </w:rPr>
+        <w:t>mid</w:t>
+      </w:r>
+      <w:r>
+        <w:rPr>
+          <w:rFonts w:ascii="Calibri" w:hAnsi="Calibri" w:cs="Calibri"/>
+          <w:color w:val="000000" w:themeColor="text1"/>
+        </w:rPr>
+        <w:t xml:space="preserve"> </w:t>
+      </w:r>
+      <w:r>
+        <w:rPr>
+          <w:rFonts w:ascii="Calibri" w:hAnsi="Calibri" w:cs="Calibri"/>
+          <w:color w:val="000000" w:themeColor="text1"/>
+        </w:rPr>
+        <w:t>February</w:t>
+      </w:r>
+      <w:proofErr w:type="spellEnd"/>
       <w:r>
         <w:rPr>
           <w:rFonts w:ascii="Calibri" w:hAnsi="Calibri" w:cs="Calibri"/>
@@ -3353,23 +3369,7 @@
           <w:rFonts w:ascii="Calibri" w:hAnsi="Calibri" w:cs="Calibri"/>
           <w:color w:val="000000" w:themeColor="text1"/>
         </w:rPr>
-        <w:t xml:space="preserve"> This was then followed by the server, which was chosen next as the </w:t>
-      </w:r>
-      <w:proofErr w:type="gramStart"/>
-      <w:r>
-        <w:rPr>
-          <w:rFonts w:ascii="Calibri" w:hAnsi="Calibri" w:cs="Calibri"/>
-          <w:color w:val="000000" w:themeColor="text1"/>
-        </w:rPr>
-        <w:t>servers</w:t>
-      </w:r>
-      <w:proofErr w:type="gramEnd"/>
-      <w:r>
-        <w:rPr>
-          <w:rFonts w:ascii="Calibri" w:hAnsi="Calibri" w:cs="Calibri"/>
-          <w:color w:val="000000" w:themeColor="text1"/>
-        </w:rPr>
-        <w:t xml:space="preserve"> purpose was mainly to deal with information </w:t>
+        <w:t xml:space="preserve"> This was then followed by the server, which was chosen next as the servers purpose was mainly to deal with information </w:t>
       </w:r>
       <w:r>
         <w:rPr>
@@ -3902,7 +3902,37 @@
           <w:rFonts w:ascii="Calibri" w:hAnsi="Calibri" w:cs="Calibri"/>
           <w:color w:val="000000" w:themeColor="text1"/>
         </w:rPr>
-        <w:t>To address this, envelope encryption was explored as an additional layer of application-level protection [26].</w:t>
+        <w:t xml:space="preserve">To address this, envelope encryption was explored as an additional layer of </w:t>
+      </w:r>
+      <w:proofErr w:type="gramStart"/>
+      <w:r>
+        <w:rPr>
+          <w:rFonts w:ascii="Calibri" w:hAnsi="Calibri" w:cs="Calibri"/>
+          <w:color w:val="000000" w:themeColor="text1"/>
+        </w:rPr>
+        <w:t>application</w:t>
+      </w:r>
+      <w:r>
+        <w:rPr>
+          <w:rFonts w:ascii="Calibri" w:hAnsi="Calibri" w:cs="Calibri"/>
+          <w:color w:val="000000" w:themeColor="text1"/>
+        </w:rPr>
+        <w:t xml:space="preserve"> </w:t>
+      </w:r>
+      <w:r>
+        <w:rPr>
+          <w:rFonts w:ascii="Calibri" w:hAnsi="Calibri" w:cs="Calibri"/>
+          <w:color w:val="000000" w:themeColor="text1"/>
+        </w:rPr>
+        <w:t>level</w:t>
+      </w:r>
+      <w:proofErr w:type="gramEnd"/>
+      <w:r>
+        <w:rPr>
+          <w:rFonts w:ascii="Calibri" w:hAnsi="Calibri" w:cs="Calibri"/>
+          <w:color w:val="000000" w:themeColor="text1"/>
+        </w:rPr>
+        <w:t xml:space="preserve"> protection [26].</w:t>
       </w:r>
     </w:p>
     <w:p>
@@ -3932,15 +3962,6 @@
           <w:color w:val="000000" w:themeColor="text1"/>
         </w:rPr>
         <w:t>.</w:t>
-      </w:r>
-      <w:r>
-        <w:rPr>
-          <w:rFonts w:ascii="Calibri" w:hAnsi="Calibri" w:cs="Calibri"/>
-          <w:color w:val="000000" w:themeColor="text1"/>
-        </w:rPr>
-        <w:pict w14:anchorId="6F50CEEA">
-          <v:rect id="_x0000_i1026" style="width:0;height:1.5pt" o:hralign="center" o:hrstd="t" o:hr="t" fillcolor="#a0a0a0" stroked="f"/>
-        </w:pict>
       </w:r>
     </w:p>
     <w:p>
@@ -4080,7 +4101,21 @@
           <w:rFonts w:ascii="Calibri" w:hAnsi="Calibri" w:cs="Calibri"/>
           <w:color w:val="000000" w:themeColor="text1"/>
         </w:rPr>
-        <w:t>AES-256-GCM was identified as an appropriate encryption standard due to its widespread adoption and strong security properties [21][26]. A per-voter encryption approach was selected, where each voter’s data is encrypted individually. This reduces the impact of a potential breach, as compromising one record does not expose others</w:t>
+        <w:t>AES-256-GCM was identified as an appropriate encryption standard due to its widespread adoption and strong security properties [21][26]. A per</w:t>
+      </w:r>
+      <w:r>
+        <w:rPr>
+          <w:rFonts w:ascii="Calibri" w:hAnsi="Calibri" w:cs="Calibri"/>
+          <w:color w:val="000000" w:themeColor="text1"/>
+        </w:rPr>
+        <w:t xml:space="preserve"> </w:t>
+      </w:r>
+      <w:r>
+        <w:rPr>
+          <w:rFonts w:ascii="Calibri" w:hAnsi="Calibri" w:cs="Calibri"/>
+          <w:color w:val="000000" w:themeColor="text1"/>
+        </w:rPr>
+        <w:t>voter encryption approach was selected, where each voter’s data is encrypted individually. This reduces the impact of a potential breach, as compromising one record does not expose others</w:t>
       </w:r>
       <w:r>
         <w:rPr>
@@ -4245,6 +4280,7 @@
         </w:rPr>
         <w:t xml:space="preserve">are stored in plaintext, as they do not directly identify individuals. This allows efficient querying and reporting without unnecessary decryption overhead. This represents a deliberate </w:t>
       </w:r>
+      <w:proofErr w:type="spellStart"/>
       <w:r>
         <w:rPr>
           <w:rFonts w:ascii="Calibri" w:hAnsi="Calibri" w:cs="Calibri"/>
@@ -4257,7 +4293,7 @@
           <w:rFonts w:ascii="Calibri" w:hAnsi="Calibri" w:cs="Calibri"/>
           <w:color w:val="000000" w:themeColor="text1"/>
         </w:rPr>
-        <w:t>-</w:t>
+        <w:t xml:space="preserve"> </w:t>
       </w:r>
       <w:r>
         <w:rPr>
@@ -4266,6 +4302,7 @@
         </w:rPr>
         <w:t>off</w:t>
       </w:r>
+      <w:proofErr w:type="spellEnd"/>
       <w:r>
         <w:rPr>
           <w:rFonts w:ascii="Calibri" w:hAnsi="Calibri" w:cs="Calibri"/>
@@ -4339,15 +4376,6 @@
           <w:color w:val="000000" w:themeColor="text1"/>
         </w:rPr>
       </w:pPr>
-      <w:r>
-        <w:rPr>
-          <w:rFonts w:ascii="Calibri" w:hAnsi="Calibri" w:cs="Calibri"/>
-          <w:color w:val="000000" w:themeColor="text1"/>
-        </w:rPr>
-        <w:pict w14:anchorId="0A1ED0CF">
-          <v:rect id="_x0000_i1027" style="width:0;height:1.5pt" o:hralign="center" o:hrstd="t" o:hr="t" fillcolor="#a0a0a0" stroked="f"/>
-        </w:pict>
-      </w:r>
     </w:p>
     <w:p>
       <w:pPr>
@@ -4440,15 +4468,6 @@
           <w:color w:val="000000" w:themeColor="text1"/>
         </w:rPr>
       </w:pPr>
-      <w:r>
-        <w:rPr>
-          <w:rFonts w:ascii="Calibri" w:hAnsi="Calibri" w:cs="Calibri"/>
-          <w:color w:val="000000" w:themeColor="text1"/>
-        </w:rPr>
-        <w:pict w14:anchorId="5B3D5AF5">
-          <v:rect id="_x0000_i1028" style="width:0;height:1.5pt" o:hralign="center" o:hrstd="t" o:hr="t" fillcolor="#a0a0a0" stroked="f"/>
-        </w:pict>
-      </w:r>
     </w:p>
     <w:p>
       <w:pPr>
@@ -4982,14 +5001,7 @@
                         <w:rFonts w:ascii="Cambria Math" w:hAnsi="Cambria Math" w:cs="Calibri"/>
                         <w:color w:val="000000" w:themeColor="text1"/>
                       </w:rPr>
-                      <m:t xml:space="preserve"> 3</m:t>
-                    </m:r>
-                    <m:r>
-                      <w:rPr>
-                        <w:rFonts w:ascii="Cambria Math" w:hAnsi="Cambria Math" w:cs="Calibri"/>
-                        <w:color w:val="000000" w:themeColor="text1"/>
-                      </w:rPr>
-                      <m:t xml:space="preserve"> ×10</m:t>
+                      <m:t xml:space="preserve"> 3 ×10</m:t>
                     </m:r>
                   </m:e>
                   <m:sup>
@@ -4998,14 +5010,7 @@
                         <w:rFonts w:ascii="Cambria Math" w:hAnsi="Cambria Math" w:cs="Calibri"/>
                         <w:color w:val="000000" w:themeColor="text1"/>
                       </w:rPr>
-                      <m:t>-</m:t>
-                    </m:r>
-                    <m:r>
-                      <w:rPr>
-                        <w:rFonts w:ascii="Cambria Math" w:hAnsi="Cambria Math" w:cs="Calibri"/>
-                        <w:color w:val="000000" w:themeColor="text1"/>
-                      </w:rPr>
-                      <m:t>3</m:t>
+                      <m:t>-3</m:t>
                     </m:r>
                   </m:sup>
                 </m:sSup>
@@ -5089,14 +5094,7 @@
                       <w:rFonts w:ascii="Cambria Math" w:hAnsi="Cambria Math" w:cs="Calibri"/>
                       <w:color w:val="000000" w:themeColor="text1"/>
                     </w:rPr>
-                    <m:t>1</m:t>
-                  </m:r>
-                  <m:r>
-                    <w:rPr>
-                      <w:rFonts w:ascii="Cambria Math" w:hAnsi="Cambria Math" w:cs="Calibri"/>
-                      <w:color w:val="000000" w:themeColor="text1"/>
-                    </w:rPr>
-                    <m:t xml:space="preserve">  ×10</m:t>
+                    <m:t>1  ×10</m:t>
                   </m:r>
                 </m:e>
                 <m:sup>
@@ -5105,14 +5103,7 @@
                       <w:rFonts w:ascii="Cambria Math" w:hAnsi="Cambria Math" w:cs="Calibri"/>
                       <w:color w:val="000000" w:themeColor="text1"/>
                     </w:rPr>
-                    <m:t>-</m:t>
-                  </m:r>
-                  <m:r>
-                    <w:rPr>
-                      <w:rFonts w:ascii="Cambria Math" w:hAnsi="Cambria Math" w:cs="Calibri"/>
-                      <w:color w:val="000000" w:themeColor="text1"/>
-                    </w:rPr>
-                    <m:t>3</m:t>
+                    <m:t>-3</m:t>
                   </m:r>
                 </m:sup>
               </m:sSup>
@@ -5137,21 +5128,7 @@
                 <w:rFonts w:ascii="Calibri" w:hAnsi="Calibri" w:cs="Calibri"/>
                 <w:color w:val="000000" w:themeColor="text1"/>
               </w:rPr>
-              <w:t>P(</w:t>
-            </w:r>
-            <w:r>
-              <w:rPr>
-                <w:rFonts w:ascii="Calibri" w:hAnsi="Calibri" w:cs="Calibri"/>
-                <w:color w:val="000000" w:themeColor="text1"/>
-              </w:rPr>
-              <w:t>DoB</w:t>
-            </w:r>
-            <w:r>
-              <w:rPr>
-                <w:rFonts w:ascii="Calibri" w:hAnsi="Calibri" w:cs="Calibri"/>
-                <w:color w:val="000000" w:themeColor="text1"/>
-              </w:rPr>
-              <w:t>)</w:t>
+              <w:t>P(DoB)</w:t>
             </w:r>
           </w:p>
         </w:tc>
@@ -5210,21 +5187,7 @@
                       <w:rFonts w:ascii="Cambria Math" w:hAnsi="Cambria Math" w:cs="Calibri"/>
                       <w:color w:val="000000" w:themeColor="text1"/>
                     </w:rPr>
-                    <m:t>2</m:t>
-                  </m:r>
-                  <m:r>
-                    <w:rPr>
-                      <w:rFonts w:ascii="Cambria Math" w:hAnsi="Cambria Math" w:cs="Calibri"/>
-                      <w:color w:val="000000" w:themeColor="text1"/>
-                    </w:rPr>
-                    <m:t>.7</m:t>
-                  </m:r>
-                  <m:r>
-                    <w:rPr>
-                      <w:rFonts w:ascii="Cambria Math" w:hAnsi="Cambria Math" w:cs="Calibri"/>
-                      <w:color w:val="000000" w:themeColor="text1"/>
-                    </w:rPr>
-                    <m:t xml:space="preserve">  ×10</m:t>
+                    <m:t>2.7  ×10</m:t>
                   </m:r>
                 </m:e>
                 <m:sup>
@@ -5258,21 +5221,7 @@
                 <w:rFonts w:ascii="Calibri" w:hAnsi="Calibri" w:cs="Calibri"/>
                 <w:color w:val="000000" w:themeColor="text1"/>
               </w:rPr>
-              <w:t>P(</w:t>
-            </w:r>
-            <w:r>
-              <w:rPr>
-                <w:rFonts w:ascii="Calibri" w:hAnsi="Calibri" w:cs="Calibri"/>
-                <w:color w:val="000000" w:themeColor="text1"/>
-              </w:rPr>
-              <w:t>PC</w:t>
-            </w:r>
-            <w:r>
-              <w:rPr>
-                <w:rFonts w:ascii="Calibri" w:hAnsi="Calibri" w:cs="Calibri"/>
-                <w:color w:val="000000" w:themeColor="text1"/>
-              </w:rPr>
-              <w:t>)</w:t>
+              <w:t>P(PC)</w:t>
             </w:r>
           </w:p>
         </w:tc>
@@ -5331,14 +5280,7 @@
                       <w:rFonts w:ascii="Cambria Math" w:hAnsi="Cambria Math" w:cs="Calibri"/>
                       <w:color w:val="000000" w:themeColor="text1"/>
                     </w:rPr>
-                    <m:t>5.9</m:t>
-                  </m:r>
-                  <m:r>
-                    <w:rPr>
-                      <w:rFonts w:ascii="Cambria Math" w:hAnsi="Cambria Math" w:cs="Calibri"/>
-                      <w:color w:val="000000" w:themeColor="text1"/>
-                    </w:rPr>
-                    <m:t xml:space="preserve"> ×10</m:t>
+                    <m:t>5.9 ×10</m:t>
                   </m:r>
                 </m:e>
                 <m:sup>
@@ -5372,21 +5314,7 @@
                 <w:rFonts w:ascii="Calibri" w:hAnsi="Calibri" w:cs="Calibri"/>
                 <w:color w:val="000000" w:themeColor="text1"/>
               </w:rPr>
-              <w:t>P(</w:t>
-            </w:r>
-            <w:r>
-              <w:rPr>
-                <w:rFonts w:ascii="Calibri" w:hAnsi="Calibri" w:cs="Calibri"/>
-                <w:color w:val="000000" w:themeColor="text1"/>
-              </w:rPr>
-              <w:t>ToB</w:t>
-            </w:r>
-            <w:r>
-              <w:rPr>
-                <w:rFonts w:ascii="Calibri" w:hAnsi="Calibri" w:cs="Calibri"/>
-                <w:color w:val="000000" w:themeColor="text1"/>
-              </w:rPr>
-              <w:t>)</w:t>
+              <w:t>P(ToB)</w:t>
             </w:r>
           </w:p>
         </w:tc>
@@ -5540,126 +5468,7 @@
               <w:rFonts w:ascii="Cambria Math" w:hAnsi="Cambria Math" w:cs="Calibri"/>
               <w:color w:val="000000" w:themeColor="text1"/>
             </w:rPr>
-            <m:t>P</m:t>
-          </m:r>
-          <m:r>
-            <w:rPr>
-              <w:rFonts w:ascii="Cambria Math" w:hAnsi="Cambria Math" w:cs="Calibri"/>
-              <w:color w:val="000000" w:themeColor="text1"/>
-            </w:rPr>
-            <m:t>r</m:t>
-          </m:r>
-          <m:r>
-            <w:rPr>
-              <w:rFonts w:ascii="Cambria Math" w:hAnsi="Cambria Math" w:cs="Calibri"/>
-              <w:color w:val="000000" w:themeColor="text1"/>
-            </w:rPr>
-            <m:t xml:space="preserve">obability of collision= </m:t>
-          </m:r>
-          <m:r>
-            <w:rPr>
-              <w:rFonts w:ascii="Cambria Math" w:hAnsi="Cambria Math" w:cs="Calibri"/>
-              <w:color w:val="000000" w:themeColor="text1"/>
-            </w:rPr>
-            <m:t>P</m:t>
-          </m:r>
-          <m:r>
-            <w:rPr>
-              <w:rFonts w:ascii="Cambria Math" w:hAnsi="Cambria Math" w:cs="Calibri"/>
-              <w:color w:val="000000" w:themeColor="text1"/>
-            </w:rPr>
-            <m:t>(</m:t>
-          </m:r>
-          <m:r>
-            <w:rPr>
-              <w:rFonts w:ascii="Cambria Math" w:hAnsi="Cambria Math" w:cs="Calibri"/>
-              <w:color w:val="000000" w:themeColor="text1"/>
-            </w:rPr>
-            <m:t>FN)×P</m:t>
-          </m:r>
-          <m:r>
-            <w:rPr>
-              <w:rFonts w:ascii="Cambria Math" w:hAnsi="Cambria Math" w:cs="Calibri"/>
-              <w:color w:val="000000" w:themeColor="text1"/>
-            </w:rPr>
-            <m:t>(</m:t>
-          </m:r>
-          <m:r>
-            <w:rPr>
-              <w:rFonts w:ascii="Cambria Math" w:hAnsi="Cambria Math" w:cs="Calibri"/>
-              <w:color w:val="000000" w:themeColor="text1"/>
-            </w:rPr>
-            <m:t>LN)×P</m:t>
-          </m:r>
-          <m:r>
-            <w:rPr>
-              <w:rFonts w:ascii="Cambria Math" w:hAnsi="Cambria Math" w:cs="Calibri"/>
-              <w:color w:val="000000" w:themeColor="text1"/>
-            </w:rPr>
-            <m:t>(</m:t>
-          </m:r>
-          <m:r>
-            <w:rPr>
-              <w:rFonts w:ascii="Cambria Math" w:hAnsi="Cambria Math" w:cs="Calibri"/>
-              <w:color w:val="000000" w:themeColor="text1"/>
-            </w:rPr>
-            <m:t>D</m:t>
-          </m:r>
-          <m:r>
-            <w:rPr>
-              <w:rFonts w:ascii="Cambria Math" w:hAnsi="Cambria Math" w:cs="Calibri"/>
-              <w:color w:val="000000" w:themeColor="text1"/>
-            </w:rPr>
-            <m:t>o</m:t>
-          </m:r>
-          <m:r>
-            <w:rPr>
-              <w:rFonts w:ascii="Cambria Math" w:hAnsi="Cambria Math" w:cs="Calibri"/>
-              <w:color w:val="000000" w:themeColor="text1"/>
-            </w:rPr>
-            <m:t>B)×P</m:t>
-          </m:r>
-          <m:r>
-            <w:rPr>
-              <w:rFonts w:ascii="Cambria Math" w:hAnsi="Cambria Math" w:cs="Calibri"/>
-              <w:color w:val="000000" w:themeColor="text1"/>
-            </w:rPr>
-            <m:t>(</m:t>
-          </m:r>
-          <m:r>
-            <w:rPr>
-              <w:rFonts w:ascii="Cambria Math" w:hAnsi="Cambria Math" w:cs="Calibri"/>
-              <w:color w:val="000000" w:themeColor="text1"/>
-            </w:rPr>
-            <m:t>PC)×P</m:t>
-          </m:r>
-          <m:r>
-            <w:rPr>
-              <w:rFonts w:ascii="Cambria Math" w:hAnsi="Cambria Math" w:cs="Calibri"/>
-              <w:color w:val="000000" w:themeColor="text1"/>
-            </w:rPr>
-            <m:t>(</m:t>
-          </m:r>
-          <m:r>
-            <w:rPr>
-              <w:rFonts w:ascii="Cambria Math" w:hAnsi="Cambria Math" w:cs="Calibri"/>
-              <w:color w:val="000000" w:themeColor="text1"/>
-            </w:rPr>
-            <m:t>T</m:t>
-          </m:r>
-          <m:r>
-            <w:rPr>
-              <w:rFonts w:ascii="Cambria Math" w:hAnsi="Cambria Math" w:cs="Calibri"/>
-              <w:color w:val="000000" w:themeColor="text1"/>
-            </w:rPr>
-            <m:t>o</m:t>
-          </m:r>
-          <m:r>
-            <w:rPr>
-              <w:rFonts w:ascii="Cambria Math" w:hAnsi="Cambria Math" w:cs="Calibri"/>
-              <w:color w:val="000000" w:themeColor="text1"/>
-            </w:rPr>
-            <m:t>B)</m:t>
+            <m:t>Probability of collision= P(FN)×P(LN)×P(DoB)×P(PC)×P(ToB)</m:t>
           </m:r>
         </m:oMath>
       </m:oMathPara>
@@ -5850,23 +5659,123 @@
         </w:rPr>
         <w:t xml:space="preserve">. </w:t>
       </w:r>
-    </w:p>
-    <w:p>
-      <w:pPr>
-        <w:rPr>
-          <w:rFonts w:ascii="Calibri" w:hAnsi="Calibri" w:cs="Calibri"/>
-          <w:color w:val="000000" w:themeColor="text1"/>
-        </w:rPr>
-      </w:pPr>
-      <w:r>
-        <w:rPr>
-          <w:rFonts w:ascii="Calibri" w:hAnsi="Calibri" w:cs="Calibri"/>
-          <w:color w:val="000000" w:themeColor="text1"/>
-        </w:rPr>
-        <w:pict w14:anchorId="6CCA4306">
-          <v:rect id="_x0000_i1030" style="width:0;height:1.5pt" o:hralign="center" o:hrstd="t" o:hr="t" fillcolor="#a0a0a0" stroked="f"/>
-        </w:pict>
-      </w:r>
+      <w:r>
+        <w:rPr>
+          <w:rFonts w:ascii="Calibri" w:hAnsi="Calibri" w:cs="Calibri"/>
+          <w:color w:val="000000" w:themeColor="text1"/>
+        </w:rPr>
+        <w:t xml:space="preserve">Figure X illustrates the full voter authentication </w:t>
+      </w:r>
+      <w:proofErr w:type="gramStart"/>
+      <w:r>
+        <w:rPr>
+          <w:rFonts w:ascii="Calibri" w:hAnsi="Calibri" w:cs="Calibri"/>
+          <w:color w:val="000000" w:themeColor="text1"/>
+        </w:rPr>
+        <w:t>flow,</w:t>
+      </w:r>
+      <w:proofErr w:type="gramEnd"/>
+      <w:r>
+        <w:rPr>
+          <w:rFonts w:ascii="Calibri" w:hAnsi="Calibri" w:cs="Calibri"/>
+          <w:color w:val="000000" w:themeColor="text1"/>
+        </w:rPr>
+        <w:t xml:space="preserve"> it includes how the system does deal with collisions by iterating through the candidate records.  </w:t>
+      </w:r>
+    </w:p>
+    <w:p>
+      <w:pPr>
+        <w:rPr>
+          <w:rFonts w:ascii="Calibri" w:hAnsi="Calibri" w:cs="Calibri"/>
+          <w:color w:val="000000" w:themeColor="text1"/>
+        </w:rPr>
+      </w:pPr>
+      <w:r>
+        <w:rPr>
+          <w:rFonts w:ascii="Calibri" w:hAnsi="Calibri" w:cs="Calibri"/>
+          <w:color w:val="000000" w:themeColor="text1"/>
+        </w:rPr>
+        <w:lastRenderedPageBreak/>
+        <w:drawing>
+          <wp:inline distT="0" distB="0" distL="0" distR="0" wp14:anchorId="5E87E96C" wp14:editId="1B6830F2">
+            <wp:extent cx="3678405" cy="8004412"/>
+            <wp:effectExtent l="0" t="0" r="0" b="0"/>
+            <wp:docPr id="610082170" name="Picture 4"/>
+            <wp:cNvGraphicFramePr>
+              <a:graphicFrameLocks xmlns:a="http://schemas.openxmlformats.org/drawingml/2006/main" noChangeAspect="1"/>
+            </wp:cNvGraphicFramePr>
+            <a:graphic xmlns:a="http://schemas.openxmlformats.org/drawingml/2006/main">
+              <a:graphicData uri="http://schemas.openxmlformats.org/drawingml/2006/picture">
+                <pic:pic xmlns:pic="http://schemas.openxmlformats.org/drawingml/2006/picture">
+                  <pic:nvPicPr>
+                    <pic:cNvPr id="0" name="Picture 15"/>
+                    <pic:cNvPicPr>
+                      <a:picLocks noChangeAspect="1" noChangeArrowheads="1"/>
+                    </pic:cNvPicPr>
+                  </pic:nvPicPr>
+                  <pic:blipFill>
+                    <a:blip r:embed="rId6">
+                      <a:extLst>
+                        <a:ext uri="{28A0092B-C50C-407E-A947-70E740481C1C}">
+                          <a14:useLocalDpi xmlns:a14="http://schemas.microsoft.com/office/drawing/2010/main" val="0"/>
+                        </a:ext>
+                      </a:extLst>
+                    </a:blip>
+                    <a:srcRect/>
+                    <a:stretch>
+                      <a:fillRect/>
+                    </a:stretch>
+                  </pic:blipFill>
+                  <pic:spPr bwMode="auto">
+                    <a:xfrm>
+                      <a:off x="0" y="0"/>
+                      <a:ext cx="3682298" cy="8012882"/>
+                    </a:xfrm>
+                    <a:prstGeom prst="rect">
+                      <a:avLst/>
+                    </a:prstGeom>
+                    <a:noFill/>
+                    <a:ln>
+                      <a:noFill/>
+                    </a:ln>
+                  </pic:spPr>
+                </pic:pic>
+              </a:graphicData>
+            </a:graphic>
+          </wp:inline>
+        </w:drawing>
+      </w:r>
+    </w:p>
+    <w:p>
+      <w:pPr>
+        <w:rPr>
+          <w:rFonts w:ascii="Calibri" w:hAnsi="Calibri" w:cs="Calibri"/>
+          <w:color w:val="000000" w:themeColor="text1"/>
+        </w:rPr>
+      </w:pPr>
+      <w:r>
+        <w:rPr>
+          <w:rFonts w:ascii="Calibri" w:hAnsi="Calibri" w:cs="Calibri"/>
+          <w:color w:val="000000" w:themeColor="text1"/>
+        </w:rPr>
+        <w:t>Figure X – Sequence Diagram of Authentication Flow as a Voter</w:t>
+      </w:r>
+    </w:p>
+    <w:p>
+      <w:pPr>
+        <w:rPr>
+          <w:rFonts w:ascii="Calibri" w:hAnsi="Calibri" w:cs="Calibri"/>
+          <w:color w:val="000000" w:themeColor="text1"/>
+        </w:rPr>
+      </w:pPr>
+    </w:p>
+    <w:p>
+      <w:pPr>
+        <w:rPr>
+          <w:rFonts w:ascii="Calibri" w:hAnsi="Calibri" w:cs="Calibri"/>
+          <w:color w:val="000000" w:themeColor="text1"/>
+        </w:rPr>
+      </w:pPr>
     </w:p>
     <w:p>
       <w:pPr>
@@ -5884,6 +5793,7 @@
           <w:bCs/>
           <w:color w:val="000000" w:themeColor="text1"/>
         </w:rPr>
+        <w:lastRenderedPageBreak/>
         <w:t>4.1.7 Linking Code Integrity</w:t>
       </w:r>
     </w:p>
@@ -5937,6 +5847,22 @@
         </w:rPr>
         <w:t xml:space="preserve"> </w:t>
       </w:r>
+    </w:p>
+    <w:p>
+      <w:pPr>
+        <w:rPr>
+          <w:rFonts w:ascii="Calibri" w:hAnsi="Calibri" w:cs="Calibri"/>
+          <w:color w:val="000000" w:themeColor="text1"/>
+        </w:rPr>
+      </w:pPr>
+    </w:p>
+    <w:p>
+      <w:pPr>
+        <w:rPr>
+          <w:rFonts w:ascii="Calibri" w:hAnsi="Calibri" w:cs="Calibri"/>
+          <w:color w:val="000000" w:themeColor="text1"/>
+        </w:rPr>
+      </w:pPr>
     </w:p>
     <w:p>
       <w:pPr>
@@ -5954,586 +5880,1125 @@
           <w:bCs/>
           <w:color w:val="000000" w:themeColor="text1"/>
         </w:rPr>
-        <w:t>4.2 Tech Stack</w:t>
-      </w:r>
-    </w:p>
-    <w:p>
-      <w:pPr>
-        <w:rPr>
-          <w:rFonts w:ascii="Calibri" w:hAnsi="Calibri" w:cs="Calibri"/>
-          <w:color w:val="000000" w:themeColor="text1"/>
-        </w:rPr>
-      </w:pPr>
-      <w:r>
-        <w:rPr>
-          <w:rFonts w:ascii="Calibri" w:hAnsi="Calibri" w:cs="Calibri"/>
-          <w:color w:val="000000" w:themeColor="text1"/>
-        </w:rPr>
-        <w:lastRenderedPageBreak/>
-        <w:t>T</w:t>
-      </w:r>
-      <w:r>
-        <w:rPr>
-          <w:rFonts w:ascii="Calibri" w:hAnsi="Calibri" w:cs="Calibri"/>
-          <w:color w:val="000000" w:themeColor="text1"/>
-        </w:rPr>
-        <w:t>he system consists of four main components: server, database, two client applications, and a hosting platform. The technologies selected for each component were chosen based on compatibility, security, and project constraints.</w:t>
-      </w:r>
-    </w:p>
-    <w:p>
-      <w:pPr>
+        <w:t xml:space="preserve">4.2 </w:t>
+      </w:r>
+      <w:r>
         <w:rPr>
           <w:rFonts w:ascii="Calibri" w:hAnsi="Calibri" w:cs="Calibri"/>
           <w:b/>
           <w:bCs/>
           <w:color w:val="000000" w:themeColor="text1"/>
         </w:rPr>
-      </w:pPr>
-      <w:r>
+        <w:t>System Structure</w:t>
+      </w:r>
+    </w:p>
+    <w:p>
+      <w:pPr>
+        <w:rPr>
+          <w:rFonts w:ascii="Calibri" w:hAnsi="Calibri" w:cs="Calibri"/>
+          <w:color w:val="000000" w:themeColor="text1"/>
+        </w:rPr>
+      </w:pPr>
+      <w:r>
+        <w:rPr>
+          <w:rFonts w:ascii="Calibri" w:hAnsi="Calibri" w:cs="Calibri"/>
+          <w:color w:val="000000" w:themeColor="text1"/>
+        </w:rPr>
+        <w:t>T</w:t>
+      </w:r>
+      <w:r>
+        <w:rPr>
+          <w:rFonts w:ascii="Calibri" w:hAnsi="Calibri" w:cs="Calibri"/>
+          <w:color w:val="000000" w:themeColor="text1"/>
+        </w:rPr>
+        <w:t>he system consists of four main components: server, database, two client applications, and a hosting platform. The technologies selected for each component were chosen based on compatibility, security, and project constraints.</w:t>
+      </w:r>
+      <w:r>
+        <w:rPr>
+          <w:rFonts w:ascii="Calibri" w:hAnsi="Calibri" w:cs="Calibri"/>
+          <w:color w:val="000000" w:themeColor="text1"/>
+        </w:rPr>
+        <w:t xml:space="preserve"> </w:t>
+      </w:r>
+      <w:r>
+        <w:rPr>
+          <w:rFonts w:ascii="Calibri" w:hAnsi="Calibri" w:cs="Calibri"/>
+          <w:color w:val="000000" w:themeColor="text1"/>
+        </w:rPr>
+        <w:t>In Figure X the components are shown in how they communicate.</w:t>
+      </w:r>
+    </w:p>
+    <w:p>
+      <w:pPr>
+        <w:rPr>
+          <w:rFonts w:ascii="Calibri" w:hAnsi="Calibri" w:cs="Calibri"/>
+          <w:color w:val="000000" w:themeColor="text1"/>
+        </w:rPr>
+      </w:pPr>
+      <w:r>
+        <w:rPr>
+          <w:rFonts w:ascii="Calibri" w:hAnsi="Calibri" w:cs="Calibri"/>
+          <w:color w:val="000000" w:themeColor="text1"/>
+        </w:rPr>
+        <w:drawing>
+          <wp:inline distT="0" distB="0" distL="0" distR="0" wp14:anchorId="7A22AE45" wp14:editId="39278C2A">
+            <wp:extent cx="2107096" cy="1925943"/>
+            <wp:effectExtent l="0" t="0" r="7620" b="0"/>
+            <wp:docPr id="64640602" name="Picture 1"/>
+            <wp:cNvGraphicFramePr>
+              <a:graphicFrameLocks xmlns:a="http://schemas.openxmlformats.org/drawingml/2006/main" noChangeAspect="1"/>
+            </wp:cNvGraphicFramePr>
+            <a:graphic xmlns:a="http://schemas.openxmlformats.org/drawingml/2006/main">
+              <a:graphicData uri="http://schemas.openxmlformats.org/drawingml/2006/picture">
+                <pic:pic xmlns:pic="http://schemas.openxmlformats.org/drawingml/2006/picture">
+                  <pic:nvPicPr>
+                    <pic:cNvPr id="64640602" name=""/>
+                    <pic:cNvPicPr/>
+                  </pic:nvPicPr>
+                  <pic:blipFill>
+                    <a:blip r:embed="rId7"/>
+                    <a:stretch>
+                      <a:fillRect/>
+                    </a:stretch>
+                  </pic:blipFill>
+                  <pic:spPr>
+                    <a:xfrm>
+                      <a:off x="0" y="0"/>
+                      <a:ext cx="2116355" cy="1934406"/>
+                    </a:xfrm>
+                    <a:prstGeom prst="rect">
+                      <a:avLst/>
+                    </a:prstGeom>
+                  </pic:spPr>
+                </pic:pic>
+              </a:graphicData>
+            </a:graphic>
+          </wp:inline>
+        </w:drawing>
+      </w:r>
+    </w:p>
+    <w:p>
+      <w:pPr>
+        <w:rPr>
+          <w:rFonts w:ascii="Calibri" w:hAnsi="Calibri" w:cs="Calibri"/>
+          <w:color w:val="000000" w:themeColor="text1"/>
+        </w:rPr>
+      </w:pPr>
+      <w:r>
+        <w:rPr>
+          <w:rFonts w:ascii="Calibri" w:hAnsi="Calibri" w:cs="Calibri"/>
+          <w:color w:val="000000" w:themeColor="text1"/>
+        </w:rPr>
+        <w:t xml:space="preserve">Figure X - System Architecture Diagram </w:t>
+      </w:r>
+    </w:p>
+    <w:p>
+      <w:pPr>
         <w:rPr>
           <w:rFonts w:ascii="Calibri" w:hAnsi="Calibri" w:cs="Calibri"/>
           <w:b/>
           <w:bCs/>
           <w:color w:val="000000" w:themeColor="text1"/>
         </w:rPr>
-        <w:t>4.2.1 Back End</w:t>
-      </w:r>
-    </w:p>
-    <w:p>
-      <w:pPr>
-        <w:rPr>
-          <w:rFonts w:ascii="Calibri" w:hAnsi="Calibri" w:cs="Calibri"/>
-          <w:color w:val="000000" w:themeColor="text1"/>
-        </w:rPr>
-      </w:pPr>
-      <w:r>
-        <w:rPr>
-          <w:rFonts w:ascii="Calibri" w:hAnsi="Calibri" w:cs="Calibri"/>
-          <w:color w:val="000000" w:themeColor="text1"/>
-        </w:rPr>
-        <w:t xml:space="preserve">ASP.NET Core on .NET 8 was selected due to its </w:t>
-      </w:r>
-      <w:r>
-        <w:rPr>
-          <w:rFonts w:ascii="Calibri" w:hAnsi="Calibri" w:cs="Calibri"/>
-          <w:color w:val="000000" w:themeColor="text1"/>
-        </w:rPr>
-        <w:t>cross</w:t>
-      </w:r>
-      <w:r>
-        <w:rPr>
-          <w:rFonts w:ascii="Calibri" w:hAnsi="Calibri" w:cs="Calibri"/>
-          <w:color w:val="000000" w:themeColor="text1"/>
-        </w:rPr>
-        <w:t>-platform</w:t>
-      </w:r>
-      <w:r>
-        <w:rPr>
-          <w:rFonts w:ascii="Calibri" w:hAnsi="Calibri" w:cs="Calibri"/>
-          <w:color w:val="000000" w:themeColor="text1"/>
-        </w:rPr>
-        <w:t xml:space="preserve"> compatibility and ability to support both API and application development within a single ecosystem [27]. As a </w:t>
-      </w:r>
-      <w:r>
-        <w:rPr>
-          <w:rFonts w:ascii="Calibri" w:hAnsi="Calibri" w:cs="Calibri"/>
-          <w:color w:val="000000" w:themeColor="text1"/>
-        </w:rPr>
-        <w:t>long</w:t>
-      </w:r>
-      <w:r>
-        <w:rPr>
-          <w:rFonts w:ascii="Calibri" w:hAnsi="Calibri" w:cs="Calibri"/>
-          <w:color w:val="000000" w:themeColor="text1"/>
-        </w:rPr>
-        <w:t>-term</w:t>
-      </w:r>
-      <w:r>
-        <w:rPr>
-          <w:rFonts w:ascii="Calibri" w:hAnsi="Calibri" w:cs="Calibri"/>
-          <w:color w:val="000000" w:themeColor="text1"/>
-        </w:rPr>
-        <w:t xml:space="preserve"> support release, it benefits from ongoing security updates, making it suitable for a security</w:t>
-      </w:r>
-      <w:r>
-        <w:rPr>
-          <w:rFonts w:ascii="Calibri" w:hAnsi="Calibri" w:cs="Calibri"/>
-          <w:color w:val="000000" w:themeColor="text1"/>
-        </w:rPr>
-        <w:t xml:space="preserve"> </w:t>
-      </w:r>
-      <w:r>
-        <w:rPr>
-          <w:rFonts w:ascii="Calibri" w:hAnsi="Calibri" w:cs="Calibri"/>
-          <w:color w:val="000000" w:themeColor="text1"/>
-        </w:rPr>
-        <w:t>critical system such as an e-voting platform.</w:t>
-      </w:r>
-    </w:p>
-    <w:p>
-      <w:pPr>
-        <w:rPr>
-          <w:rFonts w:ascii="Calibri" w:hAnsi="Calibri" w:cs="Calibri"/>
-          <w:color w:val="000000" w:themeColor="text1"/>
-        </w:rPr>
-      </w:pPr>
-      <w:r>
-        <w:rPr>
-          <w:rFonts w:ascii="Calibri" w:hAnsi="Calibri" w:cs="Calibri"/>
-          <w:color w:val="000000" w:themeColor="text1"/>
-        </w:rPr>
-        <w:t>Methods for communication between the server and clients were evaluated next.</w:t>
-      </w:r>
-      <w:r>
-        <w:rPr>
-          <w:rFonts w:ascii="Calibri" w:hAnsi="Calibri" w:cs="Calibri"/>
-          <w:color w:val="000000" w:themeColor="text1"/>
-        </w:rPr>
-        <w:t xml:space="preserve"> </w:t>
-      </w:r>
-      <w:r>
-        <w:rPr>
-          <w:rFonts w:ascii="Calibri" w:hAnsi="Calibri" w:cs="Calibri"/>
-          <w:color w:val="000000" w:themeColor="text1"/>
-        </w:rPr>
-        <w:t>Initially, HTTP polling was considered due to its simplicity</w:t>
-      </w:r>
-      <w:r>
-        <w:rPr>
-          <w:rFonts w:ascii="Calibri" w:hAnsi="Calibri" w:cs="Calibri"/>
-          <w:color w:val="000000" w:themeColor="text1"/>
-        </w:rPr>
-        <w:t>. H</w:t>
-      </w:r>
-      <w:r>
-        <w:rPr>
-          <w:rFonts w:ascii="Calibri" w:hAnsi="Calibri" w:cs="Calibri"/>
-          <w:color w:val="000000" w:themeColor="text1"/>
-        </w:rPr>
-        <w:t xml:space="preserve">owever, it introduced latency and unnecessary network overhead. SignalR was selected instead, as it enables persistent, </w:t>
-      </w:r>
-      <w:r>
-        <w:rPr>
-          <w:rFonts w:ascii="Calibri" w:hAnsi="Calibri" w:cs="Calibri"/>
-          <w:color w:val="000000" w:themeColor="text1"/>
-        </w:rPr>
-        <w:t>two</w:t>
-      </w:r>
-      <w:r>
-        <w:rPr>
-          <w:rFonts w:ascii="Calibri" w:hAnsi="Calibri" w:cs="Calibri"/>
-          <w:color w:val="000000" w:themeColor="text1"/>
-        </w:rPr>
-        <w:t>-way</w:t>
-      </w:r>
-      <w:r>
-        <w:rPr>
-          <w:rFonts w:ascii="Calibri" w:hAnsi="Calibri" w:cs="Calibri"/>
-          <w:color w:val="000000" w:themeColor="text1"/>
-        </w:rPr>
-        <w:t xml:space="preserve"> communication, allowing the server to push updates to clients in real time [28].</w:t>
-      </w:r>
-    </w:p>
-    <w:p>
-      <w:pPr>
-        <w:rPr>
-          <w:rFonts w:ascii="Calibri" w:hAnsi="Calibri" w:cs="Calibri"/>
-          <w:color w:val="000000" w:themeColor="text1"/>
-        </w:rPr>
-      </w:pPr>
-      <w:r>
-        <w:rPr>
-          <w:rFonts w:ascii="Calibri" w:hAnsi="Calibri" w:cs="Calibri"/>
-          <w:color w:val="000000" w:themeColor="text1"/>
-        </w:rPr>
-        <w:t>This approach improves responsiveness and ensures system state remains consistent across multiple active clients</w:t>
-      </w:r>
-      <w:r>
-        <w:rPr>
-          <w:rFonts w:ascii="Calibri" w:hAnsi="Calibri" w:cs="Calibri"/>
-          <w:color w:val="000000" w:themeColor="text1"/>
-        </w:rPr>
-        <w:t>. The responsiveness was deemed essential as status</w:t>
-      </w:r>
-      <w:r>
-        <w:rPr>
-          <w:rFonts w:ascii="Calibri" w:hAnsi="Calibri" w:cs="Calibri"/>
-          <w:color w:val="000000" w:themeColor="text1"/>
-        </w:rPr>
-        <w:t>es</w:t>
-      </w:r>
-      <w:r>
-        <w:rPr>
-          <w:rFonts w:ascii="Calibri" w:hAnsi="Calibri" w:cs="Calibri"/>
-          <w:color w:val="000000" w:themeColor="text1"/>
-        </w:rPr>
-        <w:t xml:space="preserve"> are sent to the official app when issues occur on the voter device. These status messages were fo</w:t>
-      </w:r>
-      <w:r>
-        <w:rPr>
-          <w:rFonts w:ascii="Calibri" w:hAnsi="Calibri" w:cs="Calibri"/>
-          <w:color w:val="000000" w:themeColor="text1"/>
-        </w:rPr>
-        <w:t xml:space="preserve">und to arrive 30 seconds after the status change had occurred, making warning statuses </w:t>
-      </w:r>
-      <w:r>
-        <w:rPr>
-          <w:rFonts w:ascii="Calibri" w:hAnsi="Calibri" w:cs="Calibri"/>
-          <w:color w:val="000000" w:themeColor="text1"/>
-        </w:rPr>
-        <w:t>outdated</w:t>
-      </w:r>
-      <w:r>
-        <w:rPr>
-          <w:rFonts w:ascii="Calibri" w:hAnsi="Calibri" w:cs="Calibri"/>
-          <w:color w:val="000000" w:themeColor="text1"/>
-        </w:rPr>
-        <w:t>.</w:t>
-      </w:r>
-    </w:p>
-    <w:p>
-      <w:pPr>
-        <w:rPr>
-          <w:rFonts w:ascii="Calibri" w:hAnsi="Calibri" w:cs="Calibri"/>
-          <w:color w:val="000000" w:themeColor="text1"/>
-        </w:rPr>
-      </w:pPr>
-      <w:r>
-        <w:rPr>
-          <w:rFonts w:ascii="Calibri" w:hAnsi="Calibri" w:cs="Calibri"/>
-          <w:color w:val="000000" w:themeColor="text1"/>
-        </w:rPr>
-        <w:t>A key design feature of the server is its channels</w:t>
-      </w:r>
-      <w:r>
-        <w:rPr>
-          <w:rFonts w:ascii="Calibri" w:hAnsi="Calibri" w:cs="Calibri"/>
-          <w:color w:val="000000" w:themeColor="text1"/>
-        </w:rPr>
-        <w:t>. T</w:t>
-      </w:r>
-      <w:r>
-        <w:rPr>
-          <w:rFonts w:ascii="Calibri" w:hAnsi="Calibri" w:cs="Calibri"/>
-          <w:color w:val="000000" w:themeColor="text1"/>
-        </w:rPr>
-        <w:t xml:space="preserve">he </w:t>
-      </w:r>
-      <w:r>
-        <w:rPr>
-          <w:rFonts w:ascii="Calibri" w:hAnsi="Calibri" w:cs="Calibri"/>
-          <w:color w:val="000000" w:themeColor="text1"/>
-        </w:rPr>
-        <w:t xml:space="preserve">SignalR channels are </w:t>
-      </w:r>
-      <w:r>
-        <w:rPr>
-          <w:rFonts w:ascii="Calibri" w:hAnsi="Calibri" w:cs="Calibri"/>
-          <w:color w:val="000000" w:themeColor="text1"/>
-        </w:rPr>
-        <w:t>organised firstly</w:t>
-      </w:r>
-      <w:r>
-        <w:rPr>
-          <w:rFonts w:ascii="Calibri" w:hAnsi="Calibri" w:cs="Calibri"/>
-          <w:color w:val="000000" w:themeColor="text1"/>
-        </w:rPr>
-        <w:t xml:space="preserve"> by county and</w:t>
-      </w:r>
-      <w:r>
-        <w:rPr>
-          <w:rFonts w:ascii="Calibri" w:hAnsi="Calibri" w:cs="Calibri"/>
-          <w:color w:val="000000" w:themeColor="text1"/>
-        </w:rPr>
-        <w:t xml:space="preserve"> then by constituency. This channel structure is designed to speed up finding a channel, making connections faster. This organisation also can be used </w:t>
-      </w:r>
-      <w:r>
-        <w:rPr>
-          <w:rFonts w:ascii="Calibri" w:hAnsi="Calibri" w:cs="Calibri"/>
-          <w:color w:val="000000" w:themeColor="text1"/>
-        </w:rPr>
-        <w:t xml:space="preserve">to assign more server power to certain counties with a high number of </w:t>
-      </w:r>
-      <w:r>
-        <w:rPr>
-          <w:rFonts w:ascii="Calibri" w:hAnsi="Calibri" w:cs="Calibri"/>
-          <w:color w:val="000000" w:themeColor="text1"/>
-        </w:rPr>
-        <w:t>connections, as</w:t>
-      </w:r>
-      <w:r>
-        <w:rPr>
-          <w:rFonts w:ascii="Calibri" w:hAnsi="Calibri" w:cs="Calibri"/>
-          <w:color w:val="000000" w:themeColor="text1"/>
-        </w:rPr>
-        <w:t xml:space="preserve"> a higher population a county might need more polling stations than others. </w:t>
-      </w:r>
-      <w:r>
-        <w:rPr>
-          <w:rFonts w:ascii="Calibri" w:hAnsi="Calibri" w:cs="Calibri"/>
-          <w:color w:val="000000" w:themeColor="text1"/>
-        </w:rPr>
-        <w:t>This supports scalability, as system load can be distributed geographically without requiring architectural changes.</w:t>
-      </w:r>
-    </w:p>
-    <w:p>
-      <w:pPr>
-        <w:rPr>
-          <w:rFonts w:ascii="Calibri" w:hAnsi="Calibri" w:cs="Calibri"/>
-          <w:color w:val="000000" w:themeColor="text1"/>
-        </w:rPr>
-      </w:pPr>
-      <w:r>
-        <w:rPr>
-          <w:rFonts w:ascii="Calibri" w:hAnsi="Calibri" w:cs="Calibri"/>
-          <w:color w:val="000000" w:themeColor="text1"/>
-        </w:rPr>
-        <w:t>The active election configuration is hardcoded in the current implementation. While a dynamic configuration system would provide greater flexibility, it introduces a risk of accidental or malicious modification</w:t>
-      </w:r>
-      <w:r>
-        <w:rPr>
-          <w:rFonts w:ascii="Calibri" w:hAnsi="Calibri" w:cs="Calibri"/>
-          <w:color w:val="000000" w:themeColor="text1"/>
-        </w:rPr>
-        <w:t xml:space="preserve"> to negate election results</w:t>
-      </w:r>
-      <w:r>
-        <w:rPr>
-          <w:rFonts w:ascii="Calibri" w:hAnsi="Calibri" w:cs="Calibri"/>
-          <w:color w:val="000000" w:themeColor="text1"/>
-        </w:rPr>
-        <w:t>. Hardcoding removes this risk and ensures changes require deliberate redeployment.</w:t>
-      </w:r>
-    </w:p>
-    <w:p>
-      <w:pPr>
-        <w:rPr>
-          <w:rFonts w:ascii="Calibri" w:hAnsi="Calibri" w:cs="Calibri"/>
-          <w:color w:val="000000" w:themeColor="text1"/>
-        </w:rPr>
-      </w:pPr>
-      <w:r>
-        <w:rPr>
-          <w:rFonts w:ascii="Calibri" w:hAnsi="Calibri" w:cs="Calibri"/>
-          <w:color w:val="000000" w:themeColor="text1"/>
-        </w:rPr>
-        <w:pict w14:anchorId="2A850E57">
-          <v:rect id="_x0000_i1032" style="width:0;height:1.5pt" o:hralign="center" o:hrstd="t" o:hr="t" fillcolor="#a0a0a0" stroked="f"/>
-        </w:pict>
-      </w:r>
-    </w:p>
-    <w:p>
-      <w:pPr>
+      </w:pPr>
+      <w:r>
         <w:rPr>
           <w:rFonts w:ascii="Calibri" w:hAnsi="Calibri" w:cs="Calibri"/>
           <w:b/>
           <w:bCs/>
           <w:color w:val="000000" w:themeColor="text1"/>
         </w:rPr>
-      </w:pPr>
-      <w:r>
+        <w:t>4.2.1 Back End</w:t>
+      </w:r>
+    </w:p>
+    <w:p>
+      <w:pPr>
+        <w:rPr>
+          <w:rFonts w:ascii="Calibri" w:hAnsi="Calibri" w:cs="Calibri"/>
+          <w:color w:val="000000" w:themeColor="text1"/>
+        </w:rPr>
+      </w:pPr>
+      <w:r>
+        <w:rPr>
+          <w:rFonts w:ascii="Calibri" w:hAnsi="Calibri" w:cs="Calibri"/>
+          <w:color w:val="000000" w:themeColor="text1"/>
+        </w:rPr>
+        <w:t xml:space="preserve">ASP.NET Core on .NET 8 was selected due to its </w:t>
+      </w:r>
+      <w:proofErr w:type="gramStart"/>
+      <w:r>
+        <w:rPr>
+          <w:rFonts w:ascii="Calibri" w:hAnsi="Calibri" w:cs="Calibri"/>
+          <w:color w:val="000000" w:themeColor="text1"/>
+        </w:rPr>
+        <w:t>cross</w:t>
+      </w:r>
+      <w:r>
+        <w:rPr>
+          <w:rFonts w:ascii="Calibri" w:hAnsi="Calibri" w:cs="Calibri"/>
+          <w:color w:val="000000" w:themeColor="text1"/>
+        </w:rPr>
+        <w:t xml:space="preserve"> </w:t>
+      </w:r>
+      <w:r>
+        <w:rPr>
+          <w:rFonts w:ascii="Calibri" w:hAnsi="Calibri" w:cs="Calibri"/>
+          <w:color w:val="000000" w:themeColor="text1"/>
+        </w:rPr>
+        <w:t>platform</w:t>
+      </w:r>
+      <w:proofErr w:type="gramEnd"/>
+      <w:r>
+        <w:rPr>
+          <w:rFonts w:ascii="Calibri" w:hAnsi="Calibri" w:cs="Calibri"/>
+          <w:color w:val="000000" w:themeColor="text1"/>
+        </w:rPr>
+        <w:t xml:space="preserve"> compatibility and ability to support both API and application development within a single ecosystem [27]. As a </w:t>
+      </w:r>
+      <w:proofErr w:type="gramStart"/>
+      <w:r>
+        <w:rPr>
+          <w:rFonts w:ascii="Calibri" w:hAnsi="Calibri" w:cs="Calibri"/>
+          <w:color w:val="000000" w:themeColor="text1"/>
+        </w:rPr>
+        <w:t>long</w:t>
+      </w:r>
+      <w:r>
+        <w:rPr>
+          <w:rFonts w:ascii="Calibri" w:hAnsi="Calibri" w:cs="Calibri"/>
+          <w:color w:val="000000" w:themeColor="text1"/>
+        </w:rPr>
+        <w:t xml:space="preserve"> </w:t>
+      </w:r>
+      <w:r>
+        <w:rPr>
+          <w:rFonts w:ascii="Calibri" w:hAnsi="Calibri" w:cs="Calibri"/>
+          <w:color w:val="000000" w:themeColor="text1"/>
+        </w:rPr>
+        <w:t>term</w:t>
+      </w:r>
+      <w:proofErr w:type="gramEnd"/>
+      <w:r>
+        <w:rPr>
+          <w:rFonts w:ascii="Calibri" w:hAnsi="Calibri" w:cs="Calibri"/>
+          <w:color w:val="000000" w:themeColor="text1"/>
+        </w:rPr>
+        <w:t xml:space="preserve"> support release, it benefits from ongoing security updates, making it suitable for a security</w:t>
+      </w:r>
+      <w:r>
+        <w:rPr>
+          <w:rFonts w:ascii="Calibri" w:hAnsi="Calibri" w:cs="Calibri"/>
+          <w:color w:val="000000" w:themeColor="text1"/>
+        </w:rPr>
+        <w:t xml:space="preserve"> </w:t>
+      </w:r>
+      <w:r>
+        <w:rPr>
+          <w:rFonts w:ascii="Calibri" w:hAnsi="Calibri" w:cs="Calibri"/>
+          <w:color w:val="000000" w:themeColor="text1"/>
+        </w:rPr>
+        <w:t>critical system such as an e-voting platform.</w:t>
+      </w:r>
+    </w:p>
+    <w:p>
+      <w:pPr>
+        <w:rPr>
+          <w:rFonts w:ascii="Calibri" w:hAnsi="Calibri" w:cs="Calibri"/>
+          <w:color w:val="000000" w:themeColor="text1"/>
+        </w:rPr>
+      </w:pPr>
+      <w:r>
+        <w:rPr>
+          <w:rFonts w:ascii="Calibri" w:hAnsi="Calibri" w:cs="Calibri"/>
+          <w:color w:val="000000" w:themeColor="text1"/>
+        </w:rPr>
+        <w:t>Methods for communication between the server and clients were evaluated next.</w:t>
+      </w:r>
+      <w:r>
+        <w:rPr>
+          <w:rFonts w:ascii="Calibri" w:hAnsi="Calibri" w:cs="Calibri"/>
+          <w:color w:val="000000" w:themeColor="text1"/>
+        </w:rPr>
+        <w:t xml:space="preserve"> </w:t>
+      </w:r>
+      <w:r>
+        <w:rPr>
+          <w:rFonts w:ascii="Calibri" w:hAnsi="Calibri" w:cs="Calibri"/>
+          <w:color w:val="000000" w:themeColor="text1"/>
+        </w:rPr>
+        <w:t>Initially, HTTP polling was considered due to its simplicity</w:t>
+      </w:r>
+      <w:r>
+        <w:rPr>
+          <w:rFonts w:ascii="Calibri" w:hAnsi="Calibri" w:cs="Calibri"/>
+          <w:color w:val="000000" w:themeColor="text1"/>
+        </w:rPr>
+        <w:t>. H</w:t>
+      </w:r>
+      <w:r>
+        <w:rPr>
+          <w:rFonts w:ascii="Calibri" w:hAnsi="Calibri" w:cs="Calibri"/>
+          <w:color w:val="000000" w:themeColor="text1"/>
+        </w:rPr>
+        <w:t xml:space="preserve">owever, it introduced latency and unnecessary network overhead. SignalR was selected instead, as it enables persistent, </w:t>
+      </w:r>
+      <w:proofErr w:type="gramStart"/>
+      <w:r>
+        <w:rPr>
+          <w:rFonts w:ascii="Calibri" w:hAnsi="Calibri" w:cs="Calibri"/>
+          <w:color w:val="000000" w:themeColor="text1"/>
+        </w:rPr>
+        <w:t>two</w:t>
+      </w:r>
+      <w:r>
+        <w:rPr>
+          <w:rFonts w:ascii="Calibri" w:hAnsi="Calibri" w:cs="Calibri"/>
+          <w:color w:val="000000" w:themeColor="text1"/>
+        </w:rPr>
+        <w:t xml:space="preserve"> </w:t>
+      </w:r>
+      <w:r>
+        <w:rPr>
+          <w:rFonts w:ascii="Calibri" w:hAnsi="Calibri" w:cs="Calibri"/>
+          <w:color w:val="000000" w:themeColor="text1"/>
+        </w:rPr>
+        <w:t>way</w:t>
+      </w:r>
+      <w:proofErr w:type="gramEnd"/>
+      <w:r>
+        <w:rPr>
+          <w:rFonts w:ascii="Calibri" w:hAnsi="Calibri" w:cs="Calibri"/>
+          <w:color w:val="000000" w:themeColor="text1"/>
+        </w:rPr>
+        <w:t xml:space="preserve"> communication, allowing the server to push updates to clients in real time [28].</w:t>
+      </w:r>
+    </w:p>
+    <w:p>
+      <w:pPr>
+        <w:rPr>
+          <w:rFonts w:ascii="Calibri" w:hAnsi="Calibri" w:cs="Calibri"/>
+          <w:color w:val="000000" w:themeColor="text1"/>
+        </w:rPr>
+      </w:pPr>
+      <w:r>
+        <w:rPr>
+          <w:rFonts w:ascii="Calibri" w:hAnsi="Calibri" w:cs="Calibri"/>
+          <w:color w:val="000000" w:themeColor="text1"/>
+        </w:rPr>
+        <w:t>This approach improves responsiveness and ensures system state remains consistent across multiple active clients</w:t>
+      </w:r>
+      <w:r>
+        <w:rPr>
+          <w:rFonts w:ascii="Calibri" w:hAnsi="Calibri" w:cs="Calibri"/>
+          <w:color w:val="000000" w:themeColor="text1"/>
+        </w:rPr>
+        <w:t>. The responsiveness was deemed essential as status</w:t>
+      </w:r>
+      <w:r>
+        <w:rPr>
+          <w:rFonts w:ascii="Calibri" w:hAnsi="Calibri" w:cs="Calibri"/>
+          <w:color w:val="000000" w:themeColor="text1"/>
+        </w:rPr>
+        <w:t>es</w:t>
+      </w:r>
+      <w:r>
+        <w:rPr>
+          <w:rFonts w:ascii="Calibri" w:hAnsi="Calibri" w:cs="Calibri"/>
+          <w:color w:val="000000" w:themeColor="text1"/>
+        </w:rPr>
+        <w:t xml:space="preserve"> are sent to the official app when issues occur on the voter device. These status messages were fo</w:t>
+      </w:r>
+      <w:r>
+        <w:rPr>
+          <w:rFonts w:ascii="Calibri" w:hAnsi="Calibri" w:cs="Calibri"/>
+          <w:color w:val="000000" w:themeColor="text1"/>
+        </w:rPr>
+        <w:t xml:space="preserve">und to arrive 30 seconds after the status change had occurred, making warning statuses </w:t>
+      </w:r>
+      <w:r>
+        <w:rPr>
+          <w:rFonts w:ascii="Calibri" w:hAnsi="Calibri" w:cs="Calibri"/>
+          <w:color w:val="000000" w:themeColor="text1"/>
+        </w:rPr>
+        <w:t>outdated</w:t>
+      </w:r>
+      <w:r>
+        <w:rPr>
+          <w:rFonts w:ascii="Calibri" w:hAnsi="Calibri" w:cs="Calibri"/>
+          <w:color w:val="000000" w:themeColor="text1"/>
+        </w:rPr>
+        <w:t>.</w:t>
+      </w:r>
+    </w:p>
+    <w:p>
+      <w:pPr>
+        <w:rPr>
+          <w:rFonts w:ascii="Calibri" w:hAnsi="Calibri" w:cs="Calibri"/>
+          <w:color w:val="000000" w:themeColor="text1"/>
+        </w:rPr>
+      </w:pPr>
+      <w:r>
+        <w:rPr>
+          <w:rFonts w:ascii="Calibri" w:hAnsi="Calibri" w:cs="Calibri"/>
+          <w:color w:val="000000" w:themeColor="text1"/>
+        </w:rPr>
+        <w:t>A key design feature of the server is its channels</w:t>
+      </w:r>
+      <w:r>
+        <w:rPr>
+          <w:rFonts w:ascii="Calibri" w:hAnsi="Calibri" w:cs="Calibri"/>
+          <w:color w:val="000000" w:themeColor="text1"/>
+        </w:rPr>
+        <w:t>. T</w:t>
+      </w:r>
+      <w:r>
+        <w:rPr>
+          <w:rFonts w:ascii="Calibri" w:hAnsi="Calibri" w:cs="Calibri"/>
+          <w:color w:val="000000" w:themeColor="text1"/>
+        </w:rPr>
+        <w:t xml:space="preserve">he </w:t>
+      </w:r>
+      <w:r>
+        <w:rPr>
+          <w:rFonts w:ascii="Calibri" w:hAnsi="Calibri" w:cs="Calibri"/>
+          <w:color w:val="000000" w:themeColor="text1"/>
+        </w:rPr>
+        <w:t xml:space="preserve">SignalR channels are </w:t>
+      </w:r>
+      <w:r>
+        <w:rPr>
+          <w:rFonts w:ascii="Calibri" w:hAnsi="Calibri" w:cs="Calibri"/>
+          <w:color w:val="000000" w:themeColor="text1"/>
+        </w:rPr>
+        <w:t>organised firstly</w:t>
+      </w:r>
+      <w:r>
+        <w:rPr>
+          <w:rFonts w:ascii="Calibri" w:hAnsi="Calibri" w:cs="Calibri"/>
+          <w:color w:val="000000" w:themeColor="text1"/>
+        </w:rPr>
+        <w:t xml:space="preserve"> by county and</w:t>
+      </w:r>
+      <w:r>
+        <w:rPr>
+          <w:rFonts w:ascii="Calibri" w:hAnsi="Calibri" w:cs="Calibri"/>
+          <w:color w:val="000000" w:themeColor="text1"/>
+        </w:rPr>
+        <w:t xml:space="preserve"> then by constituency. This channel structure is designed to speed up finding a channel, making connections faster. This organisation also can be used </w:t>
+      </w:r>
+      <w:r>
+        <w:rPr>
+          <w:rFonts w:ascii="Calibri" w:hAnsi="Calibri" w:cs="Calibri"/>
+          <w:color w:val="000000" w:themeColor="text1"/>
+        </w:rPr>
+        <w:t xml:space="preserve">to assign more server power to certain </w:t>
+      </w:r>
+      <w:r>
+        <w:rPr>
+          <w:rFonts w:ascii="Calibri" w:hAnsi="Calibri" w:cs="Calibri"/>
+          <w:color w:val="000000" w:themeColor="text1"/>
+        </w:rPr>
+        <w:lastRenderedPageBreak/>
+        <w:t xml:space="preserve">counties with a high number of </w:t>
+      </w:r>
+      <w:r>
+        <w:rPr>
+          <w:rFonts w:ascii="Calibri" w:hAnsi="Calibri" w:cs="Calibri"/>
+          <w:color w:val="000000" w:themeColor="text1"/>
+        </w:rPr>
+        <w:t>connections, as</w:t>
+      </w:r>
+      <w:r>
+        <w:rPr>
+          <w:rFonts w:ascii="Calibri" w:hAnsi="Calibri" w:cs="Calibri"/>
+          <w:color w:val="000000" w:themeColor="text1"/>
+        </w:rPr>
+        <w:t xml:space="preserve"> a higher population a county might need more polling stations than others. </w:t>
+      </w:r>
+      <w:r>
+        <w:rPr>
+          <w:rFonts w:ascii="Calibri" w:hAnsi="Calibri" w:cs="Calibri"/>
+          <w:color w:val="000000" w:themeColor="text1"/>
+        </w:rPr>
+        <w:t>This supports scalability, as system load can be distributed geographically without requiring architectural changes.</w:t>
+      </w:r>
+    </w:p>
+    <w:p>
+      <w:pPr>
+        <w:rPr>
+          <w:rFonts w:ascii="Calibri" w:hAnsi="Calibri" w:cs="Calibri"/>
+          <w:color w:val="000000" w:themeColor="text1"/>
+        </w:rPr>
+      </w:pPr>
+      <w:r>
+        <w:rPr>
+          <w:rFonts w:ascii="Calibri" w:hAnsi="Calibri" w:cs="Calibri"/>
+          <w:color w:val="000000" w:themeColor="text1"/>
+        </w:rPr>
+        <w:t>The active election configuration is hardcoded in the current implementation. While a dynamic configuration system would provide greater flexibility, it introduces a risk of accidental or malicious modification</w:t>
+      </w:r>
+      <w:r>
+        <w:rPr>
+          <w:rFonts w:ascii="Calibri" w:hAnsi="Calibri" w:cs="Calibri"/>
+          <w:color w:val="000000" w:themeColor="text1"/>
+        </w:rPr>
+        <w:t xml:space="preserve"> to negate election results</w:t>
+      </w:r>
+      <w:r>
+        <w:rPr>
+          <w:rFonts w:ascii="Calibri" w:hAnsi="Calibri" w:cs="Calibri"/>
+          <w:color w:val="000000" w:themeColor="text1"/>
+        </w:rPr>
+        <w:t>. Hardcoding removes this risk and ensures changes require deliberate redeployment.</w:t>
+      </w:r>
+    </w:p>
+    <w:p>
+      <w:pPr>
+        <w:rPr>
+          <w:rFonts w:ascii="Calibri" w:hAnsi="Calibri" w:cs="Calibri"/>
+          <w:color w:val="000000" w:themeColor="text1"/>
+        </w:rPr>
+      </w:pPr>
+    </w:p>
+    <w:p>
+      <w:pPr>
+        <w:rPr>
+          <w:rFonts w:ascii="Calibri" w:hAnsi="Calibri" w:cs="Calibri"/>
+          <w:color w:val="000000" w:themeColor="text1"/>
+        </w:rPr>
+      </w:pPr>
+    </w:p>
+    <w:p>
+      <w:pPr>
+        <w:rPr>
+          <w:rFonts w:ascii="Calibri" w:hAnsi="Calibri" w:cs="Calibri"/>
+          <w:color w:val="000000" w:themeColor="text1"/>
+        </w:rPr>
+      </w:pPr>
+    </w:p>
+    <w:p>
+      <w:pPr>
         <w:rPr>
           <w:rFonts w:ascii="Calibri" w:hAnsi="Calibri" w:cs="Calibri"/>
           <w:b/>
           <w:bCs/>
           <w:color w:val="000000" w:themeColor="text1"/>
         </w:rPr>
-        <w:t>4.2.2 Front End</w:t>
-      </w:r>
-    </w:p>
-    <w:p>
-      <w:pPr>
-        <w:rPr>
-          <w:rFonts w:ascii="Calibri" w:hAnsi="Calibri" w:cs="Calibri"/>
-          <w:color w:val="000000" w:themeColor="text1"/>
-        </w:rPr>
-      </w:pPr>
-      <w:r>
-        <w:rPr>
-          <w:rFonts w:ascii="Calibri" w:hAnsi="Calibri" w:cs="Calibri"/>
-          <w:color w:val="000000" w:themeColor="text1"/>
-        </w:rPr>
-        <w:t>Avalonia was elected as the front-end framework in this project.</w:t>
-      </w:r>
-      <w:r>
-        <w:rPr>
-          <w:rFonts w:ascii="Calibri" w:hAnsi="Calibri" w:cs="Calibri"/>
-          <w:color w:val="000000" w:themeColor="text1"/>
-        </w:rPr>
-        <w:t xml:space="preserve"> </w:t>
-      </w:r>
-      <w:r>
-        <w:rPr>
-          <w:rFonts w:ascii="Calibri" w:hAnsi="Calibri" w:cs="Calibri"/>
-          <w:color w:val="000000" w:themeColor="text1"/>
-        </w:rPr>
-        <w:t xml:space="preserve">Avalonia is a </w:t>
-      </w:r>
-      <w:r>
-        <w:rPr>
-          <w:rFonts w:ascii="Calibri" w:hAnsi="Calibri" w:cs="Calibri"/>
-          <w:color w:val="000000" w:themeColor="text1"/>
-        </w:rPr>
-        <w:t>cross</w:t>
-      </w:r>
-      <w:r>
-        <w:rPr>
-          <w:rFonts w:ascii="Calibri" w:hAnsi="Calibri" w:cs="Calibri"/>
-          <w:color w:val="000000" w:themeColor="text1"/>
-        </w:rPr>
-        <w:t>-platform</w:t>
-      </w:r>
-      <w:r>
-        <w:rPr>
-          <w:rFonts w:ascii="Calibri" w:hAnsi="Calibri" w:cs="Calibri"/>
-          <w:color w:val="000000" w:themeColor="text1"/>
-        </w:rPr>
-        <w:t xml:space="preserve"> User Interface</w:t>
-      </w:r>
-      <w:r>
-        <w:rPr>
-          <w:rFonts w:ascii="Calibri" w:hAnsi="Calibri" w:cs="Calibri"/>
-          <w:color w:val="000000" w:themeColor="text1"/>
-        </w:rPr>
-        <w:t xml:space="preserve"> </w:t>
-      </w:r>
-      <w:r>
-        <w:rPr>
-          <w:rFonts w:ascii="Calibri" w:hAnsi="Calibri" w:cs="Calibri"/>
-          <w:color w:val="000000" w:themeColor="text1"/>
-        </w:rPr>
-        <w:t>(</w:t>
-      </w:r>
-      <w:r>
-        <w:rPr>
-          <w:rFonts w:ascii="Calibri" w:hAnsi="Calibri" w:cs="Calibri"/>
-          <w:color w:val="000000" w:themeColor="text1"/>
-        </w:rPr>
-        <w:t>UI</w:t>
-      </w:r>
-      <w:r>
-        <w:rPr>
-          <w:rFonts w:ascii="Calibri" w:hAnsi="Calibri" w:cs="Calibri"/>
-          <w:color w:val="000000" w:themeColor="text1"/>
-        </w:rPr>
-        <w:t>)</w:t>
-      </w:r>
-      <w:r>
-        <w:rPr>
-          <w:rFonts w:ascii="Calibri" w:hAnsi="Calibri" w:cs="Calibri"/>
-          <w:color w:val="000000" w:themeColor="text1"/>
-        </w:rPr>
-        <w:t xml:space="preserve"> framework for .NET that supports multiple operating systems from a single codebase, reducing development complexity and ensuring compatibility with the chosen backend technologies [29].</w:t>
-      </w:r>
-    </w:p>
-    <w:p>
-      <w:pPr>
-        <w:rPr>
-          <w:rFonts w:ascii="Calibri" w:hAnsi="Calibri" w:cs="Calibri"/>
-          <w:color w:val="000000" w:themeColor="text1"/>
-        </w:rPr>
-      </w:pPr>
-      <w:r>
-        <w:rPr>
-          <w:rFonts w:ascii="Calibri" w:hAnsi="Calibri" w:cs="Calibri"/>
-          <w:color w:val="000000" w:themeColor="text1"/>
-        </w:rPr>
-        <w:t xml:space="preserve">Usability was a key design consideration, as the system is intended for use by both voters and polling officials. A simple and structured interface was adopted, incorporating guided inputs and constrained controls where possible. </w:t>
-      </w:r>
-      <w:r>
-        <w:rPr>
-          <w:rFonts w:ascii="Calibri" w:hAnsi="Calibri" w:cs="Calibri"/>
-          <w:color w:val="000000" w:themeColor="text1"/>
-        </w:rPr>
-        <w:t>This reduces user error and limits the range of acceptable input, which also contributes to reducing the system’s attack surface</w:t>
-      </w:r>
-      <w:r>
-        <w:rPr>
-          <w:rFonts w:ascii="Calibri" w:hAnsi="Calibri" w:cs="Calibri"/>
-          <w:color w:val="000000" w:themeColor="text1"/>
-        </w:rPr>
-        <w:t xml:space="preserve"> [</w:t>
-      </w:r>
-      <w:r>
-        <w:rPr>
-          <w:rFonts w:ascii="Calibri" w:hAnsi="Calibri" w:cs="Calibri"/>
-          <w:color w:val="000000" w:themeColor="text1"/>
-        </w:rPr>
-        <w:t>49</w:t>
-      </w:r>
-      <w:proofErr w:type="gramStart"/>
-      <w:r>
-        <w:rPr>
-          <w:rFonts w:ascii="Calibri" w:hAnsi="Calibri" w:cs="Calibri"/>
-          <w:color w:val="000000" w:themeColor="text1"/>
-        </w:rPr>
-        <w:t>]</w:t>
-      </w:r>
-      <w:r>
-        <w:rPr>
-          <w:rFonts w:ascii="Calibri" w:hAnsi="Calibri" w:cs="Calibri"/>
-          <w:color w:val="000000" w:themeColor="text1"/>
-        </w:rPr>
-        <w:t>.</w:t>
-      </w:r>
-      <w:r>
-        <w:rPr>
-          <w:rFonts w:ascii="Calibri" w:hAnsi="Calibri" w:cs="Calibri"/>
-          <w:color w:val="000000" w:themeColor="text1"/>
-        </w:rPr>
-        <w:t>*</w:t>
-      </w:r>
-      <w:proofErr w:type="gramEnd"/>
-    </w:p>
-    <w:p>
-      <w:pPr>
-        <w:rPr>
-          <w:rFonts w:ascii="Calibri" w:hAnsi="Calibri" w:cs="Calibri"/>
-          <w:color w:val="000000" w:themeColor="text1"/>
-        </w:rPr>
-      </w:pPr>
-    </w:p>
-    <w:p>
-      <w:pPr>
-        <w:rPr>
-          <w:rFonts w:ascii="Calibri" w:hAnsi="Calibri" w:cs="Calibri"/>
-          <w:color w:val="000000" w:themeColor="text1"/>
-        </w:rPr>
-      </w:pPr>
-    </w:p>
-    <w:p>
-      <w:pPr>
-        <w:rPr>
-          <w:rFonts w:ascii="Calibri" w:hAnsi="Calibri" w:cs="Calibri"/>
-          <w:color w:val="000000" w:themeColor="text1"/>
-        </w:rPr>
-      </w:pPr>
-    </w:p>
-    <w:p>
-      <w:pPr>
-        <w:rPr>
-          <w:rFonts w:ascii="Calibri" w:hAnsi="Calibri" w:cs="Calibri"/>
-          <w:color w:val="000000" w:themeColor="text1"/>
-        </w:rPr>
-      </w:pPr>
-    </w:p>
-    <w:p>
-      <w:pPr>
+      </w:pPr>
+      <w:r>
         <w:rPr>
           <w:rFonts w:ascii="Calibri" w:hAnsi="Calibri" w:cs="Calibri"/>
           <w:b/>
           <w:bCs/>
           <w:color w:val="000000" w:themeColor="text1"/>
         </w:rPr>
-      </w:pPr>
-      <w:r>
+        <w:t>4.2.2 Front End</w:t>
+      </w:r>
+    </w:p>
+    <w:p>
+      <w:pPr>
+        <w:rPr>
+          <w:rFonts w:ascii="Calibri" w:hAnsi="Calibri" w:cs="Calibri"/>
+          <w:color w:val="000000" w:themeColor="text1"/>
+        </w:rPr>
+      </w:pPr>
+      <w:r>
+        <w:rPr>
+          <w:rFonts w:ascii="Calibri" w:hAnsi="Calibri" w:cs="Calibri"/>
+          <w:color w:val="000000" w:themeColor="text1"/>
+        </w:rPr>
+        <w:t xml:space="preserve">Several </w:t>
+      </w:r>
+      <w:proofErr w:type="gramStart"/>
+      <w:r>
+        <w:rPr>
+          <w:rFonts w:ascii="Calibri" w:hAnsi="Calibri" w:cs="Calibri"/>
+          <w:color w:val="000000" w:themeColor="text1"/>
+        </w:rPr>
+        <w:t>front</w:t>
+      </w:r>
+      <w:r>
+        <w:rPr>
+          <w:rFonts w:ascii="Calibri" w:hAnsi="Calibri" w:cs="Calibri"/>
+          <w:color w:val="000000" w:themeColor="text1"/>
+        </w:rPr>
+        <w:t xml:space="preserve"> </w:t>
+      </w:r>
+      <w:r>
+        <w:rPr>
+          <w:rFonts w:ascii="Calibri" w:hAnsi="Calibri" w:cs="Calibri"/>
+          <w:color w:val="000000" w:themeColor="text1"/>
+        </w:rPr>
+        <w:t>end</w:t>
+      </w:r>
+      <w:proofErr w:type="gramEnd"/>
+      <w:r>
+        <w:rPr>
+          <w:rFonts w:ascii="Calibri" w:hAnsi="Calibri" w:cs="Calibri"/>
+          <w:color w:val="000000" w:themeColor="text1"/>
+        </w:rPr>
+        <w:t xml:space="preserve"> frameworks were evaluated </w:t>
+      </w:r>
+      <w:r>
+        <w:rPr>
+          <w:rFonts w:ascii="Calibri" w:hAnsi="Calibri" w:cs="Calibri"/>
+          <w:color w:val="000000" w:themeColor="text1"/>
+        </w:rPr>
+        <w:t>for this system</w:t>
+      </w:r>
+      <w:r>
+        <w:rPr>
+          <w:rFonts w:ascii="Calibri" w:hAnsi="Calibri" w:cs="Calibri"/>
+          <w:color w:val="000000" w:themeColor="text1"/>
+        </w:rPr>
+        <w:t xml:space="preserve">. WPF was rejected due to its </w:t>
+      </w:r>
+      <w:r>
+        <w:rPr>
+          <w:rFonts w:ascii="Calibri" w:hAnsi="Calibri" w:cs="Calibri"/>
+          <w:color w:val="000000" w:themeColor="text1"/>
+        </w:rPr>
+        <w:t xml:space="preserve">only being compatible with </w:t>
+      </w:r>
+      <w:r>
+        <w:rPr>
+          <w:rFonts w:ascii="Calibri" w:hAnsi="Calibri" w:cs="Calibri"/>
+          <w:color w:val="000000" w:themeColor="text1"/>
+        </w:rPr>
+        <w:t>Windows</w:t>
+      </w:r>
+      <w:r>
+        <w:rPr>
+          <w:rFonts w:ascii="Calibri" w:hAnsi="Calibri" w:cs="Calibri"/>
+          <w:color w:val="000000" w:themeColor="text1"/>
+        </w:rPr>
+        <w:t>,</w:t>
+      </w:r>
+      <w:r>
+        <w:rPr>
+          <w:rFonts w:ascii="Calibri" w:hAnsi="Calibri" w:cs="Calibri"/>
+          <w:color w:val="000000" w:themeColor="text1"/>
+        </w:rPr>
+        <w:t xml:space="preserve"> and MAUI was discounted as its Linux desktop support was not production</w:t>
+      </w:r>
+      <w:r>
+        <w:rPr>
+          <w:rFonts w:ascii="Calibri" w:hAnsi="Calibri" w:cs="Calibri"/>
+          <w:color w:val="000000" w:themeColor="text1"/>
+        </w:rPr>
+        <w:t xml:space="preserve"> </w:t>
+      </w:r>
+      <w:r>
+        <w:rPr>
+          <w:rFonts w:ascii="Calibri" w:hAnsi="Calibri" w:cs="Calibri"/>
+          <w:color w:val="000000" w:themeColor="text1"/>
+        </w:rPr>
+        <w:t xml:space="preserve">ready at the time of development. Avalonia was elected as the framework in this project. Avalonia is a </w:t>
+      </w:r>
+      <w:proofErr w:type="gramStart"/>
+      <w:r>
+        <w:rPr>
+          <w:rFonts w:ascii="Calibri" w:hAnsi="Calibri" w:cs="Calibri"/>
+          <w:color w:val="000000" w:themeColor="text1"/>
+        </w:rPr>
+        <w:t>cross</w:t>
+      </w:r>
+      <w:r>
+        <w:rPr>
+          <w:rFonts w:ascii="Calibri" w:hAnsi="Calibri" w:cs="Calibri"/>
+          <w:color w:val="000000" w:themeColor="text1"/>
+        </w:rPr>
+        <w:t xml:space="preserve"> </w:t>
+      </w:r>
+      <w:r>
+        <w:rPr>
+          <w:rFonts w:ascii="Calibri" w:hAnsi="Calibri" w:cs="Calibri"/>
+          <w:color w:val="000000" w:themeColor="text1"/>
+        </w:rPr>
+        <w:t>platform</w:t>
+      </w:r>
+      <w:proofErr w:type="gramEnd"/>
+      <w:r>
+        <w:rPr>
+          <w:rFonts w:ascii="Calibri" w:hAnsi="Calibri" w:cs="Calibri"/>
+          <w:color w:val="000000" w:themeColor="text1"/>
+        </w:rPr>
+        <w:t xml:space="preserve"> User Interface (UI) framework for .NET that supports multiple operating systems from a single codebase, reducing development complexity and ensuring compatibility with the chosen backend technologies [29].</w:t>
+      </w:r>
+    </w:p>
+    <w:p>
+      <w:pPr>
+        <w:rPr>
+          <w:rFonts w:ascii="Calibri" w:hAnsi="Calibri" w:cs="Calibri"/>
+          <w:color w:val="000000" w:themeColor="text1"/>
+        </w:rPr>
+      </w:pPr>
+      <w:r>
+        <w:rPr>
+          <w:rFonts w:ascii="Calibri" w:hAnsi="Calibri" w:cs="Calibri"/>
+          <w:color w:val="000000" w:themeColor="text1"/>
+        </w:rPr>
+        <w:t>Alongside Avalonia, the researcher adopted the Model-View-</w:t>
+      </w:r>
+      <w:proofErr w:type="spellStart"/>
+      <w:r>
+        <w:rPr>
+          <w:rFonts w:ascii="Calibri" w:hAnsi="Calibri" w:cs="Calibri"/>
+          <w:color w:val="000000" w:themeColor="text1"/>
+        </w:rPr>
+        <w:t>ViewModel</w:t>
+      </w:r>
+      <w:proofErr w:type="spellEnd"/>
+      <w:r>
+        <w:rPr>
+          <w:rFonts w:ascii="Calibri" w:hAnsi="Calibri" w:cs="Calibri"/>
+          <w:color w:val="000000" w:themeColor="text1"/>
+        </w:rPr>
+        <w:t xml:space="preserve"> (MVVM) architectural pattern to structure the </w:t>
+      </w:r>
+      <w:proofErr w:type="gramStart"/>
+      <w:r>
+        <w:rPr>
+          <w:rFonts w:ascii="Calibri" w:hAnsi="Calibri" w:cs="Calibri"/>
+          <w:color w:val="000000" w:themeColor="text1"/>
+        </w:rPr>
+        <w:t>front end</w:t>
+      </w:r>
+      <w:proofErr w:type="gramEnd"/>
+      <w:r>
+        <w:rPr>
+          <w:rFonts w:ascii="Calibri" w:hAnsi="Calibri" w:cs="Calibri"/>
+          <w:color w:val="000000" w:themeColor="text1"/>
+        </w:rPr>
+        <w:t xml:space="preserve"> codebase. MVVM enforces a clear separation between the user interface (View), the application logic (</w:t>
+      </w:r>
+      <w:proofErr w:type="spellStart"/>
+      <w:r>
+        <w:rPr>
+          <w:rFonts w:ascii="Calibri" w:hAnsi="Calibri" w:cs="Calibri"/>
+          <w:color w:val="000000" w:themeColor="text1"/>
+        </w:rPr>
+        <w:t>ViewModel</w:t>
+      </w:r>
+      <w:proofErr w:type="spellEnd"/>
+      <w:r>
+        <w:rPr>
+          <w:rFonts w:ascii="Calibri" w:hAnsi="Calibri" w:cs="Calibri"/>
+          <w:color w:val="000000" w:themeColor="text1"/>
+        </w:rPr>
+        <w:t xml:space="preserve">), and the underlying data (Model). This separation was particularly beneficial in this project as it allowed the UI to be developed and modified independently of the logic, which proved valuable during the redesign phases driven by user feedback. Avalonia's native support for data binding made MVVM a natural fit, as </w:t>
+      </w:r>
+      <w:proofErr w:type="spellStart"/>
+      <w:r>
+        <w:rPr>
+          <w:rFonts w:ascii="Calibri" w:hAnsi="Calibri" w:cs="Calibri"/>
+          <w:color w:val="000000" w:themeColor="text1"/>
+        </w:rPr>
+        <w:t>ViewModels</w:t>
+      </w:r>
+      <w:proofErr w:type="spellEnd"/>
+      <w:r>
+        <w:rPr>
+          <w:rFonts w:ascii="Calibri" w:hAnsi="Calibri" w:cs="Calibri"/>
+          <w:color w:val="000000" w:themeColor="text1"/>
+        </w:rPr>
+        <w:t xml:space="preserve"> could expose properties and commands that the View binds to directly, reducing the need for code</w:t>
+      </w:r>
+      <w:r>
+        <w:rPr>
+          <w:rFonts w:ascii="Calibri" w:hAnsi="Calibri" w:cs="Calibri"/>
+          <w:color w:val="000000" w:themeColor="text1"/>
+        </w:rPr>
+        <w:t xml:space="preserve"> </w:t>
+      </w:r>
+      <w:r>
+        <w:rPr>
+          <w:rFonts w:ascii="Calibri" w:hAnsi="Calibri" w:cs="Calibri"/>
+          <w:color w:val="000000" w:themeColor="text1"/>
+        </w:rPr>
+        <w:t>behind and keeping the interface logic clean and testable.</w:t>
+      </w:r>
+    </w:p>
+    <w:p>
+      <w:pPr>
+        <w:rPr>
+          <w:rFonts w:ascii="Calibri" w:hAnsi="Calibri" w:cs="Calibri"/>
+          <w:color w:val="000000" w:themeColor="text1"/>
+        </w:rPr>
+      </w:pPr>
+      <w:r>
+        <w:rPr>
+          <w:rFonts w:ascii="Calibri" w:hAnsi="Calibri" w:cs="Calibri"/>
+          <w:color w:val="000000" w:themeColor="text1"/>
+        </w:rPr>
+        <w:t xml:space="preserve">Usability was a key design consideration, as the system is intended for </w:t>
+      </w:r>
+      <w:r>
+        <w:rPr>
+          <w:rFonts w:ascii="Calibri" w:hAnsi="Calibri" w:cs="Calibri"/>
+          <w:color w:val="000000" w:themeColor="text1"/>
+        </w:rPr>
+        <w:t>use across the UK’s population ranging from all technical ability</w:t>
+      </w:r>
+      <w:r>
+        <w:rPr>
+          <w:rFonts w:ascii="Calibri" w:hAnsi="Calibri" w:cs="Calibri"/>
+          <w:color w:val="000000" w:themeColor="text1"/>
+        </w:rPr>
+        <w:t xml:space="preserve">. To support this, a simple and structured interface was </w:t>
+      </w:r>
+      <w:r>
+        <w:rPr>
+          <w:rFonts w:ascii="Calibri" w:hAnsi="Calibri" w:cs="Calibri"/>
+          <w:color w:val="000000" w:themeColor="text1"/>
+        </w:rPr>
+        <w:t>designed</w:t>
+      </w:r>
+      <w:r>
+        <w:rPr>
+          <w:rFonts w:ascii="Calibri" w:hAnsi="Calibri" w:cs="Calibri"/>
+          <w:color w:val="000000" w:themeColor="text1"/>
+        </w:rPr>
+        <w:t>, incorporating guided inputs and constrained controls where possible. This approach reduces user error and limits the range of acceptable input, which also contributes to minimising the system’s attack surface [49].</w:t>
+      </w:r>
+    </w:p>
+    <w:p>
+      <w:pPr>
+        <w:rPr>
+          <w:rFonts w:ascii="Calibri" w:hAnsi="Calibri" w:cs="Calibri"/>
+          <w:color w:val="000000" w:themeColor="text1"/>
+        </w:rPr>
+      </w:pPr>
+      <w:r>
+        <w:rPr>
+          <w:rFonts w:ascii="Calibri" w:hAnsi="Calibri" w:cs="Calibri"/>
+          <w:color w:val="000000" w:themeColor="text1"/>
+        </w:rPr>
+        <w:t>At the initial design stage, two key aspects guided the development process. The first was to create an intuitive user interface (UI) that is accessible to users of all ages. The second was to minimise user input in order to reduce the system’s attack surface.</w:t>
+      </w:r>
+      <w:r>
+        <w:rPr>
+          <w:rFonts w:ascii="Calibri" w:hAnsi="Calibri" w:cs="Calibri"/>
+          <w:color w:val="000000" w:themeColor="text1"/>
+        </w:rPr>
+        <w:t xml:space="preserve"> </w:t>
+      </w:r>
+      <w:r>
+        <w:rPr>
+          <w:rFonts w:ascii="Calibri" w:hAnsi="Calibri" w:cs="Calibri"/>
+          <w:color w:val="000000" w:themeColor="text1"/>
+        </w:rPr>
+        <w:t>To support these goals, high</w:t>
+      </w:r>
+      <w:r>
+        <w:rPr>
+          <w:rFonts w:ascii="Calibri" w:hAnsi="Calibri" w:cs="Calibri"/>
+          <w:color w:val="000000" w:themeColor="text1"/>
+        </w:rPr>
+        <w:t xml:space="preserve"> </w:t>
+      </w:r>
+      <w:r>
+        <w:rPr>
+          <w:rFonts w:ascii="Calibri" w:hAnsi="Calibri" w:cs="Calibri"/>
+          <w:color w:val="000000" w:themeColor="text1"/>
+        </w:rPr>
+        <w:t xml:space="preserve">fidelity </w:t>
+      </w:r>
+      <w:r>
+        <w:rPr>
+          <w:rFonts w:ascii="Calibri" w:hAnsi="Calibri" w:cs="Calibri"/>
+          <w:color w:val="000000" w:themeColor="text1"/>
+        </w:rPr>
+        <w:t>mock</w:t>
+      </w:r>
+      <w:r>
+        <w:rPr>
+          <w:rFonts w:ascii="Calibri" w:hAnsi="Calibri" w:cs="Calibri"/>
+          <w:color w:val="000000" w:themeColor="text1"/>
+        </w:rPr>
+        <w:t xml:space="preserve"> </w:t>
+      </w:r>
+      <w:r>
+        <w:rPr>
+          <w:rFonts w:ascii="Calibri" w:hAnsi="Calibri" w:cs="Calibri"/>
+          <w:color w:val="000000" w:themeColor="text1"/>
+        </w:rPr>
+        <w:t>ups</w:t>
+      </w:r>
+      <w:r>
+        <w:rPr>
+          <w:rFonts w:ascii="Calibri" w:hAnsi="Calibri" w:cs="Calibri"/>
+          <w:color w:val="000000" w:themeColor="text1"/>
+        </w:rPr>
+        <w:t xml:space="preserve"> of both the voter and official application were produced. These were hand</w:t>
+      </w:r>
+      <w:r>
+        <w:rPr>
+          <w:rFonts w:ascii="Calibri" w:hAnsi="Calibri" w:cs="Calibri"/>
+          <w:color w:val="000000" w:themeColor="text1"/>
+        </w:rPr>
+        <w:t xml:space="preserve"> d</w:t>
+      </w:r>
+      <w:r>
+        <w:rPr>
+          <w:rFonts w:ascii="Calibri" w:hAnsi="Calibri" w:cs="Calibri"/>
+          <w:color w:val="000000" w:themeColor="text1"/>
+        </w:rPr>
+        <w:t>rawn on an iPad using Notability and are included in Appendix A.</w:t>
+      </w:r>
+    </w:p>
+    <w:p>
+      <w:pPr>
+        <w:rPr>
+          <w:rFonts w:ascii="Calibri" w:hAnsi="Calibri" w:cs="Calibri"/>
+          <w:color w:val="000000" w:themeColor="text1"/>
+        </w:rPr>
+      </w:pPr>
+      <w:r>
+        <w:rPr>
+          <w:rFonts w:ascii="Calibri" w:hAnsi="Calibri" w:cs="Calibri"/>
+          <w:color w:val="000000" w:themeColor="text1"/>
+        </w:rPr>
+        <w:t xml:space="preserve">The design of the </w:t>
+      </w:r>
+      <w:r>
+        <w:rPr>
+          <w:rFonts w:ascii="Calibri" w:hAnsi="Calibri" w:cs="Calibri"/>
+          <w:color w:val="000000" w:themeColor="text1"/>
+        </w:rPr>
+        <w:t>mock</w:t>
+      </w:r>
+      <w:r>
+        <w:rPr>
+          <w:rFonts w:ascii="Calibri" w:hAnsi="Calibri" w:cs="Calibri"/>
+          <w:color w:val="000000" w:themeColor="text1"/>
+        </w:rPr>
+        <w:t xml:space="preserve"> </w:t>
+      </w:r>
+      <w:r>
+        <w:rPr>
+          <w:rFonts w:ascii="Calibri" w:hAnsi="Calibri" w:cs="Calibri"/>
+          <w:color w:val="000000" w:themeColor="text1"/>
+        </w:rPr>
+        <w:t>ups</w:t>
+      </w:r>
+      <w:r>
+        <w:rPr>
+          <w:rFonts w:ascii="Calibri" w:hAnsi="Calibri" w:cs="Calibri"/>
+          <w:color w:val="000000" w:themeColor="text1"/>
+        </w:rPr>
+        <w:t xml:space="preserve"> followed the defined user stories (Appendix B), ensuring that the researcher remained focused on the system’s intended functionality while developing a </w:t>
+      </w:r>
+      <w:proofErr w:type="gramStart"/>
+      <w:r>
+        <w:rPr>
+          <w:rFonts w:ascii="Calibri" w:hAnsi="Calibri" w:cs="Calibri"/>
+          <w:color w:val="000000" w:themeColor="text1"/>
+        </w:rPr>
+        <w:t>user</w:t>
+      </w:r>
+      <w:r>
+        <w:rPr>
+          <w:rFonts w:ascii="Calibri" w:hAnsi="Calibri" w:cs="Calibri"/>
+          <w:color w:val="000000" w:themeColor="text1"/>
+        </w:rPr>
+        <w:t xml:space="preserve"> </w:t>
+      </w:r>
+      <w:r>
+        <w:rPr>
+          <w:rFonts w:ascii="Calibri" w:hAnsi="Calibri" w:cs="Calibri"/>
+          <w:color w:val="000000" w:themeColor="text1"/>
+        </w:rPr>
+        <w:t>friendly</w:t>
+      </w:r>
+      <w:proofErr w:type="gramEnd"/>
+      <w:r>
+        <w:rPr>
+          <w:rFonts w:ascii="Calibri" w:hAnsi="Calibri" w:cs="Calibri"/>
+          <w:color w:val="000000" w:themeColor="text1"/>
+        </w:rPr>
+        <w:t xml:space="preserve"> interface. However, the first round of user surveys revealed several usability issues within the UI. In particular, the interface shown in Figure X was consistently identified by participants as complex, unclear, and visually cluttered. Based on this feedback, the researcher simplified this view.</w:t>
+      </w:r>
+    </w:p>
+    <w:p>
+      <w:pPr>
+        <w:rPr>
+          <w:rFonts w:ascii="Calibri" w:hAnsi="Calibri" w:cs="Calibri"/>
+          <w:color w:val="000000" w:themeColor="text1"/>
+        </w:rPr>
+      </w:pPr>
+      <w:r>
+        <w:rPr>
+          <w:rFonts w:ascii="Calibri" w:hAnsi="Calibri" w:cs="Calibri"/>
+          <w:color w:val="000000" w:themeColor="text1"/>
+        </w:rPr>
+        <w:t xml:space="preserve">Although the initial revisions focused primarily on improving Figure X, feedback from </w:t>
+      </w:r>
+      <w:r>
+        <w:rPr>
+          <w:rFonts w:ascii="Calibri" w:hAnsi="Calibri" w:cs="Calibri"/>
+          <w:color w:val="000000" w:themeColor="text1"/>
+        </w:rPr>
+        <w:t>the second round of surveys</w:t>
+      </w:r>
+      <w:r>
+        <w:rPr>
+          <w:rFonts w:ascii="Calibri" w:hAnsi="Calibri" w:cs="Calibri"/>
+          <w:color w:val="000000" w:themeColor="text1"/>
+        </w:rPr>
+        <w:t xml:space="preserve"> highlighted broader concerns regarding the </w:t>
+      </w:r>
+      <w:r>
+        <w:rPr>
+          <w:rFonts w:ascii="Calibri" w:hAnsi="Calibri" w:cs="Calibri"/>
+          <w:color w:val="000000" w:themeColor="text1"/>
+        </w:rPr>
+        <w:t xml:space="preserve">not yet styled </w:t>
+      </w:r>
+      <w:r>
+        <w:rPr>
+          <w:rFonts w:ascii="Calibri" w:hAnsi="Calibri" w:cs="Calibri"/>
+          <w:color w:val="000000" w:themeColor="text1"/>
+        </w:rPr>
+        <w:t xml:space="preserve">and inconsistent </w:t>
+      </w:r>
+      <w:r>
+        <w:rPr>
+          <w:rFonts w:ascii="Calibri" w:hAnsi="Calibri" w:cs="Calibri"/>
+          <w:color w:val="000000" w:themeColor="text1"/>
+        </w:rPr>
+        <w:lastRenderedPageBreak/>
+        <w:t>appearance of the interface. As a result, a more comprehensive redesign of the entire system was undertaken</w:t>
+      </w:r>
+      <w:r>
+        <w:rPr>
+          <w:rFonts w:ascii="Calibri" w:hAnsi="Calibri" w:cs="Calibri"/>
+          <w:color w:val="000000" w:themeColor="text1"/>
+        </w:rPr>
+        <w:t xml:space="preserve"> by the researcher using feedback from the surveys. </w:t>
+      </w:r>
+    </w:p>
+    <w:p>
+      <w:pPr>
+        <w:jc w:val="center"/>
+        <w:rPr>
+          <w:rFonts w:ascii="Calibri" w:hAnsi="Calibri" w:cs="Calibri"/>
+          <w:color w:val="000000" w:themeColor="text1"/>
+        </w:rPr>
+      </w:pPr>
+      <w:r>
+        <w:rPr>
+          <w:noProof/>
+        </w:rPr>
+        <w:drawing>
+          <wp:inline distT="0" distB="0" distL="0" distR="0" wp14:anchorId="71752F0A" wp14:editId="4CA049ED">
+            <wp:extent cx="3638035" cy="2099145"/>
+            <wp:effectExtent l="0" t="0" r="635" b="0"/>
+            <wp:docPr id="1611841637" name="Picture 2"/>
+            <wp:cNvGraphicFramePr>
+              <a:graphicFrameLocks xmlns:a="http://schemas.openxmlformats.org/drawingml/2006/main" noChangeAspect="1"/>
+            </wp:cNvGraphicFramePr>
+            <a:graphic xmlns:a="http://schemas.openxmlformats.org/drawingml/2006/main">
+              <a:graphicData uri="http://schemas.openxmlformats.org/drawingml/2006/picture">
+                <pic:pic xmlns:pic="http://schemas.openxmlformats.org/drawingml/2006/picture">
+                  <pic:nvPicPr>
+                    <pic:cNvPr id="0" name="Picture 8"/>
+                    <pic:cNvPicPr>
+                      <a:picLocks noChangeAspect="1" noChangeArrowheads="1"/>
+                    </pic:cNvPicPr>
+                  </pic:nvPicPr>
+                  <pic:blipFill>
+                    <a:blip r:embed="rId8" cstate="print">
+                      <a:extLst>
+                        <a:ext uri="{28A0092B-C50C-407E-A947-70E740481C1C}">
+                          <a14:useLocalDpi xmlns:a14="http://schemas.microsoft.com/office/drawing/2010/main" val="0"/>
+                        </a:ext>
+                      </a:extLst>
+                    </a:blip>
+                    <a:srcRect/>
+                    <a:stretch>
+                      <a:fillRect/>
+                    </a:stretch>
+                  </pic:blipFill>
+                  <pic:spPr bwMode="auto">
+                    <a:xfrm>
+                      <a:off x="0" y="0"/>
+                      <a:ext cx="3684409" cy="2125903"/>
+                    </a:xfrm>
+                    <a:prstGeom prst="rect">
+                      <a:avLst/>
+                    </a:prstGeom>
+                    <a:noFill/>
+                    <a:ln>
+                      <a:noFill/>
+                    </a:ln>
+                  </pic:spPr>
+                </pic:pic>
+              </a:graphicData>
+            </a:graphic>
+          </wp:inline>
+        </w:drawing>
+      </w:r>
+    </w:p>
+    <w:p>
+      <w:pPr>
+        <w:jc w:val="center"/>
+        <w:rPr>
+          <w:rFonts w:ascii="Calibri" w:hAnsi="Calibri" w:cs="Calibri"/>
+          <w:color w:val="000000" w:themeColor="text1"/>
+        </w:rPr>
+      </w:pPr>
+      <w:r>
+        <w:rPr>
+          <w:rFonts w:ascii="Calibri" w:hAnsi="Calibri" w:cs="Calibri"/>
+          <w:color w:val="000000" w:themeColor="text1"/>
+        </w:rPr>
+        <w:t>Figure X Official Polling Station Management Screen</w:t>
+      </w:r>
+    </w:p>
+    <w:p>
+      <w:pPr>
+        <w:jc w:val="center"/>
+        <w:rPr>
+          <w:rFonts w:ascii="Calibri" w:hAnsi="Calibri" w:cs="Calibri"/>
+          <w:color w:val="000000" w:themeColor="text1"/>
+        </w:rPr>
+      </w:pPr>
+    </w:p>
+    <w:p>
+      <w:pPr>
+        <w:jc w:val="center"/>
+        <w:rPr>
+          <w:rFonts w:ascii="Calibri" w:hAnsi="Calibri" w:cs="Calibri"/>
+          <w:color w:val="000000" w:themeColor="text1"/>
+        </w:rPr>
+      </w:pPr>
+    </w:p>
+    <w:p>
+      <w:pPr>
+        <w:jc w:val="center"/>
+        <w:rPr>
+          <w:rFonts w:ascii="Calibri" w:hAnsi="Calibri" w:cs="Calibri"/>
+          <w:color w:val="000000" w:themeColor="text1"/>
+        </w:rPr>
+      </w:pPr>
+    </w:p>
+    <w:p>
+      <w:pPr>
         <w:rPr>
           <w:rFonts w:ascii="Calibri" w:hAnsi="Calibri" w:cs="Calibri"/>
           <w:b/>
           <w:bCs/>
           <w:color w:val="000000" w:themeColor="text1"/>
         </w:rPr>
-        <w:lastRenderedPageBreak/>
+      </w:pPr>
+      <w:r>
+        <w:rPr>
+          <w:rFonts w:ascii="Calibri" w:hAnsi="Calibri" w:cs="Calibri"/>
+          <w:b/>
+          <w:bCs/>
+          <w:color w:val="000000" w:themeColor="text1"/>
+        </w:rPr>
         <w:t>4.2.3 Database</w:t>
       </w:r>
     </w:p>
@@ -6587,6 +7052,7 @@
         </w:rPr>
         <w:t xml:space="preserve">Entity Framework Core (EF Core) was used as the Object Relational Mapper, allowing interaction with the database through </w:t>
       </w:r>
+      <w:proofErr w:type="gramStart"/>
       <w:r>
         <w:rPr>
           <w:rFonts w:ascii="Calibri" w:hAnsi="Calibri" w:cs="Calibri"/>
@@ -6599,8 +7065,16 @@
           <w:rFonts w:ascii="Calibri" w:hAnsi="Calibri" w:cs="Calibri"/>
           <w:color w:val="000000" w:themeColor="text1"/>
         </w:rPr>
-        <w:t>-oriented</w:t>
-      </w:r>
+        <w:t xml:space="preserve"> </w:t>
+      </w:r>
+      <w:r>
+        <w:rPr>
+          <w:rFonts w:ascii="Calibri" w:hAnsi="Calibri" w:cs="Calibri"/>
+          <w:color w:val="000000" w:themeColor="text1"/>
+        </w:rPr>
+        <w:t>oriented</w:t>
+      </w:r>
+      <w:proofErr w:type="gramEnd"/>
       <w:r>
         <w:rPr>
           <w:rFonts w:ascii="Calibri" w:hAnsi="Calibri" w:cs="Calibri"/>
@@ -6684,11 +7158,13 @@
           <w:rFonts w:ascii="Calibri" w:hAnsi="Calibri" w:cs="Calibri"/>
           <w:color w:val="000000" w:themeColor="text1"/>
         </w:rPr>
+        <w:lastRenderedPageBreak/>
         <w:br/>
       </w:r>
       <w:r>
         <w:rPr>
           <w:rFonts w:ascii="Calibri" w:hAnsi="Calibri" w:cs="Calibri"/>
+          <w:noProof/>
           <w:color w:val="000000" w:themeColor="text1"/>
         </w:rPr>
         <w:drawing>
@@ -6707,7 +7183,7 @@
                     <pic:cNvPicPr/>
                   </pic:nvPicPr>
                   <pic:blipFill>
-                    <a:blip r:embed="rId6"/>
+                    <a:blip r:embed="rId9"/>
                     <a:stretch>
                       <a:fillRect/>
                     </a:stretch>
@@ -7046,7 +7522,7 @@
           <w:bCs/>
           <w:color w:val="000000" w:themeColor="text1"/>
         </w:rPr>
-        <w:t>5</w:t>
+        <w:t>4</w:t>
       </w:r>
       <w:r>
         <w:rPr>
@@ -7120,15 +7596,7 @@
           <w:rFonts w:ascii="Calibri" w:hAnsi="Calibri" w:cs="Calibri"/>
           <w:color w:val="000000" w:themeColor="text1"/>
         </w:rPr>
-        <w:t xml:space="preserve">This separation ensures the database is not directly exposed to the public internet, as the </w:t>
-      </w:r>
-      <w:r>
-        <w:rPr>
-          <w:rFonts w:ascii="Calibri" w:hAnsi="Calibri" w:cs="Calibri"/>
-          <w:color w:val="000000" w:themeColor="text1"/>
-        </w:rPr>
-        <w:lastRenderedPageBreak/>
-        <w:t>server instance’s elastic IP is the only entity permitted to communicate with it, enforced through security group rules [53]. This approach significantly reduces the system’s attack surface.</w:t>
+        <w:t>This separation ensures the database is not directly exposed to the public internet, as the server instance’s elastic IP is the only entity permitted to communicate with it, enforced through security group rules [53]. This approach significantly reduces the system’s attack surface.</w:t>
       </w:r>
     </w:p>
     <w:p>
@@ -7193,27 +7661,41 @@
           <w:rFonts w:ascii="Calibri" w:hAnsi="Calibri" w:cs="Calibri"/>
           <w:color w:val="000000" w:themeColor="text1"/>
         </w:rPr>
+        <w:t xml:space="preserve"> </w:t>
+      </w:r>
+      <w:r>
+        <w:rPr>
+          <w:rFonts w:ascii="Calibri" w:hAnsi="Calibri" w:cs="Calibri"/>
+          <w:color w:val="000000" w:themeColor="text1"/>
+        </w:rPr>
+        <w:tab/>
+      </w:r>
+      <w:r>
+        <w:rPr>
+          <w:rFonts w:ascii="Calibri" w:hAnsi="Calibri" w:cs="Calibri"/>
+          <w:color w:val="000000" w:themeColor="text1"/>
+        </w:rPr>
         <w:br/>
       </w:r>
-      <w:r>
+    </w:p>
+    <w:p>
+      <w:pPr>
         <w:rPr>
           <w:rFonts w:ascii="Calibri" w:hAnsi="Calibri" w:cs="Calibri"/>
           <w:b/>
           <w:bCs/>
           <w:color w:val="000000" w:themeColor="text1"/>
         </w:rPr>
-        <w:t xml:space="preserve">NEED AWS REFRENCES </w:t>
-      </w:r>
-    </w:p>
-    <w:p>
-      <w:pPr>
+      </w:pPr>
+      <w:r>
         <w:rPr>
           <w:rFonts w:ascii="Calibri" w:hAnsi="Calibri" w:cs="Calibri"/>
           <w:b/>
           <w:bCs/>
           <w:color w:val="000000" w:themeColor="text1"/>
         </w:rPr>
-      </w:pPr>
+        <w:t>4.2.</w:t>
+      </w:r>
       <w:r>
         <w:rPr>
           <w:rFonts w:ascii="Calibri" w:hAnsi="Calibri" w:cs="Calibri"/>
@@ -7221,7 +7703,7 @@
           <w:bCs/>
           <w:color w:val="000000" w:themeColor="text1"/>
         </w:rPr>
-        <w:t>4.2.</w:t>
+        <w:t>5</w:t>
       </w:r>
       <w:r>
         <w:rPr>
@@ -7230,15 +7712,6 @@
           <w:bCs/>
           <w:color w:val="000000" w:themeColor="text1"/>
         </w:rPr>
-        <w:t>6</w:t>
-      </w:r>
-      <w:r>
-        <w:rPr>
-          <w:rFonts w:ascii="Calibri" w:hAnsi="Calibri" w:cs="Calibri"/>
-          <w:b/>
-          <w:bCs/>
-          <w:color w:val="000000" w:themeColor="text1"/>
-        </w:rPr>
         <w:t xml:space="preserve"> Biometric Hardware and Matching</w:t>
       </w:r>
     </w:p>
@@ -7283,6 +7756,7 @@
           <w:rFonts w:ascii="Calibri" w:hAnsi="Calibri" w:cs="Calibri"/>
           <w:color w:val="000000" w:themeColor="text1"/>
         </w:rPr>
+        <w:lastRenderedPageBreak/>
         <w:t xml:space="preserve">Due to hardware limitations, the device outputs images in PNG format rather than standard biometric </w:t>
       </w:r>
       <w:r>
@@ -7571,7 +8045,7 @@
                     </pic:cNvPicPr>
                   </pic:nvPicPr>
                   <pic:blipFill>
-                    <a:blip r:embed="rId7" cstate="print">
+                    <a:blip r:embed="rId10" cstate="print">
                       <a:extLst>
                         <a:ext uri="{28A0092B-C50C-407E-A947-70E740481C1C}">
                           <a14:useLocalDpi xmlns:a14="http://schemas.microsoft.com/office/drawing/2010/main" val="0"/>
@@ -7602,6 +8076,7 @@
     </w:p>
     <w:p>
       <w:pPr>
+        <w:jc w:val="center"/>
         <w:rPr>
           <w:rFonts w:ascii="Calibri" w:hAnsi="Calibri" w:cs="Calibri"/>
           <w:color w:val="000000" w:themeColor="text1"/>
@@ -7619,8 +8094,67 @@
           <w:rFonts w:ascii="Calibri" w:hAnsi="Calibri" w:cs="Calibri"/>
           <w:color w:val="000000" w:themeColor="text1"/>
         </w:rPr>
-        <w:t>features of fingerprints.</w:t>
-      </w:r>
+        <w:t>features of fingerprints</w:t>
+      </w:r>
+      <w:r>
+        <w:rPr>
+          <w:rFonts w:ascii="Calibri" w:hAnsi="Calibri" w:cs="Calibri"/>
+          <w:color w:val="000000" w:themeColor="text1"/>
+        </w:rPr>
+        <w:t xml:space="preserve"> [55].</w:t>
+      </w:r>
+    </w:p>
+    <w:p>
+      <w:pPr>
+        <w:rPr>
+          <w:rFonts w:ascii="Calibri" w:hAnsi="Calibri" w:cs="Calibri"/>
+          <w:color w:val="000000" w:themeColor="text1"/>
+        </w:rPr>
+      </w:pPr>
+      <w:r>
+        <w:rPr>
+          <w:rFonts w:ascii="Calibri" w:hAnsi="Calibri" w:cs="Calibri"/>
+          <w:color w:val="000000" w:themeColor="text1"/>
+        </w:rPr>
+        <w:t>T</w:t>
+      </w:r>
+      <w:r>
+        <w:rPr>
+          <w:rFonts w:ascii="Calibri" w:hAnsi="Calibri" w:cs="Calibri"/>
+          <w:color w:val="000000" w:themeColor="text1"/>
+        </w:rPr>
+        <w:t>he researcher selected the thumb as the primary biometric input. This decision was informed by both practical and technical considerations. The thumb typically provides a larger surface area compared to other fingers, resulting in a higher number of detectable minutiae points during capture</w:t>
+      </w:r>
+      <w:r>
+        <w:rPr>
+          <w:rFonts w:ascii="Calibri" w:hAnsi="Calibri" w:cs="Calibri"/>
+          <w:color w:val="000000" w:themeColor="text1"/>
+        </w:rPr>
+        <w:t xml:space="preserve"> [56]</w:t>
+      </w:r>
+      <w:r>
+        <w:rPr>
+          <w:rFonts w:ascii="Calibri" w:hAnsi="Calibri" w:cs="Calibri"/>
+          <w:color w:val="000000" w:themeColor="text1"/>
+        </w:rPr>
+        <w:t xml:space="preserve">. This improves matching accuracy and reduces the likelihood of failed authentication attempts. </w:t>
+      </w:r>
+    </w:p>
+    <w:p>
+      <w:pPr>
+        <w:rPr>
+          <w:rFonts w:ascii="Calibri" w:hAnsi="Calibri" w:cs="Calibri"/>
+          <w:color w:val="000000" w:themeColor="text1"/>
+        </w:rPr>
+      </w:pPr>
+    </w:p>
+    <w:p>
+      <w:pPr>
+        <w:rPr>
+          <w:rFonts w:ascii="Calibri" w:hAnsi="Calibri" w:cs="Calibri"/>
+          <w:color w:val="000000" w:themeColor="text1"/>
+        </w:rPr>
+      </w:pPr>
     </w:p>
     <w:p>
       <w:pPr>
@@ -7729,7 +8263,50 @@
           <w:rFonts w:ascii="Calibri" w:hAnsi="Calibri" w:cs="Calibri"/>
           <w:color w:val="000000" w:themeColor="text1"/>
         </w:rPr>
-        <w:t xml:space="preserve">on an optional basis. This gradual, voluntary adoption would expose a significant portion of the electorate to the technology over time, helping to cultivate the public trust that this project seeks to establish. Importantly, this phased </w:t>
+        <w:t>on an optional basis. This gradual, voluntary adoption would expose a significant portion of the electorate to the technology over time, helping to cultivate the public trust that this project seeks to establish. Importantly, this phased rollout would also generate substantial real</w:t>
+      </w:r>
+      <w:r>
+        <w:rPr>
+          <w:rFonts w:ascii="Calibri" w:hAnsi="Calibri" w:cs="Calibri"/>
+          <w:color w:val="000000" w:themeColor="text1"/>
+        </w:rPr>
+        <w:t xml:space="preserve"> </w:t>
+      </w:r>
+      <w:r>
+        <w:rPr>
+          <w:rFonts w:ascii="Calibri" w:hAnsi="Calibri" w:cs="Calibri"/>
+          <w:color w:val="000000" w:themeColor="text1"/>
+        </w:rPr>
+        <w:t>world usage data, revealing unforeseen usability challenges as well as areas in which the system performs particularly well. Once sufficiently tested and refined through this process, the system would be well</w:t>
+      </w:r>
+      <w:r>
+        <w:rPr>
+          <w:rFonts w:ascii="Calibri" w:hAnsi="Calibri" w:cs="Calibri"/>
+          <w:color w:val="000000" w:themeColor="text1"/>
+        </w:rPr>
+        <w:t xml:space="preserve"> </w:t>
+      </w:r>
+      <w:r>
+        <w:rPr>
+          <w:rFonts w:ascii="Calibri" w:hAnsi="Calibri" w:cs="Calibri"/>
+          <w:color w:val="000000" w:themeColor="text1"/>
+        </w:rPr>
+        <w:t>positioned to transition into the primary voting method across the UK.</w:t>
+      </w:r>
+    </w:p>
+    <w:p>
+      <w:pPr>
+        <w:rPr>
+          <w:rFonts w:ascii="Calibri" w:hAnsi="Calibri" w:cs="Calibri"/>
+          <w:color w:val="000000" w:themeColor="text1"/>
+        </w:rPr>
+      </w:pPr>
+      <w:r>
+        <w:rPr>
+          <w:rFonts w:ascii="Calibri" w:hAnsi="Calibri" w:cs="Calibri"/>
+          <w:color w:val="000000" w:themeColor="text1"/>
+        </w:rPr>
+        <w:t xml:space="preserve">In its current form however, the system has notable accessibility limitations. As it stands, the design is tailored specifically for use within a polling station, which presents a significant challenge given the </w:t>
       </w:r>
       <w:r>
         <w:rPr>
@@ -7737,21 +8314,322 @@
           <w:color w:val="000000" w:themeColor="text1"/>
         </w:rPr>
         <w:lastRenderedPageBreak/>
-        <w:t>rollout would also generate substantial real</w:t>
-      </w:r>
-      <w:r>
-        <w:rPr>
-          <w:rFonts w:ascii="Calibri" w:hAnsi="Calibri" w:cs="Calibri"/>
-          <w:color w:val="000000" w:themeColor="text1"/>
-        </w:rPr>
-        <w:t>-</w:t>
-      </w:r>
-      <w:r>
-        <w:rPr>
-          <w:rFonts w:ascii="Calibri" w:hAnsi="Calibri" w:cs="Calibri"/>
-          <w:color w:val="000000" w:themeColor="text1"/>
-        </w:rPr>
-        <w:t>world usage data, revealing unforeseen usability challenges as well as areas in which the system performs particularly well. Once sufficiently tested and refined through this process, the system would be well</w:t>
+        <w:t xml:space="preserve">proposal to replace the postal vote. Removing this option would disadvantage voters with limited mobility who depend on it and are unable to attend a polling station in person. Addressing this shortcoming will require further development. Potential solutions include the creation of a dedicated application that would allow an authorised official to oversee and facilitate voting outside of a polling station, or alternatively, the migration of the system to an online platform </w:t>
+      </w:r>
+      <w:r>
+        <w:rPr>
+          <w:rFonts w:ascii="Calibri" w:hAnsi="Calibri" w:cs="Calibri"/>
+          <w:color w:val="000000" w:themeColor="text1"/>
+        </w:rPr>
+        <w:t>using</w:t>
+      </w:r>
+      <w:r>
+        <w:rPr>
+          <w:rFonts w:ascii="Calibri" w:hAnsi="Calibri" w:cs="Calibri"/>
+          <w:color w:val="000000" w:themeColor="text1"/>
+        </w:rPr>
+        <w:t xml:space="preserve"> biometric authentication through approved scanners integrated into a voter's personal device.</w:t>
+      </w:r>
+      <w:r>
+        <w:rPr>
+          <w:rFonts w:ascii="Calibri" w:hAnsi="Calibri" w:cs="Calibri"/>
+          <w:color w:val="000000" w:themeColor="text1"/>
+        </w:rPr>
+        <w:t xml:space="preserve"> Another potential method would be to </w:t>
+      </w:r>
+      <w:r>
+        <w:rPr>
+          <w:rFonts w:ascii="Calibri" w:hAnsi="Calibri" w:cs="Calibri"/>
+          <w:color w:val="000000" w:themeColor="text1"/>
+        </w:rPr>
+        <w:t>assess eligibility for postal voting</w:t>
+      </w:r>
+      <w:r>
+        <w:rPr>
+          <w:rFonts w:ascii="Calibri" w:hAnsi="Calibri" w:cs="Calibri"/>
+          <w:color w:val="000000" w:themeColor="text1"/>
+        </w:rPr>
+        <w:t xml:space="preserve">, make it only necessary for people unable to make it to a polling station. </w:t>
+      </w:r>
+    </w:p>
+    <w:p>
+      <w:pPr>
+        <w:rPr>
+          <w:rFonts w:ascii="Calibri" w:hAnsi="Calibri" w:cs="Calibri"/>
+          <w:color w:val="000000" w:themeColor="text1"/>
+        </w:rPr>
+      </w:pPr>
+      <w:r>
+        <w:rPr>
+          <w:rFonts w:ascii="Calibri" w:hAnsi="Calibri" w:cs="Calibri"/>
+          <w:color w:val="000000" w:themeColor="text1"/>
+        </w:rPr>
+        <w:t xml:space="preserve">5.0 </w:t>
+      </w:r>
+      <w:r>
+        <w:rPr>
+          <w:rFonts w:ascii="Calibri" w:hAnsi="Calibri" w:cs="Calibri"/>
+          <w:color w:val="000000" w:themeColor="text1"/>
+        </w:rPr>
+        <w:t xml:space="preserve">Legal, social, ethical and professional issues </w:t>
+      </w:r>
+    </w:p>
+    <w:p>
+      <w:pPr>
+        <w:rPr>
+          <w:rFonts w:ascii="Calibri" w:hAnsi="Calibri" w:cs="Calibri"/>
+          <w:color w:val="000000" w:themeColor="text1"/>
+        </w:rPr>
+      </w:pPr>
+      <w:r>
+        <w:rPr>
+          <w:rFonts w:ascii="Calibri" w:hAnsi="Calibri" w:cs="Calibri"/>
+          <w:b/>
+          <w:bCs/>
+          <w:color w:val="000000" w:themeColor="text1"/>
+        </w:rPr>
+        <w:t xml:space="preserve">5.1 </w:t>
+      </w:r>
+      <w:r>
+        <w:rPr>
+          <w:rFonts w:ascii="Calibri" w:hAnsi="Calibri" w:cs="Calibri"/>
+          <w:b/>
+          <w:bCs/>
+          <w:color w:val="000000" w:themeColor="text1"/>
+        </w:rPr>
+        <w:t>Legal</w:t>
+      </w:r>
+    </w:p>
+    <w:p>
+      <w:pPr>
+        <w:rPr>
+          <w:rFonts w:ascii="Calibri" w:hAnsi="Calibri" w:cs="Calibri"/>
+          <w:color w:val="000000" w:themeColor="text1"/>
+        </w:rPr>
+      </w:pPr>
+      <w:r>
+        <w:rPr>
+          <w:rFonts w:ascii="Calibri" w:hAnsi="Calibri" w:cs="Calibri"/>
+          <w:color w:val="000000" w:themeColor="text1"/>
+        </w:rPr>
+        <w:t xml:space="preserve">The most significant legal framework </w:t>
+      </w:r>
+      <w:r>
+        <w:rPr>
+          <w:rFonts w:ascii="Calibri" w:hAnsi="Calibri" w:cs="Calibri"/>
+          <w:color w:val="000000" w:themeColor="text1"/>
+        </w:rPr>
+        <w:t>this system has to follow is</w:t>
+      </w:r>
+      <w:r>
+        <w:rPr>
+          <w:rFonts w:ascii="Calibri" w:hAnsi="Calibri" w:cs="Calibri"/>
+          <w:color w:val="000000" w:themeColor="text1"/>
+        </w:rPr>
+        <w:t xml:space="preserve"> the UK General Data Protection Regulation (UK GDPR) and the Data Protection Act 2018. </w:t>
+      </w:r>
+      <w:r>
+        <w:rPr>
+          <w:rFonts w:ascii="Calibri" w:hAnsi="Calibri" w:cs="Calibri"/>
+          <w:color w:val="000000" w:themeColor="text1"/>
+        </w:rPr>
+        <w:t>Processing of b</w:t>
+      </w:r>
+      <w:r>
+        <w:rPr>
+          <w:rFonts w:ascii="Calibri" w:hAnsi="Calibri" w:cs="Calibri"/>
+          <w:color w:val="000000" w:themeColor="text1"/>
+        </w:rPr>
+        <w:t xml:space="preserve">iometric data </w:t>
+      </w:r>
+      <w:r>
+        <w:rPr>
+          <w:rFonts w:ascii="Calibri" w:hAnsi="Calibri" w:cs="Calibri"/>
+          <w:color w:val="000000" w:themeColor="text1"/>
+        </w:rPr>
+        <w:t xml:space="preserve">under these regulations used </w:t>
+      </w:r>
+      <w:r>
+        <w:rPr>
+          <w:rFonts w:ascii="Calibri" w:hAnsi="Calibri" w:cs="Calibri"/>
+          <w:color w:val="000000" w:themeColor="text1"/>
+        </w:rPr>
+        <w:t xml:space="preserve">for the purpose of uniquely identifying a person is classified as special category data, requiring the highest standard of legal protection and explicit justification for its processing. </w:t>
+      </w:r>
+    </w:p>
+    <w:p>
+      <w:pPr>
+        <w:rPr>
+          <w:rFonts w:ascii="Calibri" w:hAnsi="Calibri" w:cs="Calibri"/>
+          <w:color w:val="000000" w:themeColor="text1"/>
+        </w:rPr>
+      </w:pPr>
+      <w:r>
+        <w:rPr>
+          <w:rFonts w:ascii="Calibri" w:hAnsi="Calibri" w:cs="Calibri"/>
+          <w:color w:val="000000" w:themeColor="text1"/>
+        </w:rPr>
+        <w:t xml:space="preserve">To comply with </w:t>
+      </w:r>
+      <w:r>
+        <w:rPr>
+          <w:rFonts w:ascii="Calibri" w:hAnsi="Calibri" w:cs="Calibri"/>
+          <w:color w:val="000000" w:themeColor="text1"/>
+        </w:rPr>
+        <w:t>this standard of protection</w:t>
+      </w:r>
+      <w:r>
+        <w:rPr>
+          <w:rFonts w:ascii="Calibri" w:hAnsi="Calibri" w:cs="Calibri"/>
+          <w:color w:val="000000" w:themeColor="text1"/>
+        </w:rPr>
+        <w:t>, the researcher implemented a range of technical safeguards, including AES-256-GCM encryption of voter data at rest, envelope encryption during transmission, and strict data minimisation principles. The system stores only the information necessary for identity verification, reducing legal exposure associated with unnecessary data retention. Key management practices, including the use of AWS Secrets Manager</w:t>
+      </w:r>
+      <w:r>
+        <w:rPr>
+          <w:rFonts w:ascii="Calibri" w:hAnsi="Calibri" w:cs="Calibri"/>
+          <w:color w:val="000000" w:themeColor="text1"/>
+        </w:rPr>
+        <w:t xml:space="preserve"> and Key Management Service</w:t>
+      </w:r>
+      <w:r>
+        <w:rPr>
+          <w:rFonts w:ascii="Calibri" w:hAnsi="Calibri" w:cs="Calibri"/>
+          <w:color w:val="000000" w:themeColor="text1"/>
+        </w:rPr>
+        <w:t>, further ensure that encryption keys are handled in accordance with best practice guidance on securing special category data.</w:t>
+      </w:r>
+    </w:p>
+    <w:p>
+      <w:pPr>
+        <w:rPr>
+          <w:rFonts w:ascii="Calibri" w:hAnsi="Calibri" w:cs="Calibri"/>
+          <w:color w:val="000000" w:themeColor="text1"/>
+        </w:rPr>
+      </w:pPr>
+      <w:r>
+        <w:rPr>
+          <w:rFonts w:ascii="Calibri" w:hAnsi="Calibri" w:cs="Calibri"/>
+          <w:b/>
+          <w:bCs/>
+          <w:color w:val="000000" w:themeColor="text1"/>
+        </w:rPr>
+        <w:t xml:space="preserve">5.2 </w:t>
+      </w:r>
+      <w:r>
+        <w:rPr>
+          <w:rFonts w:ascii="Calibri" w:hAnsi="Calibri" w:cs="Calibri"/>
+          <w:b/>
+          <w:bCs/>
+          <w:color w:val="000000" w:themeColor="text1"/>
+        </w:rPr>
+        <w:t>Social</w:t>
+      </w:r>
+    </w:p>
+    <w:p>
+      <w:pPr>
+        <w:rPr>
+          <w:rFonts w:ascii="Calibri" w:hAnsi="Calibri" w:cs="Calibri"/>
+          <w:color w:val="000000" w:themeColor="text1"/>
+        </w:rPr>
+      </w:pPr>
+      <w:r>
+        <w:rPr>
+          <w:rFonts w:ascii="Calibri" w:hAnsi="Calibri" w:cs="Calibri"/>
+          <w:color w:val="000000" w:themeColor="text1"/>
+        </w:rPr>
+        <w:t xml:space="preserve">The introduction of biometric authentication has the potential to </w:t>
+      </w:r>
+      <w:r>
+        <w:rPr>
+          <w:rFonts w:ascii="Calibri" w:hAnsi="Calibri" w:cs="Calibri"/>
+          <w:color w:val="000000" w:themeColor="text1"/>
+        </w:rPr>
+        <w:t>discriminate</w:t>
+      </w:r>
+      <w:r>
+        <w:rPr>
+          <w:rFonts w:ascii="Calibri" w:hAnsi="Calibri" w:cs="Calibri"/>
+          <w:color w:val="000000" w:themeColor="text1"/>
+        </w:rPr>
+        <w:t xml:space="preserve"> certain groups within the electorate, particularly elderly voters or those in manual occupations, where fingerprint quality degrades naturally over time. </w:t>
+      </w:r>
+      <w:r>
+        <w:rPr>
+          <w:rFonts w:ascii="Calibri" w:hAnsi="Calibri" w:cs="Calibri"/>
+          <w:color w:val="000000" w:themeColor="text1"/>
+        </w:rPr>
+        <w:t>This limitation could be solved with a</w:t>
+      </w:r>
+      <w:r>
+        <w:rPr>
+          <w:rFonts w:ascii="Calibri" w:hAnsi="Calibri" w:cs="Calibri"/>
+          <w:color w:val="000000" w:themeColor="text1"/>
+        </w:rPr>
+        <w:t xml:space="preserve"> phased, voluntary rollout of the system alongside the existing paper-based method, thereby ensuring no voter is immediately excluded from participation. The potential removal of the postal vote also presents a social concern for voters with limited mobility, a challenge identified as requiring further development before the system could be considered a complete replacement.</w:t>
+      </w:r>
+    </w:p>
+    <w:p>
+      <w:pPr>
+        <w:rPr>
+          <w:rFonts w:ascii="Calibri" w:hAnsi="Calibri" w:cs="Calibri"/>
+          <w:color w:val="000000" w:themeColor="text1"/>
+        </w:rPr>
+      </w:pPr>
+      <w:r>
+        <w:rPr>
+          <w:rFonts w:ascii="Calibri" w:hAnsi="Calibri" w:cs="Calibri"/>
+          <w:b/>
+          <w:bCs/>
+          <w:color w:val="000000" w:themeColor="text1"/>
+        </w:rPr>
+        <w:t xml:space="preserve">5.3 </w:t>
+      </w:r>
+      <w:r>
+        <w:rPr>
+          <w:rFonts w:ascii="Calibri" w:hAnsi="Calibri" w:cs="Calibri"/>
+          <w:b/>
+          <w:bCs/>
+          <w:color w:val="000000" w:themeColor="text1"/>
+        </w:rPr>
+        <w:t>Ethical</w:t>
+      </w:r>
+    </w:p>
+    <w:p>
+      <w:pPr>
+        <w:rPr>
+          <w:rFonts w:ascii="Calibri" w:hAnsi="Calibri" w:cs="Calibri"/>
+          <w:color w:val="000000" w:themeColor="text1"/>
+        </w:rPr>
+      </w:pPr>
+      <w:r>
+        <w:rPr>
+          <w:rFonts w:ascii="Calibri" w:hAnsi="Calibri" w:cs="Calibri"/>
+          <w:color w:val="000000" w:themeColor="text1"/>
+        </w:rPr>
+        <w:t>Biometric traits are permanent and cannot be altered in the event of a data breach, meaning any compromise carries irreversible consequences for individuals. The researcher addressed this through decentralised storage design, per-voter encryption, and ensuring biometric templates are only decrypted temporarily within server memory during comparison. The risk of function creep, whereby biometric data collected for voting could be repurposed for surveillance or law enforcement, was also considered. The system's architecture deliberately limits the scope of data use, and the</w:t>
+      </w:r>
+      <w:r>
+        <w:rPr>
+          <w:rFonts w:ascii="Calibri" w:hAnsi="Calibri" w:cs="Calibri"/>
+          <w:color w:val="000000" w:themeColor="text1"/>
+        </w:rPr>
+        <w:t xml:space="preserve"> conclusion made</w:t>
+      </w:r>
+      <w:r>
+        <w:rPr>
+          <w:rFonts w:ascii="Calibri" w:hAnsi="Calibri" w:cs="Calibri"/>
+          <w:color w:val="000000" w:themeColor="text1"/>
+        </w:rPr>
+        <w:t xml:space="preserve"> highlighted the need for strong legal safeguards to accompany any </w:t>
+      </w:r>
+      <w:proofErr w:type="gramStart"/>
+      <w:r>
+        <w:rPr>
+          <w:rFonts w:ascii="Calibri" w:hAnsi="Calibri" w:cs="Calibri"/>
+          <w:color w:val="000000" w:themeColor="text1"/>
+        </w:rPr>
+        <w:t>real</w:t>
       </w:r>
       <w:r>
         <w:rPr>
@@ -7765,57 +8643,78 @@
           <w:rFonts w:ascii="Calibri" w:hAnsi="Calibri" w:cs="Calibri"/>
           <w:color w:val="000000" w:themeColor="text1"/>
         </w:rPr>
-        <w:t>positioned to transition into the primary voting method across the UK.</w:t>
-      </w:r>
-    </w:p>
-    <w:p>
-      <w:pPr>
-        <w:rPr>
-          <w:rFonts w:ascii="Calibri" w:hAnsi="Calibri" w:cs="Calibri"/>
-          <w:color w:val="000000" w:themeColor="text1"/>
-        </w:rPr>
-      </w:pPr>
-      <w:r>
-        <w:rPr>
-          <w:rFonts w:ascii="Calibri" w:hAnsi="Calibri" w:cs="Calibri"/>
-          <w:color w:val="000000" w:themeColor="text1"/>
-        </w:rPr>
-        <w:t xml:space="preserve">In its current form however, the system has notable accessibility limitations. As it stands, the design is tailored specifically for use within a polling station, which presents a significant challenge given the proposal to replace the postal vote. Removing this option would disadvantage voters with limited mobility who depend on it and are unable to attend a polling station in person. Addressing this shortcoming will require further development. Potential solutions include the creation of a dedicated application that would allow an authorised official to oversee and facilitate voting outside of a polling station, or alternatively, the migration of the system to an online platform </w:t>
-      </w:r>
-      <w:r>
-        <w:rPr>
-          <w:rFonts w:ascii="Calibri" w:hAnsi="Calibri" w:cs="Calibri"/>
-          <w:color w:val="000000" w:themeColor="text1"/>
-        </w:rPr>
-        <w:t>using</w:t>
-      </w:r>
-      <w:r>
-        <w:rPr>
-          <w:rFonts w:ascii="Calibri" w:hAnsi="Calibri" w:cs="Calibri"/>
-          <w:color w:val="000000" w:themeColor="text1"/>
-        </w:rPr>
-        <w:t xml:space="preserve"> biometric authentication through approved scanners integrated into a voter's personal device.</w:t>
-      </w:r>
-      <w:r>
-        <w:rPr>
-          <w:rFonts w:ascii="Calibri" w:hAnsi="Calibri" w:cs="Calibri"/>
-          <w:color w:val="000000" w:themeColor="text1"/>
-        </w:rPr>
-        <w:t xml:space="preserve"> Another potential method would be to </w:t>
-      </w:r>
-      <w:r>
-        <w:rPr>
-          <w:rFonts w:ascii="Calibri" w:hAnsi="Calibri" w:cs="Calibri"/>
-          <w:color w:val="000000" w:themeColor="text1"/>
-        </w:rPr>
-        <w:t>assess eligibility for postal voting</w:t>
-      </w:r>
-      <w:r>
-        <w:rPr>
-          <w:rFonts w:ascii="Calibri" w:hAnsi="Calibri" w:cs="Calibri"/>
-          <w:color w:val="000000" w:themeColor="text1"/>
-        </w:rPr>
-        <w:t xml:space="preserve">, make it only necessary for people unable to make it to a polling station. </w:t>
+        <w:t>world</w:t>
+      </w:r>
+      <w:proofErr w:type="gramEnd"/>
+      <w:r>
+        <w:rPr>
+          <w:rFonts w:ascii="Calibri" w:hAnsi="Calibri" w:cs="Calibri"/>
+          <w:color w:val="000000" w:themeColor="text1"/>
+        </w:rPr>
+        <w:t xml:space="preserve"> deployment.</w:t>
+      </w:r>
+    </w:p>
+    <w:p>
+      <w:pPr>
+        <w:rPr>
+          <w:rFonts w:ascii="Calibri" w:hAnsi="Calibri" w:cs="Calibri"/>
+          <w:color w:val="000000" w:themeColor="text1"/>
+        </w:rPr>
+      </w:pPr>
+      <w:r>
+        <w:rPr>
+          <w:rFonts w:ascii="Calibri" w:hAnsi="Calibri" w:cs="Calibri"/>
+          <w:b/>
+          <w:bCs/>
+          <w:color w:val="000000" w:themeColor="text1"/>
+        </w:rPr>
+        <w:t xml:space="preserve">5.4 </w:t>
+      </w:r>
+      <w:r>
+        <w:rPr>
+          <w:rFonts w:ascii="Calibri" w:hAnsi="Calibri" w:cs="Calibri"/>
+          <w:b/>
+          <w:bCs/>
+          <w:color w:val="000000" w:themeColor="text1"/>
+        </w:rPr>
+        <w:t>Professional</w:t>
+      </w:r>
+    </w:p>
+    <w:p>
+      <w:pPr>
+        <w:rPr>
+          <w:rFonts w:ascii="Calibri" w:hAnsi="Calibri" w:cs="Calibri"/>
+          <w:color w:val="000000" w:themeColor="text1"/>
+        </w:rPr>
+      </w:pPr>
+      <w:r>
+        <w:rPr>
+          <w:rFonts w:ascii="Calibri" w:hAnsi="Calibri" w:cs="Calibri"/>
+          <w:color w:val="000000" w:themeColor="text1"/>
+        </w:rPr>
+        <w:t xml:space="preserve">Throughout the project, the researcher conducted development in alignment with professional standards expected of a computing </w:t>
+      </w:r>
+      <w:r>
+        <w:rPr>
+          <w:rFonts w:ascii="Calibri" w:hAnsi="Calibri" w:cs="Calibri"/>
+          <w:color w:val="000000" w:themeColor="text1"/>
+        </w:rPr>
+        <w:t>scientist</w:t>
+      </w:r>
+      <w:r>
+        <w:rPr>
+          <w:rFonts w:ascii="Calibri" w:hAnsi="Calibri" w:cs="Calibri"/>
+          <w:color w:val="000000" w:themeColor="text1"/>
+        </w:rPr>
+        <w:t xml:space="preserve">. This included grounding design decisions in academic literature, acknowledging the limitations of the system honestly, and following established security </w:t>
+      </w:r>
+      <w:r>
+        <w:rPr>
+          <w:rFonts w:ascii="Calibri" w:hAnsi="Calibri" w:cs="Calibri"/>
+          <w:color w:val="000000" w:themeColor="text1"/>
+        </w:rPr>
+        <w:lastRenderedPageBreak/>
+        <w:t>practices rather than implementing novel, untested solutions. The researcher also engaged in structured supervisor meetings and maintained a documented development process, reflecting a professional approach to project management and accountability.</w:t>
       </w:r>
     </w:p>
     <w:p>
@@ -7901,6 +8800,113 @@
           <w:szCs w:val="20"/>
         </w:rPr>
       </w:pPr>
+      <w:r>
+        <w:rPr>
+          <w:sz w:val="20"/>
+          <w:szCs w:val="20"/>
+        </w:rPr>
+        <w:t xml:space="preserve">Appendix </w:t>
+      </w:r>
+    </w:p>
+    <w:p>
+      <w:pPr>
+        <w:rPr>
+          <w:sz w:val="20"/>
+          <w:szCs w:val="20"/>
+        </w:rPr>
+      </w:pPr>
+      <w:r>
+        <w:rPr>
+          <w:sz w:val="20"/>
+          <w:szCs w:val="20"/>
+        </w:rPr>
+        <w:t xml:space="preserve">Appendix A - </w:t>
+      </w:r>
+      <w:r>
+        <w:rPr>
+          <w:sz w:val="20"/>
+          <w:szCs w:val="20"/>
+        </w:rPr>
+        <w:t xml:space="preserve">High </w:t>
+      </w:r>
+      <w:proofErr w:type="spellStart"/>
+      <w:r>
+        <w:rPr>
+          <w:sz w:val="20"/>
+          <w:szCs w:val="20"/>
+        </w:rPr>
+        <w:t>Fedelity</w:t>
+      </w:r>
+      <w:proofErr w:type="spellEnd"/>
+      <w:r>
+        <w:rPr>
+          <w:sz w:val="20"/>
+          <w:szCs w:val="20"/>
+        </w:rPr>
+        <w:t xml:space="preserve"> </w:t>
+      </w:r>
+      <w:proofErr w:type="spellStart"/>
+      <w:r>
+        <w:rPr>
+          <w:sz w:val="20"/>
+          <w:szCs w:val="20"/>
+        </w:rPr>
+        <w:t>Mockups</w:t>
+      </w:r>
+      <w:proofErr w:type="spellEnd"/>
+    </w:p>
+    <w:p>
+      <w:pPr>
+        <w:rPr>
+          <w:sz w:val="20"/>
+          <w:szCs w:val="20"/>
+        </w:rPr>
+      </w:pPr>
+      <w:r>
+        <w:rPr>
+          <w:sz w:val="20"/>
+          <w:szCs w:val="20"/>
+        </w:rPr>
+        <w:t xml:space="preserve">Appendix B - </w:t>
+      </w:r>
+      <w:proofErr w:type="spellStart"/>
+      <w:r>
+        <w:rPr>
+          <w:sz w:val="20"/>
+          <w:szCs w:val="20"/>
+        </w:rPr>
+        <w:t>MoSCoW</w:t>
+      </w:r>
+      <w:proofErr w:type="spellEnd"/>
+      <w:r>
+        <w:rPr>
+          <w:sz w:val="20"/>
+          <w:szCs w:val="20"/>
+        </w:rPr>
+        <w:t xml:space="preserve"> Requirements</w:t>
+      </w:r>
+    </w:p>
+    <w:p>
+      <w:pPr>
+        <w:rPr>
+          <w:sz w:val="20"/>
+          <w:szCs w:val="20"/>
+        </w:rPr>
+      </w:pPr>
+      <w:r>
+        <w:rPr>
+          <w:sz w:val="20"/>
+          <w:szCs w:val="20"/>
+        </w:rPr>
+        <w:t xml:space="preserve">Appendix C - </w:t>
+      </w:r>
+      <w:r>
+        <w:rPr>
+          <w:sz w:val="20"/>
+          <w:szCs w:val="20"/>
+        </w:rPr>
+        <w:t>User Stories</w:t>
+      </w:r>
     </w:p>
     <w:sectPr>
       <w:pgSz w:w="11906" w:h="16838"/>

</xml_diff>